<commit_message>
feat(ml): add training script with modality dropout and skin-tone evaluation
Add train.py, which trains the late-fusion EfficientNet-B0 + questionnaire model
for one split seed (or a photo-only baseline with --image-only). The questionnaire
input is features plus the per-field mask; during training, whole questionnaires
and single fields are hidden at random, with zero features and mask 1, so missing
answers are never imputed. Loss is class-weighted cross-entropy; the best
validation checkpoint is evaluated once on test, overall and per eFST group, at
0/25/50/75/100% of fields hidden.

Add training defaults to configs/base.yaml and pytest checks for the answer-hiding
logic. Document the model, training and evaluation protocol in thesis sections 5.8
and 5.10 and paper sections 3.8 and 3.9, with new references, plus a journal entry.
</commit_message>
<xml_diff>
--- a/docs/Paper_Skin_Concern.docx
+++ b/docs/Paper_Skin_Concern.docx
@@ -2218,10 +2218,15 @@
         <w:jc w:val="both"/>
       </w:pPr>
       <w:r>
-        <w:rPr>
-          <w:highlight w:val="yellow"/>
-        </w:rPr>
-        <w:t>[To be written: image backbone, questionnaire branch and late fusion, modality dropout, training procedure.]</w:t>
+        <w:t>The model combines two branches by late fusion: the branches are processed separately and their information is joined only before the final decision. The image branch is EfficientNet-B0 [6] from the timm library [7] with weights pretrained on ImageNet (transfer learning: the network starts from what it already learned on a large image set and is retrained on SCIN). The questionnaire branch is a small network with one layer of 64 units that receives the 40-feature vector together with the 6-value mask (46 numbers). The outputs of both branches are concatenated and passed to a final layer that scores each of the four categories. A photo-only model, without the questionnaire branch, is trained as a baseline.</w:t>
+      </w:r>
+    </w:p>
+    <w:p>
+      <w:pPr>
+        <w:jc w:val="both"/>
+      </w:pPr>
+      <w:r>
+        <w:t>For robustness to missing answers we use modality dropout: during training, the whole questionnaire is hidden for a sample with probability 0.3, and each field is hidden independently with probability 0.15. A hidden field gets features 0 and mask 1, exactly like a real missing answer, so the model learns to work without the questionnaire. Because the categories are imbalanced (e.g. 44 redness_rosacea cases versus 1,068 eczema_dermatitis), the loss (the error measure that training minimises) is cross-entropy weighted inversely to class frequency. The optimiser is AdamW [8] with learning rate 3e-4 and cosine decay [9], for 15 epochs, with mixed precision on GPU. The checkpoint with the best validation macro-F1 is kept.</w:t>
       </w:r>
     </w:p>
     <w:p>
@@ -2237,10 +2242,7 @@
         <w:jc w:val="both"/>
       </w:pPr>
       <w:r>
-        <w:rPr>
-          <w:highlight w:val="yellow"/>
-        </w:rPr>
-        <w:t>[To be written: metrics, skin-tone-stratified reporting, missing-answer experiments, statistical testing.]</w:t>
+        <w:t>Evaluation is done once on the test split with the weights chosen on validation. Metrics are macro-F1 (the mean of the per-class F1 scores, which treats small and large classes equally) and balanced accuracy (the mean per-class recall), reported overall and separately for each eFST group (I-II, III-IV, V-VI, missing), together with the maximum gap between groups. For the missing-answer question, the model is tested with 0%, 25%, 50%, 75% and 100% of the questionnaire fields hidden and compared with the photo-only model. Each configuration is run for the five seeds (0-4) and results are reported as mean and range. The script is ml/train.py.</w:t>
       </w:r>
     </w:p>
     <w:p>
@@ -2356,6 +2358,46 @@
       </w:pPr>
       <w:r>
         <w:t>[5] Google Research, Monk Skin Tone Scale. https://skintone.google/</w:t>
+      </w:r>
+    </w:p>
+    <w:p>
+      <w:pPr>
+        <w:spacing w:after="120" w:line="276" w:lineRule="auto"/>
+        <w:ind w:left="567" w:hanging="567"/>
+        <w:jc w:val="left"/>
+      </w:pPr>
+      <w:r>
+        <w:t>[6] M. Tan, Q. V. Le, EfficientNet: Rethinking Model Scaling for Convolutional Neural Networks, ICML 2019. https://arxiv.org/abs/1905.11946</w:t>
+      </w:r>
+    </w:p>
+    <w:p>
+      <w:pPr>
+        <w:spacing w:after="120" w:line="276" w:lineRule="auto"/>
+        <w:ind w:left="567" w:hanging="567"/>
+        <w:jc w:val="left"/>
+      </w:pPr>
+      <w:r>
+        <w:t>[7] R. Wightman, PyTorch Image Models (timm), GitHub repository. https://github.com/huggingface/pytorch-image-models</w:t>
+      </w:r>
+    </w:p>
+    <w:p>
+      <w:pPr>
+        <w:spacing w:after="120" w:line="276" w:lineRule="auto"/>
+        <w:ind w:left="567" w:hanging="567"/>
+        <w:jc w:val="left"/>
+      </w:pPr>
+      <w:r>
+        <w:t>[8] I. Loshchilov, F. Hutter, Decoupled Weight Decay Regularization, ICLR 2019. https://arxiv.org/abs/1711.05101</w:t>
+      </w:r>
+    </w:p>
+    <w:p>
+      <w:pPr>
+        <w:spacing w:after="120" w:line="276" w:lineRule="auto"/>
+        <w:ind w:left="567" w:hanging="567"/>
+        <w:jc w:val="left"/>
+      </w:pPr>
+      <w:r>
+        <w:t>[9] I. Loshchilov, F. Hutter, SGDR: Stochastic Gradient Descent with Warm Restarts, ICLR 2017. https://arxiv.org/abs/1608.03983</w:t>
       </w:r>
     </w:p>
     <w:sectPr>

</xml_diff>

<commit_message>
feat(ml): add reusable training/eval engine with focal loss and early stopping
Add engine.py with train_one_epoch, evaluate and EarlyStopping. It uses AMP
(autocast + GradScaler) and stays model-agnostic: an adapt() function maps each
batch dict to the model's keyword arguments, so the same code trains image-only
and late-fusion models. Add losses.py with class-weighted cross-entropy and focal
loss, and refactor train.py to use the engine, select the model and loss, stop
early on validation macro-F1, and write runs/<exp_name>/best_model.pt and log.csv.

Add training options to configs/base.yaml and pytest checks for the engine,
early stopping and losses. Document the engine in thesis section 5.8 and paper
section 3.8 (new reference: focal loss), with a journal entry.
</commit_message>
<xml_diff>
--- a/docs/Paper_Skin_Concern.docx
+++ b/docs/Paper_Skin_Concern.docx
@@ -2231,6 +2231,14 @@
     </w:p>
     <w:p>
       <w:pPr>
+        <w:jc w:val="both"/>
+      </w:pPr>
+      <w:r>
+        <w:t>Training is run by a reusable engine (ml/engine.py) that does not depend on the model architecture: the same training and evaluation functions serve both the photo-only and the fusion model. The loss can be class-weighted cross-entropy or focal loss [10], which down-weights easy, confident examples so training concentrates on hard and rare ones; the two are compared as an ablation. Training uses automatic mixed precision (AMP), i.e. reduced-precision arithmetic on the GPU for speed. Early stopping and checkpointing use validation macro-F1, not plain accuracy, which would be misleading with imbalanced classes; training stops early if macro-F1 does not improve for 5 consecutive epochs. For every epoch the training loss, validation loss, macro-F1 and epoch time are logged (log.csv).</w:t>
+      </w:r>
+    </w:p>
+    <w:p>
+      <w:pPr>
         <w:pStyle w:val="Heading2"/>
       </w:pPr>
       <w:r>
@@ -2398,6 +2406,16 @@
       </w:pPr>
       <w:r>
         <w:t>[9] I. Loshchilov, F. Hutter, SGDR: Stochastic Gradient Descent with Warm Restarts, ICLR 2017. https://arxiv.org/abs/1608.03983</w:t>
+      </w:r>
+    </w:p>
+    <w:p>
+      <w:pPr>
+        <w:spacing w:after="120" w:line="276" w:lineRule="auto"/>
+        <w:ind w:left="567" w:hanging="567"/>
+        <w:jc w:val="left"/>
+      </w:pPr>
+      <w:r>
+        <w:t>[10] T.-Y. Lin, P. Goyal, R. Girshick, K. He, P. Dollár, Focal Loss for Dense Object Detection, ICCV 2017. https://arxiv.org/abs/1708.02002</w:t>
       </w:r>
     </w:p>
     <w:sectPr>

</xml_diff>

<commit_message>
feat(ml): add training engine, staged image baseline and evaluation harness (Tasks 2.1-2.3)
Training script with modality dropout, reusable engine with focal loss and early stopping,
duplicate-photo leakage fix, staged EfficientNet-B0 / MobileNetV3 baseline, metrics with
calibration, risk-coverage and worst-group fairness.
</commit_message>
<xml_diff>
--- a/docs/Paper_Skin_Concern.docx
+++ b/docs/Paper_Skin_Concern.docx
@@ -2020,7 +2020,25 @@
         <w:jc w:val="both"/>
       </w:pPr>
       <w:r>
-        <w:t>Each seed yields 3,523 train, 755 validation and 755 test cases. In eFST V–VI the cases split 305, 66 and 65. The redness_rosacea category has 44 cases in total (31, 7 and 6 for seed 0) and only one case in V–VI, in the training split, so its per-tone performance cannot be evaluated. An automated test (</w:t>
+        <w:t>Beyond case identity, we checked whether the same photograph appears in more than one case: we computed the MD5 hash, a code that is identical only for identical files, of all 4,089 downloaded images, including all 3,886 images of the cases used (</w:t>
+      </w:r>
+      <w:r>
+        <w:rPr>
+          <w:rFonts w:ascii="Courier New" w:hAnsi="Courier New" w:eastAsia="Courier New" w:cs="Courier New"/>
+          <w:sz w:val="19"/>
+        </w:rPr>
+        <w:t>ml/scripts/find_duplicate_images.py</w:t>
+      </w:r>
+      <w:r>
+        <w:t>). This found 5 groups of 2-3 cases (12 cases in total) sharing the same photographs, most likely the same contributor submitting a case twice. In the first version of the split, four such photographs fell into different splits for seed 0, so a test image could have been seen in training. The cases of a group are therefore treated as one unit when splitting. In one group the same photographs received different categories (redness_rosacea, eczema_dermatitis and excluded), a concrete example of label noise, i.e. inconsistent labels for the same image.</w:t>
+      </w:r>
+    </w:p>
+    <w:p>
+      <w:pPr>
+        <w:jc w:val="both"/>
+      </w:pPr>
+      <w:r>
+        <w:t>Depending on the seed, the splits hold 3,522-3,525 train, 754-757 validation and 754-756 test cases. In eFST V–VI the cases split 303, 68 and 65 (seed 0). The redness_rosacea category has 44 cases in total (30, 8 and 6 for seed 0) and only one case in V–VI, in the validation split, so its per-tone performance cannot be evaluated. An automated test (</w:t>
       </w:r>
       <w:r>
         <w:rPr>
@@ -2040,7 +2058,7 @@
         <w:t>case_id</w:t>
       </w:r>
       <w:r>
-        <w:t xml:space="preserve"> appears in two splits, that there are no duplicates and that the splits cover every case.</w:t>
+        <w:t xml:space="preserve"> appears in two splits, that there are no duplicates, that the splits cover every case and that no identical photograph is in two splits.</w:t>
       </w:r>
     </w:p>
     <w:p>
@@ -2136,7 +2154,7 @@
         <w:t>excluded</w:t>
       </w:r>
       <w:r>
-        <w:t xml:space="preserve"> group (ambiguous, below-threshold or unlabelled cases) is not a target category of the assistant and is left out. This leaves 1,809 cases, split for seed 0 into 1,266 train, 272 validation and 271 test cases.</w:t>
+        <w:t xml:space="preserve"> group (ambiguous, below-threshold or unlabelled cases) is not a target category of the assistant and is left out. This leaves 1,809 cases, split for seed 0 into 1,266 train, 273 validation and 270 test cases.</w:t>
       </w:r>
     </w:p>
     <w:p>
@@ -2172,7 +2190,7 @@
         <w:jc w:val="both"/>
       </w:pPr>
       <w:r>
-        <w:t xml:space="preserve">Augmentation means randomly modifying training images so the model does not memorise examples and copes with photographs taken under different conditions. It is applied to the training split only: horizontal flip (probability 0.5), shift, scale and rotation (shift up to 6%, scale 0.9 to 1.1, rotation up to 15°) and colour jitter (brightness, contrast and saturation ±0.2, hue ±0.02). Hue jitter is deliberately tiny because skin colour is the variable fairness is measured on and must not be distorted. All splits are resized to 224×224 pixels and normalised with the ImageNet mean (0.485, 0.456, 0.406) and standard deviation (0.229, 0.224, 0.225), the statistics the pretrained networks were trained with; validation and test receive no augmentation beyond these two steps. Parameters are kept in </w:t>
+        <w:t xml:space="preserve">Augmentation means randomly modifying training images so the model does not memorise examples and copes with photographs taken under different conditions. It is applied to the training split only: horizontal flip (probability 0.5), shift, scale and rotation (shift up to 6%, scale 0.9 to 1.1, rotation up to 15°) and colour jitter (brightness, contrast and saturation ±0.2, hue ±0.02). Hue jitter is deliberately tiny because skin colour is the variable fairness is measured on and must not be distorted. All splits are brought to 224×224 pixels while keeping the aspect ratio: the longer side is scaled to 224 pixels and the remaining space is padded with black (letterbox). Most SCIN photographs are portrait 3:4, and stretching them to a square would distort lesions. Images are then normalised with the ImageNet mean (0.485, 0.456, 0.406) and standard deviation (0.229, 0.224, 0.225), the statistics the pretrained networks were trained with; validation and test receive no augmentation beyond these steps. Parameters are kept in </w:t>
       </w:r>
       <w:r>
         <w:rPr>
@@ -2218,10 +2236,49 @@
         <w:jc w:val="both"/>
       </w:pPr>
       <w:r>
+        <w:t>The model combines two branches by late fusion: the branches are processed separately and their information is joined only before the final decision. The image branch is EfficientNet-B0 [6] from the timm library [7] with weights pretrained on ImageNet (transfer learning: the network starts from what it already learned on a large image set and is retrained on SCIN). The questionnaire branch is a small network with one layer of 64 units that receives the 40-feature vector together with the 6-value mask (46 numbers). When the questionnaire is missing entirely, the model receives zero features and an all-ones mask, the same representation as in training, so an absent questionnaire is not confused with one answered with zeros. The outputs of both branches are concatenated and passed to a final layer that scores each of the four categories. A photo-only model, without the questionnaire branch, is trained as a baseline.</w:t>
+      </w:r>
+    </w:p>
+    <w:p>
+      <w:pPr>
+        <w:jc w:val="both"/>
+      </w:pPr>
+      <w:r>
+        <w:t>For robustness to missing answers we use modality dropout: during training, the whole questionnaire is hidden for a sample with probability 0.3, and each field is hidden independently with probability 0.15. A hidden field gets features 0 and mask 1, exactly like a real missing answer, so the model learns to work without the questionnaire. Because the categories are imbalanced (e.g. 44 redness_rosacea cases versus 1,068 eczema_dermatitis), the loss (the error measure that training minimises) is cross-entropy weighted inversely to class frequency. The optimiser is AdamW [8] with learning rate 3e-4 and cosine decay [9], for 15 epochs, with mixed precision on GPU. The checkpoint with the best validation macro-F1 is kept.</w:t>
+      </w:r>
+    </w:p>
+    <w:p>
+      <w:pPr>
+        <w:jc w:val="both"/>
+      </w:pPr>
+      <w:r>
+        <w:t>Training is run by a reusable engine (ml/engine.py) that does not depend on the model architecture: the same training and evaluation functions serve both the photo-only and the fusion model. The loss can be class-weighted cross-entropy or focal loss [10], which down-weights easy, confident examples so training concentrates on hard and rare ones; the two are compared as an ablation. Training uses automatic mixed precision (AMP), i.e. reduced-precision arithmetic on the GPU for speed. Early stopping and checkpointing use validation macro-F1, not plain accuracy, which would be misleading with imbalanced classes; training stops early if macro-F1 does not improve for 5 consecutive epochs. For every epoch the training loss, validation loss, macro-F1 and epoch time are logged (log.csv).</w:t>
+      </w:r>
+    </w:p>
+    <w:p>
+      <w:pPr>
+        <w:jc w:val="both"/>
+      </w:pPr>
+      <w:r>
+        <w:t>The photo-only baseline (</w:t>
+      </w:r>
+      <w:r>
         <w:rPr>
-          <w:highlight w:val="yellow"/>
+          <w:rFonts w:ascii="Courier New" w:hAnsi="Courier New" w:eastAsia="Courier New" w:cs="Courier New"/>
+          <w:sz w:val="19"/>
         </w:rPr>
-        <w:t>[To be written: image backbone, questionnaire branch and late fusion, modality dropout, training procedure.]</w:t>
+        <w:t>ml/models/image_model.py</w:t>
+      </w:r>
+      <w:r>
+        <w:t>) is evaluated with two pretrained networks: EfficientNet-B0 [6] and MobileNetV3-Large [12], a smaller network designed for mobile phones and therefore relevant to a mobile app. The ImageNet classification layer (1,000 classes) is replaced by a new four-output layer initialised with small weights, so the model starts with near-equal probabilities for the four categories; the library's default initialisation started from very large scores and a loss of about 4.5 instead of about 1.4.</w:t>
+      </w:r>
+    </w:p>
+    <w:p>
+      <w:pPr>
+        <w:jc w:val="both"/>
+      </w:pPr>
+      <w:r>
+        <w:t>The network is fine-tuned in three stages to avoid catastrophic forgetting, i.e. losing useful ImageNet features when all layers are changed abruptly by the large gradients of a still untrained classification layer. Stage 1 trains only the classification layer (learning rate 1e-3) with the rest of the network frozen (its parameters do not change). Stage 2 also unfreezes the last two blocks and the final convolutional layer, at a learning rate ten times lower than the classifier's (3e-4 for the classifier, 3e-5 for the network). The optional stage 3 trains all parameters at an even lower rate (1e-4 and 1e-5). Each stage starts from the best checkpoint so far and has its own early-stopping patience. Frozen batch-normalisation layers stay in evaluation mode, so their ImageNet statistics are not overwritten. For a fair comparison with the questionnaire model, the same staged procedure must also be applied to the fusion model.</w:t>
       </w:r>
     </w:p>
     <w:p>
@@ -2237,10 +2294,61 @@
         <w:jc w:val="both"/>
       </w:pPr>
       <w:r>
+        <w:t>Evaluation is done once on the test split with the weights chosen on validation. Metrics are macro-F1 (the mean of the per-class F1 scores, which treats small and large classes equally) and balanced accuracy (the mean per-class recall), reported overall and separately for each eFST group (I-II, III-IV, V-VI, missing), together with the maximum gap between the tone groups (I-II, III-IV, V-VI; 'missing' is not a tone). Within a group, macro-F1 is averaged over the categories present in it (e.g. redness_rosacea has no V-VI test case). Every value is reported with a 95% bootstrap confidence interval [11], obtained by resampling the test cases with replacement 1,000 times; the intervals show how certain the results are for small groups. For the missing-answer question, the model is tested with 0%, 25%, 50%, 75% and 100% of the questionnaire fields hidden (each field independently, on top of the answers already missing in the data; at 100% the whole questionnaire is hidden) and compared with the photo-only model. Each configuration is run for the five seeds (0-4) and results are reported as mean and range. The script is ml/train.py.</w:t>
+      </w:r>
+    </w:p>
+    <w:p>
+      <w:pPr>
+        <w:jc w:val="both"/>
+      </w:pPr>
+      <w:r>
+        <w:t xml:space="preserve">Evaluation is performed by </w:t>
+      </w:r>
+      <w:r>
         <w:rPr>
-          <w:highlight w:val="yellow"/>
+          <w:rFonts w:ascii="Courier New" w:hAnsi="Courier New" w:eastAsia="Courier New" w:cs="Courier New"/>
+          <w:sz w:val="19"/>
         </w:rPr>
-        <w:t>[To be written: metrics, skin-tone-stratified reporting, missing-answer experiments, statistical testing.]</w:t>
+        <w:t>ml/evaluate.py</w:t>
+      </w:r>
+      <w:r>
+        <w:t>, which reads a standard predictions file (</w:t>
+      </w:r>
+      <w:r>
+        <w:rPr>
+          <w:rFonts w:ascii="Courier New" w:hAnsi="Courier New" w:eastAsia="Courier New" w:cs="Courier New"/>
+          <w:sz w:val="19"/>
+        </w:rPr>
+        <w:t>predictions.csv</w:t>
+      </w:r>
+      <w:r>
+        <w:t>, one row per case with the true category, the predicted category, the confidence, eFST, eMST, the seed and the share of hidden answers). Besides macro-F1 and balanced accuracy, it reports precision, recall and F1 for every category. Precision is the share of cases assigned to a category that truly belong to it; recall is the share of a category's cases that were found.</w:t>
+      </w:r>
+    </w:p>
+    <w:p>
+      <w:pPr>
+        <w:jc w:val="both"/>
+      </w:pPr>
+      <w:r>
+        <w:t>Calibration shows whether the model's confidence matches reality: a well-calibrated model that states 80% confidence is right in about 80% of cases. Confidence is the highest probability the model gives to any category. It is measured by the Expected Calibration Error (ECE) [13]: predictions are split into 15 equal-width confidence bins, and ECE is the size-weighted mean difference between mean confidence and accuracy in each bin. For an informational app the risk-coverage curve [14] also matters: if the app answers only above a confidence threshold and otherwise recommends seeing a professional, the curve gives the accuracy for each share of cases it answers (coverage). The area under the risk curve (AURC) summarises it in one number; lower is better.</w:t>
+      </w:r>
+    </w:p>
+    <w:p>
+      <w:pPr>
+        <w:jc w:val="both"/>
+      </w:pPr>
+      <w:r>
+        <w:t>Fairness is reported on both tone scales, eFST (I-II, III-IV, V-VI) and eMST (1-3, 4-6, 7-10). For each scale we identify the worst group [15], the tone group with the lowest macro-F1, and its gap to the best group. Only groups with at least 20 cases are eligible, because estimates on smaller groups are too uncertain; excluded groups are listed explicitly. Bootstrap confidence intervals [11] resample cases (</w:t>
+      </w:r>
+      <w:r>
+        <w:rPr>
+          <w:rFonts w:ascii="Courier New" w:hAnsi="Courier New" w:eastAsia="Courier New" w:cs="Courier New"/>
+          <w:sz w:val="19"/>
+        </w:rPr>
+        <w:t>case_id</w:t>
+      </w:r>
+      <w:r>
+        <w:t>), not rows: all rows of a case stay together, so observations of the same case are not treated as independent. Results over the five seeds are summarised by mean, standard deviation, minimum and maximum.</w:t>
       </w:r>
     </w:p>
     <w:p>
@@ -2356,6 +2464,106 @@
       </w:pPr>
       <w:r>
         <w:t>[5] Google Research, Monk Skin Tone Scale. https://skintone.google/</w:t>
+      </w:r>
+    </w:p>
+    <w:p>
+      <w:pPr>
+        <w:spacing w:after="120" w:line="276" w:lineRule="auto"/>
+        <w:ind w:left="567" w:hanging="567"/>
+        <w:jc w:val="left"/>
+      </w:pPr>
+      <w:r>
+        <w:t>[6] M. Tan, Q. V. Le, EfficientNet: Rethinking Model Scaling for Convolutional Neural Networks, ICML 2019. https://arxiv.org/abs/1905.11946</w:t>
+      </w:r>
+    </w:p>
+    <w:p>
+      <w:pPr>
+        <w:spacing w:after="120" w:line="276" w:lineRule="auto"/>
+        <w:ind w:left="567" w:hanging="567"/>
+        <w:jc w:val="left"/>
+      </w:pPr>
+      <w:r>
+        <w:t>[7] R. Wightman, PyTorch Image Models (timm), GitHub repository. https://github.com/huggingface/pytorch-image-models</w:t>
+      </w:r>
+    </w:p>
+    <w:p>
+      <w:pPr>
+        <w:spacing w:after="120" w:line="276" w:lineRule="auto"/>
+        <w:ind w:left="567" w:hanging="567"/>
+        <w:jc w:val="left"/>
+      </w:pPr>
+      <w:r>
+        <w:t>[8] I. Loshchilov, F. Hutter, Decoupled Weight Decay Regularization, ICLR 2019. https://arxiv.org/abs/1711.05101</w:t>
+      </w:r>
+    </w:p>
+    <w:p>
+      <w:pPr>
+        <w:spacing w:after="120" w:line="276" w:lineRule="auto"/>
+        <w:ind w:left="567" w:hanging="567"/>
+        <w:jc w:val="left"/>
+      </w:pPr>
+      <w:r>
+        <w:t>[9] I. Loshchilov, F. Hutter, SGDR: Stochastic Gradient Descent with Warm Restarts, ICLR 2017. https://arxiv.org/abs/1608.03983</w:t>
+      </w:r>
+    </w:p>
+    <w:p>
+      <w:pPr>
+        <w:spacing w:after="120" w:line="276" w:lineRule="auto"/>
+        <w:ind w:left="567" w:hanging="567"/>
+        <w:jc w:val="left"/>
+      </w:pPr>
+      <w:r>
+        <w:t>[10] T.-Y. Lin, P. Goyal, R. Girshick, K. He, P. Dollár, Focal Loss for Dense Object Detection, ICCV 2017. https://arxiv.org/abs/1708.02002</w:t>
+      </w:r>
+    </w:p>
+    <w:p>
+      <w:pPr>
+        <w:spacing w:after="120" w:line="276" w:lineRule="auto"/>
+        <w:ind w:left="567" w:hanging="567"/>
+        <w:jc w:val="left"/>
+      </w:pPr>
+      <w:r>
+        <w:t>[11] B. Efron, R. J. Tibshirani, An Introduction to the Bootstrap, Chapman &amp; Hall/CRC, 1993. https://doi.org/10.1201/9780429246593</w:t>
+      </w:r>
+    </w:p>
+    <w:p>
+      <w:pPr>
+        <w:spacing w:after="120" w:line="276" w:lineRule="auto"/>
+        <w:ind w:left="567" w:hanging="567"/>
+        <w:jc w:val="left"/>
+      </w:pPr>
+      <w:r>
+        <w:t>[12] A. Howard, M. Sandler, G. Chu, L.-C. Chen, B. Chen, M. Tan, W. Wang, Y. Zhu, R. Pang, V. Vasudevan, Q. V. Le, H. Adam, Searching for MobileNetV3, ICCV 2019. https://arxiv.org/abs/1905.02244</w:t>
+      </w:r>
+    </w:p>
+    <w:p>
+      <w:pPr>
+        <w:spacing w:after="120" w:line="276" w:lineRule="auto"/>
+        <w:ind w:left="567" w:hanging="567"/>
+        <w:jc w:val="left"/>
+      </w:pPr>
+      <w:r>
+        <w:t>[13] C. Guo, G. Pleiss, Y. Sun, K. Q. Weinberger, On Calibration of Modern Neural Networks, ICML 2017. https://arxiv.org/abs/1706.04599</w:t>
+      </w:r>
+    </w:p>
+    <w:p>
+      <w:pPr>
+        <w:spacing w:after="120" w:line="276" w:lineRule="auto"/>
+        <w:ind w:left="567" w:hanging="567"/>
+        <w:jc w:val="left"/>
+      </w:pPr>
+      <w:r>
+        <w:t>[14] Y. Geifman, R. El-Yaniv, Selective Classification for Deep Neural Networks, NeurIPS 2017. https://arxiv.org/abs/1705.08500</w:t>
+      </w:r>
+    </w:p>
+    <w:p>
+      <w:pPr>
+        <w:spacing w:after="120" w:line="276" w:lineRule="auto"/>
+        <w:ind w:left="567" w:hanging="567"/>
+        <w:jc w:val="left"/>
+      </w:pPr>
+      <w:r>
+        <w:t>[15] S. Sagawa, P. W. Koh, T. B. Hashimoto, P. Liang, Distributionally Robust Neural Networks for Group Shifts, ICLR 2020. https://arxiv.org/abs/1911.08731</w:t>
       </w:r>
     </w:p>
     <w:sectPr>

</xml_diff>

<commit_message>
feat(ml): add multi-seed image-only runner with class-imbalance ablation
Add run_image_only.py, which trains the image-only baseline (EfficientNet-B0
or MobileNetV3) with the staged fine-tuning recipe on split seeds 0-4, keeps
the best-validation checkpoint per seed in seed_checkpoints/, writes val and
test predictions, scores the test split with evaluate.py and summarises the
seeds as mean +- sd in e1_image_only_test.csv.

--balance toggles one imbalance correction: class-weighted cross-entropy, or
unweighted cross-entropy with a WeightedRandomSampler (1 / class count, with
replacement). Repeated draws of a case within an epoch get their own image
and augmentation instead of identical copies; the first draw matches the
weighted-loss arm. engine.py and evaluate.py are used unchanged.

Document the protocol and the ablation in thesis 5.8 and paper 3.8 with two
new references, list the runner in the README and add a journal entry.
</commit_message>
<xml_diff>
--- a/docs/Paper_Skin_Concern.docx
+++ b/docs/Paper_Skin_Concern.docx
@@ -2283,6 +2283,60 @@
     </w:p>
     <w:p>
       <w:pPr>
+        <w:jc w:val="both"/>
+      </w:pPr>
+      <w:r>
+        <w:t xml:space="preserve">The photo-only baseline is the first arm of experiment E1 and is run by </w:t>
+      </w:r>
+      <w:r>
+        <w:rPr>
+          <w:rFonts w:ascii="Courier New" w:hAnsi="Courier New" w:eastAsia="Courier New" w:cs="Courier New"/>
+          <w:sz w:val="19"/>
+        </w:rPr>
+        <w:t>ml/run_image_only.py</w:t>
+      </w:r>
+      <w:r>
+        <w:t xml:space="preserve"> on all five split variants (seeds 0-4). A seed is the number that initialises the random number generator; each seed has its own case-level split, sample order and augmentation, so repeating the run over five seeds shows how much the result varies by chance alone. For every seed the model is trained in the three stages, the checkpoint (the saved network weights) with the best validation macro-F1 is kept, and it is tested once. Test predictions are scored by </w:t>
+      </w:r>
+      <w:r>
+        <w:rPr>
+          <w:rFonts w:ascii="Courier New" w:hAnsi="Courier New" w:eastAsia="Courier New" w:cs="Courier New"/>
+          <w:sz w:val="19"/>
+        </w:rPr>
+        <w:t>ml/evaluate.py</w:t>
+      </w:r>
+      <w:r>
+        <w:t xml:space="preserve">, and the five seeds are reported as mean ± standard deviation (the standard deviation measures how far the five values spread around their mean) in </w:t>
+      </w:r>
+      <w:r>
+        <w:rPr>
+          <w:rFonts w:ascii="Courier New" w:hAnsi="Courier New" w:eastAsia="Courier New" w:cs="Courier New"/>
+          <w:sz w:val="19"/>
+        </w:rPr>
+        <w:t>e1_image_only_test.csv</w:t>
+      </w:r>
+      <w:r>
+        <w:t>.</w:t>
+      </w:r>
+    </w:p>
+    <w:p>
+      <w:pPr>
+        <w:jc w:val="both"/>
+      </w:pPr>
+      <w:r>
+        <w:t>Class imbalance means that some categories have many more examples than others: the seed-0 training set has 748 eczema_dermatitis, 387 normal_other, 101 acne and only 30 redness_rosacea cases. Without a correction the network would mainly learn the majority class. Two common corrections [16] are compared in an ablation study, i.e. an experiment that changes one component and keeps everything else identical, to isolate that component's effect. (a) Class-weighted loss: cross-entropy gives each class a weight inversely proportional to its frequency (the total number of cases divided by the number of classes times the class's case count; for seed 0, e.g., 10.6 for redness_rosacea and 0.42 for eczema_dermatitis), and the cases are visited in random order, each once per epoch. (b) Weighted sampling (WeightedRandomSampler [17]): the loss is unweighted, but cases are drawn with replacement (the same case can be drawn several times in one epoch) with probability inversely proportional to the case count of their class, so each class makes up about a quarter of the draws. The two corrections are never combined, as that would correct the imbalance twice.</w:t>
+      </w:r>
+    </w:p>
+    <w:p>
+      <w:pPr>
+        <w:jc w:val="both"/>
+      </w:pPr>
+      <w:r>
+        <w:t>With weighted sampling a rare case is drawn about ten times per epoch (redness_rosacea: 30 cases for about 316 draws). Because the image and augmentation of a case depend on the seed, the epoch and the case, all copies would have been identical; the script numbers repeated draws and each repeat gets its own image of the case (if it has several) and its own augmentation. The first draw is identical to the one in variant (a), so the correction method is the only difference between the two arms. The known risk of oversampling is overfitting to the few rare cases, i.e. memorising them instead of learning general features; validation on macro-F1 and early stopping limit this risk. The ablation is run for both networks (EfficientNet-B0 and MobileNetV3-Large), and the variant with the best mean validation macro-F1 becomes the photo-only reference in E1.</w:t>
+      </w:r>
+    </w:p>
+    <w:p>
+      <w:pPr>
         <w:pStyle w:val="Heading2"/>
       </w:pPr>
       <w:r>
@@ -2564,6 +2618,26 @@
       </w:pPr>
       <w:r>
         <w:t>[15] S. Sagawa, P. W. Koh, T. B. Hashimoto, P. Liang, Distributionally Robust Neural Networks for Group Shifts, ICLR 2020. https://arxiv.org/abs/1911.08731</w:t>
+      </w:r>
+    </w:p>
+    <w:p>
+      <w:pPr>
+        <w:spacing w:after="120" w:line="276" w:lineRule="auto"/>
+        <w:ind w:left="567" w:hanging="567"/>
+        <w:jc w:val="left"/>
+      </w:pPr>
+      <w:r>
+        <w:t>[16] M. Buda, A. Maki, M. A. Mazurowski, A systematic study of the class imbalance problem in convolutional neural networks, Neural Networks 106, 2018. https://arxiv.org/abs/1710.05381</w:t>
+      </w:r>
+    </w:p>
+    <w:p>
+      <w:pPr>
+        <w:spacing w:after="120" w:line="276" w:lineRule="auto"/>
+        <w:ind w:left="567" w:hanging="567"/>
+        <w:jc w:val="left"/>
+      </w:pPr>
+      <w:r>
+        <w:t>[17] PyTorch documentation, torch.utils.data.WeightedRandomSampler. https://docs.pytorch.org/docs/stable/data.html#torch.utils.data.WeightedRandomSampler</w:t>
       </w:r>
     </w:p>
     <w:sectPr>

</xml_diff>

<commit_message>
docs: record Fitzpatrick17k delete-after-research terms and test-only use
</commit_message>
<xml_diff>
--- a/docs/Paper_Skin_Concern.docx
+++ b/docs/Paper_Skin_Concern.docx
@@ -2469,6 +2469,14 @@
     </w:p>
     <w:p>
       <w:pPr>
+        <w:jc w:val="both"/>
+      </w:pPr>
+      <w:r>
+        <w:t>The Fitzpatrick17k images were obtained from the authors under an agreement to delete them once the research is complete. They are therefore used for testing only, never for training, are not redistributed and do not appear in the app, the code repository or this paper; only aggregate results are reported. The model shipped in the app is trained on SCIN, whose licence permits reproduction and adaptation with attribution.</w:t>
+      </w:r>
+    </w:p>
+    <w:p>
+      <w:pPr>
         <w:pStyle w:val="Heading1"/>
       </w:pPr>
       <w:r>

</xml_diff>

<commit_message>
feat(ml): multi-seed image-only baseline and external test sets (Tasks 2.4-2.5)
Image-only runner with class-imbalance ablation, across-seed summary fix, DDI/Fitzpatrick17k
zero-shot evaluation, foundation-model linear probe, Fitzpatrick17k data-use terms.
</commit_message>
<xml_diff>
--- a/docs/Paper_Skin_Concern.docx
+++ b/docs/Paper_Skin_Concern.docx
@@ -2283,6 +2283,60 @@
     </w:p>
     <w:p>
       <w:pPr>
+        <w:jc w:val="both"/>
+      </w:pPr>
+      <w:r>
+        <w:t xml:space="preserve">The photo-only baseline is the first arm of experiment E1 and is run by </w:t>
+      </w:r>
+      <w:r>
+        <w:rPr>
+          <w:rFonts w:ascii="Courier New" w:hAnsi="Courier New" w:eastAsia="Courier New" w:cs="Courier New"/>
+          <w:sz w:val="19"/>
+        </w:rPr>
+        <w:t>ml/run_image_only.py</w:t>
+      </w:r>
+      <w:r>
+        <w:t xml:space="preserve"> on all five split variants (seeds 0-4). A seed is the number that initialises the random number generator; each seed has its own case-level split, sample order and augmentation, so repeating the run over five seeds shows how much the result varies by chance alone. For every seed the model is trained in the three stages, the checkpoint (the saved network weights) with the best validation macro-F1 is kept, and it is tested once. Test predictions are scored by </w:t>
+      </w:r>
+      <w:r>
+        <w:rPr>
+          <w:rFonts w:ascii="Courier New" w:hAnsi="Courier New" w:eastAsia="Courier New" w:cs="Courier New"/>
+          <w:sz w:val="19"/>
+        </w:rPr>
+        <w:t>ml/evaluate.py</w:t>
+      </w:r>
+      <w:r>
+        <w:t xml:space="preserve">, and the five seeds are reported as mean ± standard deviation (the standard deviation measures how far the five values spread around their mean) in </w:t>
+      </w:r>
+      <w:r>
+        <w:rPr>
+          <w:rFonts w:ascii="Courier New" w:hAnsi="Courier New" w:eastAsia="Courier New" w:cs="Courier New"/>
+          <w:sz w:val="19"/>
+        </w:rPr>
+        <w:t>e1_image_only_test.csv</w:t>
+      </w:r>
+      <w:r>
+        <w:t>.</w:t>
+      </w:r>
+    </w:p>
+    <w:p>
+      <w:pPr>
+        <w:jc w:val="both"/>
+      </w:pPr>
+      <w:r>
+        <w:t>Class imbalance means that some categories have many more examples than others: the seed-0 training set has 748 eczema_dermatitis, 387 normal_other, 101 acne and only 30 redness_rosacea cases. Without a correction the network would mainly learn the majority class. Two common corrections [16] are compared in an ablation study, i.e. an experiment that changes one component and keeps everything else identical, to isolate that component's effect. (a) Class-weighted loss: cross-entropy gives each class a weight inversely proportional to its frequency (the total number of cases divided by the number of classes times the class's case count; for seed 0, e.g., 10.6 for redness_rosacea and 0.42 for eczema_dermatitis), and the cases are visited in random order, each once per epoch. (b) Weighted sampling (WeightedRandomSampler [17]): the loss is unweighted, but cases are drawn with replacement (the same case can be drawn several times in one epoch) with probability inversely proportional to the case count of their class, so each class makes up about a quarter of the draws. The two corrections are never combined, as that would correct the imbalance twice.</w:t>
+      </w:r>
+    </w:p>
+    <w:p>
+      <w:pPr>
+        <w:jc w:val="both"/>
+      </w:pPr>
+      <w:r>
+        <w:t>With weighted sampling a rare case is drawn about ten times per epoch (redness_rosacea: 30 cases for about 316 draws). Because the image and augmentation of a case depend on the seed, the epoch and the case, all copies would have been identical; the script numbers repeated draws and each repeat gets its own image of the case (if it has several) and its own augmentation. The first draw is identical to the one in variant (a), so the correction method is the only difference between the two arms. The known risk of oversampling is overfitting to the few rare cases, i.e. memorising them instead of learning general features; validation on macro-F1 and early stopping limit this risk. The ablation is run for both networks (EfficientNet-B0 and MobileNetV3-Large), and the variant with the best mean validation macro-F1 becomes the photo-only reference in E1.</w:t>
+      </w:r>
+    </w:p>
+    <w:p>
+      <w:pPr>
         <w:pStyle w:val="Heading2"/>
       </w:pPr>
       <w:r>
@@ -2349,6 +2403,76 @@
       </w:r>
       <w:r>
         <w:t>), not rows: all rows of a case stay together, so observations of the same case are not treated as independent. Results over the five seeds are summarised by mean, standard deviation, minimum and maximum.</w:t>
+      </w:r>
+    </w:p>
+    <w:p>
+      <w:pPr>
+        <w:pStyle w:val="Heading2"/>
+      </w:pPr>
+      <w:r>
+        <w:t>3.10 External test sets and linear probe</w:t>
+      </w:r>
+    </w:p>
+    <w:p>
+      <w:pPr>
+        <w:jc w:val="both"/>
+      </w:pPr>
+      <w:r>
+        <w:t>To check whether the SCIN-trained photo-only model also works on photos from other sources, it is tested without any retraining (external, zero-shot evaluation) on two public sets: DDI (Diverse Dermatology Images) [18], 656 clinical images confirmed by biopsy (microscopic examination of a tissue sample), grouped into Fitzpatrick I-II, III-IV and V-VI, and Fitzpatrick17k [19], 16,577 images from online dermatology atlases with 114 diagnoses and Fitzpatrick type 1-6. Neither has a questionnaire, so only the photo model is tested. The difference between the training and test sources (other cameras, framing and diseases) is called domain shift; the drop in performance on these sets shows how much the model depends on the particulars of SCIN.</w:t>
+      </w:r>
+    </w:p>
+    <w:p>
+      <w:pPr>
+        <w:jc w:val="both"/>
+      </w:pPr>
+      <w:r>
+        <w:t xml:space="preserve">External diagnoses are mapped to the four target categories with the same </w:t>
+      </w:r>
+      <w:r>
+        <w:rPr>
+          <w:rFonts w:ascii="Courier New" w:hAnsi="Courier New" w:eastAsia="Courier New" w:cs="Courier New"/>
+          <w:sz w:val="19"/>
+        </w:rPr>
+        <w:t>label_map.yaml</w:t>
+      </w:r>
+      <w:r>
+        <w:t xml:space="preserve">, after normalisation (lower case, hyphen read as a space), plus a short per-dataset list of synonyms (e.g. 'acne vulgaris' -&gt; acne, 'rhinophyma' -&gt; redness_rosacea). Every row gets a status written to a report: kept, non-target category (e.g. cancers, which are </w:t>
+      </w:r>
+      <w:r>
+        <w:rPr>
+          <w:rFonts w:ascii="Courier New" w:hAnsi="Courier New" w:eastAsia="Courier New" w:cs="Courier New"/>
+          <w:sz w:val="19"/>
+        </w:rPr>
+        <w:t>excluded</w:t>
+      </w:r>
+      <w:r>
+        <w:t>), unmapped (unknown diagnosis, never guessed), wrong label according to the Fitzpatrick17k quality check, or missing image; only kept rows are evaluated. In Fitzpatrick17k, 4,012 images match the target categories (normal_other 1,892, eczema_dermatitis 1,009, acne 857, redness_rosacea 254), but here normal_other is dominated by psoriasis, so the category's composition differs from SCIN. A practical limitation: most Fitzpatrick17k image URLs (the DermaAmin atlas) no longer work, and the full set is obtained from the authors through a request form. Images are not redistributed (CC BY-NC-SA 3.0 for Fitzpatrick17k; Stanford AIMI terms for DDI). DDI tones 12 / 34 / 56 are treated as eFST groups I-II / III-IV / V-VI, and the predictions of all five models (one per seed) are evaluated with the same protocol as on SCIN.</w:t>
+      </w:r>
+    </w:p>
+    <w:p>
+      <w:pPr>
+        <w:jc w:val="both"/>
+      </w:pPr>
+      <w:r>
+        <w:t xml:space="preserve">As the baseline for experiment E5 we use a linear probe [20]. A foundation model is a large network pretrained on very many images whose representations can be reused for many tasks; in dermatology, examples are PanDerm [22] and DermLIP [23]. The network stays frozen (its weights do not change): for every SCIN case its feature vector, the list of numbers by which the network describes the image, is computed once, and only a linear layer is trained on top, which is equivalent to multinomial logistic regression. Features are standardised (subtracting the mean and dividing by the standard deviation, both computed on the training set only), the loss is class-weighted cross-entropy, and an L2 penalty (the sum of squared weights times a constant) keeps the weights from growing too large; the constant is chosen on validation from 0 to 100. Linear-probe evaluation is the standard way to compare representations [21]: if a simple probe on a foundation model matches the fully fine-tuned network, the advantage comes from the representation, not the training. </w:t>
+      </w:r>
+      <w:r>
+        <w:rPr>
+          <w:rFonts w:ascii="Courier New" w:hAnsi="Courier New" w:eastAsia="Courier New" w:cs="Courier New"/>
+          <w:sz w:val="19"/>
+        </w:rPr>
+        <w:t>ml/foundation_probe.py</w:t>
+      </w:r>
+      <w:r>
+        <w:t xml:space="preserve"> accepts any timm, OpenCLIP or Hugging Face model, so PanDerm and DermLIP weights can be used without code changes.</w:t>
+      </w:r>
+    </w:p>
+    <w:p>
+      <w:pPr>
+        <w:jc w:val="both"/>
+      </w:pPr>
+      <w:r>
+        <w:t>The Fitzpatrick17k images were obtained from the authors under an agreement to delete them once the research is complete. They are therefore used for testing only, never for training, are not redistributed and do not appear in the app, the code repository or this paper; only aggregate results are reported. The model shipped in the app is trained on SCIN, whose licence permits reproduction and adaptation with attribution.</w:t>
       </w:r>
     </w:p>
     <w:p>
@@ -2564,6 +2688,86 @@
       </w:pPr>
       <w:r>
         <w:t>[15] S. Sagawa, P. W. Koh, T. B. Hashimoto, P. Liang, Distributionally Robust Neural Networks for Group Shifts, ICLR 2020. https://arxiv.org/abs/1911.08731</w:t>
+      </w:r>
+    </w:p>
+    <w:p>
+      <w:pPr>
+        <w:spacing w:after="120" w:line="276" w:lineRule="auto"/>
+        <w:ind w:left="567" w:hanging="567"/>
+        <w:jc w:val="left"/>
+      </w:pPr>
+      <w:r>
+        <w:t>[16] M. Buda, A. Maki, M. A. Mazurowski, A systematic study of the class imbalance problem in convolutional neural networks, Neural Networks 106, 2018. https://arxiv.org/abs/1710.05381</w:t>
+      </w:r>
+    </w:p>
+    <w:p>
+      <w:pPr>
+        <w:spacing w:after="120" w:line="276" w:lineRule="auto"/>
+        <w:ind w:left="567" w:hanging="567"/>
+        <w:jc w:val="left"/>
+      </w:pPr>
+      <w:r>
+        <w:t>[17] PyTorch documentation, torch.utils.data.WeightedRandomSampler. https://docs.pytorch.org/docs/stable/data.html#torch.utils.data.WeightedRandomSampler</w:t>
+      </w:r>
+    </w:p>
+    <w:p>
+      <w:pPr>
+        <w:spacing w:after="120" w:line="276" w:lineRule="auto"/>
+        <w:ind w:left="567" w:hanging="567"/>
+        <w:jc w:val="left"/>
+      </w:pPr>
+      <w:r>
+        <w:t>[18] R. Daneshjou et al., Disparities in dermatology AI performance on a diverse, curated clinical image set, Science Advances 8(32), 2022. https://doi.org/10.1126/sciadv.abq6147</w:t>
+      </w:r>
+    </w:p>
+    <w:p>
+      <w:pPr>
+        <w:spacing w:after="120" w:line="276" w:lineRule="auto"/>
+        <w:ind w:left="567" w:hanging="567"/>
+        <w:jc w:val="left"/>
+      </w:pPr>
+      <w:r>
+        <w:t>[19] M. Groh et al., Evaluating Deep Neural Networks Trained on Clinical Images in Dermatology with the Fitzpatrick 17k Dataset, CVPR Workshops 2021. https://arxiv.org/abs/2104.09957</w:t>
+      </w:r>
+    </w:p>
+    <w:p>
+      <w:pPr>
+        <w:spacing w:after="120" w:line="276" w:lineRule="auto"/>
+        <w:ind w:left="567" w:hanging="567"/>
+        <w:jc w:val="left"/>
+      </w:pPr>
+      <w:r>
+        <w:t>[20] G. Alain, Y. Bengio, Understanding intermediate layers using linear classifier probes, arXiv 2016. https://arxiv.org/abs/1610.01644</w:t>
+      </w:r>
+    </w:p>
+    <w:p>
+      <w:pPr>
+        <w:spacing w:after="120" w:line="276" w:lineRule="auto"/>
+        <w:ind w:left="567" w:hanging="567"/>
+        <w:jc w:val="left"/>
+      </w:pPr>
+      <w:r>
+        <w:t>[21] A. Radford et al., Learning Transferable Visual Models From Natural Language Supervision, ICML 2021. https://arxiv.org/abs/2103.00020</w:t>
+      </w:r>
+    </w:p>
+    <w:p>
+      <w:pPr>
+        <w:spacing w:after="120" w:line="276" w:lineRule="auto"/>
+        <w:ind w:left="567" w:hanging="567"/>
+        <w:jc w:val="left"/>
+      </w:pPr>
+      <w:r>
+        <w:t>[22] S. Yan et al., A multimodal vision foundation model for clinical dermatology (PanDerm), Nature Medicine 2025. https://www.nature.com/articles/s41591-025-03747-y</w:t>
+      </w:r>
+    </w:p>
+    <w:p>
+      <w:pPr>
+        <w:spacing w:after="120" w:line="276" w:lineRule="auto"/>
+        <w:ind w:left="567" w:hanging="567"/>
+        <w:jc w:val="left"/>
+      </w:pPr>
+      <w:r>
+        <w:t>[23] S. Yan et al., Derm1M: A Million-scale Vision-Language Dataset Aligned with Clinical Ontology Knowledge for Dermatology (DermLIP), ICCV 2025. https://arxiv.org/abs/2503.14911</w:t>
       </w:r>
     </w:p>
     <w:sectPr>

</xml_diff>

<commit_message>
feat(ml): add questionnaire-only MLP baseline and five-seed runner
Add models/q_model.py, a small MLP over the encoded answers concatenated with
the per-field missingness mask, and run_q_only.py, which trains it on split
seeds 0-4 with the existing engine (class-weighted cross-entropy or weighted
sampling, early stopping on validation macro-F1), scores the test split at
0-100% hidden answers with evaluate.py and writes the across-seed summary to
e1_questionnaire_only_test.csv. Answers are hidden with the same generator,
batch size and order as the fusion evaluation, so both models see identical
missing answers.

aggregate_seeds now groups by missing_pct as well, so summaries of different
missing-answer rates are no longer averaged together.

Document the model in thesis 5.8 / paper 3.8 and the first results in thesis
8.1 / paper 4.1, update the README and add a journal entry.
</commit_message>
<xml_diff>
--- a/docs/Paper_Skin_Concern.docx
+++ b/docs/Paper_Skin_Concern.docx
@@ -99,7 +99,7 @@
         <w:rPr>
           <w:highlight w:val="yellow"/>
         </w:rPr>
-        <w:t>[To be written once results are available: background and objective, data and methods, main results, conclusion.]</w:t>
+        <w:t>[Remaining results (photo-only, fusion, E2-E6) to be added as experiments complete.]</w:t>
       </w:r>
     </w:p>
     <w:p>
@@ -2337,6 +2337,34 @@
     </w:p>
     <w:p>
       <w:pPr>
+        <w:jc w:val="both"/>
+      </w:pPr>
+      <w:r>
+        <w:t>The second arm of experiment E1 is the questionnaire-only model (</w:t>
+      </w:r>
+      <w:r>
+        <w:rPr>
+          <w:rFonts w:ascii="Courier New" w:hAnsi="Courier New" w:eastAsia="Courier New" w:cs="Courier New"/>
+          <w:sz w:val="19"/>
+        </w:rPr>
+        <w:t>ml/models/q_model.py</w:t>
+      </w:r>
+      <w:r>
+        <w:t xml:space="preserve">, run by </w:t>
+      </w:r>
+      <w:r>
+        <w:rPr>
+          <w:rFonts w:ascii="Courier New" w:hAnsi="Courier New" w:eastAsia="Courier New" w:cs="Courier New"/>
+          <w:sz w:val="19"/>
+        </w:rPr>
+        <w:t>ml/run_q_only.py</w:t>
+      </w:r>
+      <w:r>
+        <w:t>), which shows how much signal the questionnaire carries on its own, without the photo. It is a multilayer perceptron (MLP) [24]: a network of successive linear layers, each followed by a ReLU activation (which keeps positive values and replaces negative ones with 0) and dropout 0.2 (during training, 20% of the neurons are ignored at random so the network does not memorise the examples). The input is the vector of encoded answers (40 values) next to the missingness mask (6 values, one per question), so the network can tell an answer 'no' from a question that was not answered; it is followed by two hidden layers of 64 neurons and an output layer with four values. The model uses exactly the same cases, splits, seeds, class-weighted loss, early stopping on validation macro-F1 and evaluation protocol as the photo model. The test set is also scored with a share r of the answers hidden (r = 0, 0.25, 0.5, 0.75, 1), and the hidden answers are exactly the same as in the fusion model's evaluation, so the curves can be compared directly.</w:t>
+      </w:r>
+    </w:p>
+    <w:p>
+      <w:pPr>
         <w:pStyle w:val="Heading2"/>
       </w:pPr>
       <w:r>
@@ -2492,6 +2520,259 @@
           <w:highlight w:val="yellow"/>
         </w:rPr>
         <w:t>[To be written once experiments are complete.]</w:t>
+      </w:r>
+    </w:p>
+    <w:p>
+      <w:pPr>
+        <w:pStyle w:val="Heading2"/>
+      </w:pPr>
+      <w:r>
+        <w:t>4.1 Questionnaire-only baseline (E1, arm 2)</w:t>
+      </w:r>
+    </w:p>
+    <w:p>
+      <w:pPr>
+        <w:jc w:val="both"/>
+      </w:pPr>
+      <w:r>
+        <w:t>Over the five seeds, the questionnaire-only model reaches a test macro-F1 of 0.390 ± 0.038 (mean ± standard deviation), balanced accuracy 0.443 ± 0.043 and ECE 0.083 ± 0.020 (Table 1). Training takes 6-11 seconds per seed, and early stopping selects epochs between 16 and 51. Per category, F1 is 0.569 for eczema_dermatitis, 0.429 for normal_other, 0.343 for redness_rosacea and 0.218 for acne. The redness_rosacea test set has only 6 cases on average, so that value is very uncertain (standard deviation 0.112). The questionnaire thus carries clear signal above chance, but not enough to separate acne, which looks like the other concerns from the answers alone.</w:t>
+      </w:r>
+    </w:p>
+    <w:p>
+      <w:pPr>
+        <w:jc w:val="both"/>
+      </w:pPr>
+      <w:r>
+        <w:t>Table 1. Questionnaire-only model on the test set (5 seeds, mean ± standard deviation) by share of hidden answers.</w:t>
+      </w:r>
+    </w:p>
+    <w:tbl>
+      <w:tblPr>
+        <w:tblStyle w:val="TableGrid"/>
+        <w:tblW w:type="auto" w:w="0"/>
+        <w:tblLook w:firstColumn="1" w:firstRow="1" w:lastColumn="0" w:lastRow="0" w:noHBand="0" w:noVBand="1" w:val="04A0"/>
+      </w:tblPr>
+      <w:tblGrid>
+        <w:gridCol w:w="3024"/>
+        <w:gridCol w:w="3024"/>
+        <w:gridCol w:w="3024"/>
+      </w:tblGrid>
+      <w:tr>
+        <w:tc>
+          <w:tcPr>
+            <w:tcW w:type="dxa" w:w="3024"/>
+          </w:tcPr>
+          <w:p>
+            <w:r>
+              <w:rPr>
+                <w:b/>
+              </w:rPr>
+              <w:t>% answers hidden</w:t>
+            </w:r>
+          </w:p>
+        </w:tc>
+        <w:tc>
+          <w:tcPr>
+            <w:tcW w:type="dxa" w:w="3024"/>
+          </w:tcPr>
+          <w:p>
+            <w:r>
+              <w:rPr>
+                <w:b/>
+              </w:rPr>
+              <w:t>Macro-F1</w:t>
+            </w:r>
+          </w:p>
+        </w:tc>
+        <w:tc>
+          <w:tcPr>
+            <w:tcW w:type="dxa" w:w="3024"/>
+          </w:tcPr>
+          <w:p>
+            <w:r>
+              <w:rPr>
+                <w:b/>
+              </w:rPr>
+              <w:t>Balanced accuracy</w:t>
+            </w:r>
+          </w:p>
+        </w:tc>
+      </w:tr>
+      <w:tr>
+        <w:tc>
+          <w:tcPr>
+            <w:tcW w:type="dxa" w:w="3024"/>
+          </w:tcPr>
+          <w:p>
+            <w:r>
+              <w:t>0 (natural)</w:t>
+            </w:r>
+          </w:p>
+        </w:tc>
+        <w:tc>
+          <w:tcPr>
+            <w:tcW w:type="dxa" w:w="3024"/>
+          </w:tcPr>
+          <w:p>
+            <w:r>
+              <w:t>0.390 ± 0.038</w:t>
+            </w:r>
+          </w:p>
+        </w:tc>
+        <w:tc>
+          <w:tcPr>
+            <w:tcW w:type="dxa" w:w="3024"/>
+          </w:tcPr>
+          <w:p>
+            <w:r>
+              <w:t>0.443 ± 0.043</w:t>
+            </w:r>
+          </w:p>
+        </w:tc>
+      </w:tr>
+      <w:tr>
+        <w:tc>
+          <w:tcPr>
+            <w:tcW w:type="dxa" w:w="3024"/>
+          </w:tcPr>
+          <w:p>
+            <w:r>
+              <w:t>25</w:t>
+            </w:r>
+          </w:p>
+        </w:tc>
+        <w:tc>
+          <w:tcPr>
+            <w:tcW w:type="dxa" w:w="3024"/>
+          </w:tcPr>
+          <w:p>
+            <w:r>
+              <w:t>0.325 ± 0.038</w:t>
+            </w:r>
+          </w:p>
+        </w:tc>
+        <w:tc>
+          <w:tcPr>
+            <w:tcW w:type="dxa" w:w="3024"/>
+          </w:tcPr>
+          <w:p>
+            <w:r>
+              <w:t>-</w:t>
+            </w:r>
+          </w:p>
+        </w:tc>
+      </w:tr>
+      <w:tr>
+        <w:tc>
+          <w:tcPr>
+            <w:tcW w:type="dxa" w:w="3024"/>
+          </w:tcPr>
+          <w:p>
+            <w:r>
+              <w:t>50</w:t>
+            </w:r>
+          </w:p>
+        </w:tc>
+        <w:tc>
+          <w:tcPr>
+            <w:tcW w:type="dxa" w:w="3024"/>
+          </w:tcPr>
+          <w:p>
+            <w:r>
+              <w:t>0.264 ± 0.047</w:t>
+            </w:r>
+          </w:p>
+        </w:tc>
+        <w:tc>
+          <w:tcPr>
+            <w:tcW w:type="dxa" w:w="3024"/>
+          </w:tcPr>
+          <w:p>
+            <w:r>
+              <w:t>-</w:t>
+            </w:r>
+          </w:p>
+        </w:tc>
+      </w:tr>
+      <w:tr>
+        <w:tc>
+          <w:tcPr>
+            <w:tcW w:type="dxa" w:w="3024"/>
+          </w:tcPr>
+          <w:p>
+            <w:r>
+              <w:t>75</w:t>
+            </w:r>
+          </w:p>
+        </w:tc>
+        <w:tc>
+          <w:tcPr>
+            <w:tcW w:type="dxa" w:w="3024"/>
+          </w:tcPr>
+          <w:p>
+            <w:r>
+              <w:t>0.221 ± 0.037</w:t>
+            </w:r>
+          </w:p>
+        </w:tc>
+        <w:tc>
+          <w:tcPr>
+            <w:tcW w:type="dxa" w:w="3024"/>
+          </w:tcPr>
+          <w:p>
+            <w:r>
+              <w:t>-</w:t>
+            </w:r>
+          </w:p>
+        </w:tc>
+      </w:tr>
+      <w:tr>
+        <w:tc>
+          <w:tcPr>
+            <w:tcW w:type="dxa" w:w="3024"/>
+          </w:tcPr>
+          <w:p>
+            <w:r>
+              <w:t>100</w:t>
+            </w:r>
+          </w:p>
+        </w:tc>
+        <w:tc>
+          <w:tcPr>
+            <w:tcW w:type="dxa" w:w="3024"/>
+          </w:tcPr>
+          <w:p>
+            <w:r>
+              <w:t>0.145 ± 0.037</w:t>
+            </w:r>
+          </w:p>
+        </w:tc>
+        <w:tc>
+          <w:tcPr>
+            <w:tcW w:type="dxa" w:w="3024"/>
+          </w:tcPr>
+          <w:p>
+            <w:r>
+              <w:t>0.250 ± 0.000</w:t>
+            </w:r>
+          </w:p>
+        </w:tc>
+      </w:tr>
+    </w:tbl>
+    <w:p>
+      <w:pPr>
+        <w:jc w:val="both"/>
+      </w:pPr>
+      <w:r>
+        <w:t>When answers are hidden, performance falls steadily: macro-F1 0.390 with the natural answers, 0.325 with 25% hidden, 0.264 with 50%, 0.221 with 75% and 0.145 with all hidden. With no answers at all, the model gives every case the same category (normal_other for seed 0) and balanced accuracy is exactly 0.250, the chance level for four categories. This confirms that the missingness mask works as designed: an empty questionnaire adds no false information.</w:t>
+      </w:r>
+    </w:p>
+    <w:p>
+      <w:pPr>
+        <w:jc w:val="both"/>
+      </w:pPr>
+      <w:r>
+        <w:t>By skin tone (eFST), macro-F1 is 0.401 ± 0.045 for I-II (117 cases on average), 0.342 ± 0.100 for III-IV (120 cases) and 0.475 ± 0.131 for V-VI (23 cases). The worst group is III-IV in three seeds and I-II in two, with a mean macro-F1 of 0.319 ± 0.067. The higher value for V-VI should not be read as an advantage: the group has just over 20 cases, and the spread across seeds (0.131) is larger than the differences between groups. These values are the lower reference against which the photo-only and fusion models will be compared (RQ1).</w:t>
       </w:r>
     </w:p>
     <w:p>
@@ -2768,6 +3049,16 @@
       </w:pPr>
       <w:r>
         <w:t>[23] S. Yan et al., Derm1M: A Million-scale Vision-Language Dataset Aligned with Clinical Ontology Knowledge for Dermatology (DermLIP), ICCV 2025. https://arxiv.org/abs/2503.14911</w:t>
+      </w:r>
+    </w:p>
+    <w:p>
+      <w:pPr>
+        <w:spacing w:after="120" w:line="276" w:lineRule="auto"/>
+        <w:ind w:left="567" w:hanging="567"/>
+        <w:jc w:val="left"/>
+      </w:pPr>
+      <w:r>
+        <w:t>[24] I. Goodfellow, Y. Bengio, A. Courville, Deep Learning, MIT Press 2016, chapter 6 (deep feedforward networks). https://www.deeplearningbook.org/</w:t>
       </w:r>
     </w:p>
     <w:sectPr>

</xml_diff>

<commit_message>
feat(ml): extend E1 to ten split seeds with skin-tone and category analysis
Add split seeds 5-9 (seeds 0-4 are unchanged; each seed's split is
independent) and train every E1 arm on them.

run_e1.py now reports, per skin-tone group (eFST and eMST) and per category,
the macro-F1 / F1 of every arm and the paired difference against the
photo-only model, with seed-stratified paired bootstrap CIs and Holm-adjusted
p-values per comparison. Tables are written for all ten seeds and for the
halves seeds0-4 and seeds5-9, so a pattern seen in the first half can be
checked on the second.

Fix seed_runs.csv being overwritten with only the newly trained seeds when
--skip-existing is used: write_seed_runs merges the records instead.

Document the final ten-seed results in thesis 8.4 and paper 4.4.
</commit_message>
<xml_diff>
--- a/docs/Paper_Skin_Concern.docx
+++ b/docs/Paper_Skin_Concern.docx
@@ -3627,6 +3627,521 @@
     </w:p>
     <w:p>
       <w:pPr>
+        <w:pStyle w:val="Heading2"/>
+      </w:pPr>
+      <w:r>
+        <w:t>4.4 Final results over ten seeds, by skin tone and by category</w:t>
+      </w:r>
+    </w:p>
+    <w:p>
+      <w:pPr>
+        <w:jc w:val="both"/>
+      </w:pPr>
+      <w:r>
+        <w:t xml:space="preserve">The results in Sections 4.2 and 4.3 use the first five seeds and are preliminary. To narrow the confidence intervals, five more split variants were created (seeds 5-9; splits 0-4 stayed identical) and every arm was retrained on them. The analysis plan was fixed before the new results were seen: the same arms and metrics, paired differences against the photo-only model, and Holm-corrected p-values [30] for tone groups and categories. The Holm correction is needed because many tests are run at once (6 tone groups and 4 categories per model): with 10 tests, at least one 'significant' result can appear by chance, and the correction raises the threshold so that the probability of any such false alarm in the whole family stays below 5%. The Wilcoxon signed-rank test [31] compares the per-seed differences without assuming a normal distribution. Full results are in </w:t>
+      </w:r>
+      <w:r>
+        <w:rPr>
+          <w:rFonts w:ascii="Courier New" w:hAnsi="Courier New" w:eastAsia="Courier New" w:cs="Courier New"/>
+          <w:sz w:val="19"/>
+        </w:rPr>
+        <w:t>ml/results/e1/</w:t>
+      </w:r>
+      <w:r>
+        <w:t xml:space="preserve"> (all ten seeds), and the halves </w:t>
+      </w:r>
+      <w:r>
+        <w:rPr>
+          <w:rFonts w:ascii="Courier New" w:hAnsi="Courier New" w:eastAsia="Courier New" w:cs="Courier New"/>
+          <w:sz w:val="19"/>
+        </w:rPr>
+        <w:t>seeds0-4</w:t>
+      </w:r>
+      <w:r>
+        <w:t xml:space="preserve"> and </w:t>
+      </w:r>
+      <w:r>
+        <w:rPr>
+          <w:rFonts w:ascii="Courier New" w:hAnsi="Courier New" w:eastAsia="Courier New" w:cs="Courier New"/>
+          <w:sz w:val="19"/>
+        </w:rPr>
+        <w:t>seeds5-9</w:t>
+      </w:r>
+      <w:r>
+        <w:t xml:space="preserve"> are reported separately as a replication check.</w:t>
+      </w:r>
+    </w:p>
+    <w:p>
+      <w:pPr>
+        <w:jc w:val="both"/>
+      </w:pPr>
+      <w:r>
+        <w:t>Over ten seeds (Table 4), the photo-only model reaches a macro-F1 of 0.519 ± 0.040, and none of the variants that use the questionnaire beats it: concatenation −0.005 [95% CI −0.024, +0.014], better in 6 of 10 seeds; FiLM +0.000 [−0.023, +0.023], 5/10; concatenation without dropout −0.014 [−0.035, +0.006]; ensemble −0.021 [−0.047, +0.003]. Gated fusion is even worse: −0.030 [−0.053, −0.007], better in only 2 of 10 seeds (Wilcoxon p = 0.037). The small lead of FiLM over the first five seeds (+0.008) disappeared, which shows why five seeds are not enough. The narrower intervals allow a firmer conclusion: with 95% confidence, any gain from the questionnaire in this configuration is smaller than about 0.02 macro-F1 (the upper end of the interval is +0.023 for FiLM and +0.014 for concatenation).</w:t>
+      </w:r>
+    </w:p>
+    <w:p>
+      <w:pPr>
+        <w:jc w:val="both"/>
+      </w:pPr>
+      <w:r>
+        <w:t>Table 4. All E1 arms over ten seeds (EfficientNet-B0, weighted loss; mean ± standard deviation; paired differences on the same cases, seed-stratified bootstrap interval).</w:t>
+      </w:r>
+    </w:p>
+    <w:tbl>
+      <w:tblPr>
+        <w:tblStyle w:val="TableGrid"/>
+        <w:tblW w:type="auto" w:w="0"/>
+        <w:tblLook w:firstColumn="1" w:firstRow="1" w:lastColumn="0" w:lastRow="0" w:noHBand="0" w:noVBand="1" w:val="04A0"/>
+      </w:tblPr>
+      <w:tblGrid>
+        <w:gridCol w:w="1814"/>
+        <w:gridCol w:w="1814"/>
+        <w:gridCol w:w="1814"/>
+        <w:gridCol w:w="1814"/>
+        <w:gridCol w:w="1814"/>
+      </w:tblGrid>
+      <w:tr>
+        <w:tc>
+          <w:tcPr>
+            <w:tcW w:type="dxa" w:w="1814"/>
+          </w:tcPr>
+          <w:p>
+            <w:r>
+              <w:rPr>
+                <w:b/>
+              </w:rPr>
+              <w:t>Model</w:t>
+            </w:r>
+          </w:p>
+        </w:tc>
+        <w:tc>
+          <w:tcPr>
+            <w:tcW w:type="dxa" w:w="1814"/>
+          </w:tcPr>
+          <w:p>
+            <w:r>
+              <w:rPr>
+                <w:b/>
+              </w:rPr>
+              <w:t>Macro-F1 (10 seeds)</w:t>
+            </w:r>
+          </w:p>
+        </w:tc>
+        <w:tc>
+          <w:tcPr>
+            <w:tcW w:type="dxa" w:w="1814"/>
+          </w:tcPr>
+          <w:p>
+            <w:r>
+              <w:rPr>
+                <w:b/>
+              </w:rPr>
+              <w:t>Difference vs photo [95% CI]</w:t>
+            </w:r>
+          </w:p>
+        </w:tc>
+        <w:tc>
+          <w:tcPr>
+            <w:tcW w:type="dxa" w:w="1814"/>
+          </w:tcPr>
+          <w:p>
+            <w:r>
+              <w:rPr>
+                <w:b/>
+              </w:rPr>
+              <w:t>Seeds better</w:t>
+            </w:r>
+          </w:p>
+        </w:tc>
+        <w:tc>
+          <w:tcPr>
+            <w:tcW w:type="dxa" w:w="1814"/>
+          </w:tcPr>
+          <w:p>
+            <w:r>
+              <w:rPr>
+                <w:b/>
+              </w:rPr>
+              <w:t>Macro-F1, answers hidden</w:t>
+            </w:r>
+          </w:p>
+        </w:tc>
+      </w:tr>
+      <w:tr>
+        <w:tc>
+          <w:tcPr>
+            <w:tcW w:type="dxa" w:w="1814"/>
+          </w:tcPr>
+          <w:p>
+            <w:r>
+              <w:t>Photo only</w:t>
+            </w:r>
+          </w:p>
+        </w:tc>
+        <w:tc>
+          <w:tcPr>
+            <w:tcW w:type="dxa" w:w="1814"/>
+          </w:tcPr>
+          <w:p>
+            <w:r>
+              <w:t>0.519 ± 0.040</w:t>
+            </w:r>
+          </w:p>
+        </w:tc>
+        <w:tc>
+          <w:tcPr>
+            <w:tcW w:type="dxa" w:w="1814"/>
+          </w:tcPr>
+          <w:p>
+            <w:r>
+              <w:t>-</w:t>
+            </w:r>
+          </w:p>
+        </w:tc>
+        <w:tc>
+          <w:tcPr>
+            <w:tcW w:type="dxa" w:w="1814"/>
+          </w:tcPr>
+          <w:p>
+            <w:r>
+              <w:t>-</w:t>
+            </w:r>
+          </w:p>
+        </w:tc>
+        <w:tc>
+          <w:tcPr>
+            <w:tcW w:type="dxa" w:w="1814"/>
+          </w:tcPr>
+          <w:p>
+            <w:r>
+              <w:t>-</w:t>
+            </w:r>
+          </w:p>
+        </w:tc>
+      </w:tr>
+      <w:tr>
+        <w:tc>
+          <w:tcPr>
+            <w:tcW w:type="dxa" w:w="1814"/>
+          </w:tcPr>
+          <w:p>
+            <w:r>
+              <w:t>Questionnaire only</w:t>
+            </w:r>
+          </w:p>
+        </w:tc>
+        <w:tc>
+          <w:tcPr>
+            <w:tcW w:type="dxa" w:w="1814"/>
+          </w:tcPr>
+          <w:p>
+            <w:r>
+              <w:t>0.381 ± 0.050</w:t>
+            </w:r>
+          </w:p>
+        </w:tc>
+        <w:tc>
+          <w:tcPr>
+            <w:tcW w:type="dxa" w:w="1814"/>
+          </w:tcPr>
+          <w:p>
+            <w:r>
+              <w:t>-0.138 [-0.173, -0.102]</w:t>
+            </w:r>
+          </w:p>
+        </w:tc>
+        <w:tc>
+          <w:tcPr>
+            <w:tcW w:type="dxa" w:w="1814"/>
+          </w:tcPr>
+          <w:p>
+            <w:r>
+              <w:t>0/10</w:t>
+            </w:r>
+          </w:p>
+        </w:tc>
+        <w:tc>
+          <w:tcPr>
+            <w:tcW w:type="dxa" w:w="1814"/>
+          </w:tcPr>
+          <w:p>
+            <w:r>
+              <w:t>0.138</w:t>
+            </w:r>
+          </w:p>
+        </w:tc>
+      </w:tr>
+      <w:tr>
+        <w:tc>
+          <w:tcPr>
+            <w:tcW w:type="dxa" w:w="1814"/>
+          </w:tcPr>
+          <w:p>
+            <w:r>
+              <w:t>Fusion concat</w:t>
+            </w:r>
+          </w:p>
+        </w:tc>
+        <w:tc>
+          <w:tcPr>
+            <w:tcW w:type="dxa" w:w="1814"/>
+          </w:tcPr>
+          <w:p>
+            <w:r>
+              <w:t>0.514 ± 0.040</w:t>
+            </w:r>
+          </w:p>
+        </w:tc>
+        <w:tc>
+          <w:tcPr>
+            <w:tcW w:type="dxa" w:w="1814"/>
+          </w:tcPr>
+          <w:p>
+            <w:r>
+              <w:t>-0.005 [-0.024, +0.014]</w:t>
+            </w:r>
+          </w:p>
+        </w:tc>
+        <w:tc>
+          <w:tcPr>
+            <w:tcW w:type="dxa" w:w="1814"/>
+          </w:tcPr>
+          <w:p>
+            <w:r>
+              <w:t>6/10</w:t>
+            </w:r>
+          </w:p>
+        </w:tc>
+        <w:tc>
+          <w:tcPr>
+            <w:tcW w:type="dxa" w:w="1814"/>
+          </w:tcPr>
+          <w:p>
+            <w:r>
+              <w:t>0.505</w:t>
+            </w:r>
+          </w:p>
+        </w:tc>
+      </w:tr>
+      <w:tr>
+        <w:tc>
+          <w:tcPr>
+            <w:tcW w:type="dxa" w:w="1814"/>
+          </w:tcPr>
+          <w:p>
+            <w:r>
+              <w:t>Fusion gated</w:t>
+            </w:r>
+          </w:p>
+        </w:tc>
+        <w:tc>
+          <w:tcPr>
+            <w:tcW w:type="dxa" w:w="1814"/>
+          </w:tcPr>
+          <w:p>
+            <w:r>
+              <w:t>0.490 ± 0.041</w:t>
+            </w:r>
+          </w:p>
+        </w:tc>
+        <w:tc>
+          <w:tcPr>
+            <w:tcW w:type="dxa" w:w="1814"/>
+          </w:tcPr>
+          <w:p>
+            <w:r>
+              <w:t>-0.030 [-0.053, -0.007]</w:t>
+            </w:r>
+          </w:p>
+        </w:tc>
+        <w:tc>
+          <w:tcPr>
+            <w:tcW w:type="dxa" w:w="1814"/>
+          </w:tcPr>
+          <w:p>
+            <w:r>
+              <w:t>2/10</w:t>
+            </w:r>
+          </w:p>
+        </w:tc>
+        <w:tc>
+          <w:tcPr>
+            <w:tcW w:type="dxa" w:w="1814"/>
+          </w:tcPr>
+          <w:p>
+            <w:r>
+              <w:t>0.491</w:t>
+            </w:r>
+          </w:p>
+        </w:tc>
+      </w:tr>
+      <w:tr>
+        <w:tc>
+          <w:tcPr>
+            <w:tcW w:type="dxa" w:w="1814"/>
+          </w:tcPr>
+          <w:p>
+            <w:r>
+              <w:t>Fusion FiLM</w:t>
+            </w:r>
+          </w:p>
+        </w:tc>
+        <w:tc>
+          <w:tcPr>
+            <w:tcW w:type="dxa" w:w="1814"/>
+          </w:tcPr>
+          <w:p>
+            <w:r>
+              <w:t>0.519 ± 0.044</w:t>
+            </w:r>
+          </w:p>
+        </w:tc>
+        <w:tc>
+          <w:tcPr>
+            <w:tcW w:type="dxa" w:w="1814"/>
+          </w:tcPr>
+          <w:p>
+            <w:r>
+              <w:t>+0.000 [-0.023, +0.023]</w:t>
+            </w:r>
+          </w:p>
+        </w:tc>
+        <w:tc>
+          <w:tcPr>
+            <w:tcW w:type="dxa" w:w="1814"/>
+          </w:tcPr>
+          <w:p>
+            <w:r>
+              <w:t>5/10</w:t>
+            </w:r>
+          </w:p>
+        </w:tc>
+        <w:tc>
+          <w:tcPr>
+            <w:tcW w:type="dxa" w:w="1814"/>
+          </w:tcPr>
+          <w:p>
+            <w:r>
+              <w:t>0.513</w:t>
+            </w:r>
+          </w:p>
+        </w:tc>
+      </w:tr>
+      <w:tr>
+        <w:tc>
+          <w:tcPr>
+            <w:tcW w:type="dxa" w:w="1814"/>
+          </w:tcPr>
+          <w:p>
+            <w:r>
+              <w:t>Concat, no dropout</w:t>
+            </w:r>
+          </w:p>
+        </w:tc>
+        <w:tc>
+          <w:tcPr>
+            <w:tcW w:type="dxa" w:w="1814"/>
+          </w:tcPr>
+          <w:p>
+            <w:r>
+              <w:t>0.505 ± 0.036</w:t>
+            </w:r>
+          </w:p>
+        </w:tc>
+        <w:tc>
+          <w:tcPr>
+            <w:tcW w:type="dxa" w:w="1814"/>
+          </w:tcPr>
+          <w:p>
+            <w:r>
+              <w:t>-0.014 [-0.035, +0.006]</w:t>
+            </w:r>
+          </w:p>
+        </w:tc>
+        <w:tc>
+          <w:tcPr>
+            <w:tcW w:type="dxa" w:w="1814"/>
+          </w:tcPr>
+          <w:p>
+            <w:r>
+              <w:t>3/10</w:t>
+            </w:r>
+          </w:p>
+        </w:tc>
+        <w:tc>
+          <w:tcPr>
+            <w:tcW w:type="dxa" w:w="1814"/>
+          </w:tcPr>
+          <w:p>
+            <w:r>
+              <w:t>0.504</w:t>
+            </w:r>
+          </w:p>
+        </w:tc>
+      </w:tr>
+      <w:tr>
+        <w:tc>
+          <w:tcPr>
+            <w:tcW w:type="dxa" w:w="1814"/>
+          </w:tcPr>
+          <w:p>
+            <w:r>
+              <w:t>Ensemble photo × questionnaire</w:t>
+            </w:r>
+          </w:p>
+        </w:tc>
+        <w:tc>
+          <w:tcPr>
+            <w:tcW w:type="dxa" w:w="1814"/>
+          </w:tcPr>
+          <w:p>
+            <w:r>
+              <w:t>0.498 ± 0.052</w:t>
+            </w:r>
+          </w:p>
+        </w:tc>
+        <w:tc>
+          <w:tcPr>
+            <w:tcW w:type="dxa" w:w="1814"/>
+          </w:tcPr>
+          <w:p>
+            <w:r>
+              <w:t>-0.021 [-0.047, +0.003]</w:t>
+            </w:r>
+          </w:p>
+        </w:tc>
+        <w:tc>
+          <w:tcPr>
+            <w:tcW w:type="dxa" w:w="1814"/>
+          </w:tcPr>
+          <w:p>
+            <w:r>
+              <w:t>3/10</w:t>
+            </w:r>
+          </w:p>
+        </w:tc>
+        <w:tc>
+          <w:tcPr>
+            <w:tcW w:type="dxa" w:w="1814"/>
+          </w:tcPr>
+          <w:p>
+            <w:r>
+              <w:t>0.496</w:t>
+            </w:r>
+          </w:p>
+        </w:tc>
+      </w:tr>
+    </w:tbl>
+    <w:p>
+      <w:pPr>
+        <w:jc w:val="both"/>
+      </w:pPr>
+      <w:r>
+        <w:t>The group analysis gives the same answer to the question 'for whom?'. No fusion variant significantly improves any tone group (eFST I-II, III-IV, V-VI; eMST 1-3, 4-6, 7-10) or any category after the Holm correction; the only significant effect of fusion is negative: the gated variant lowers macro-F1 on eFST III-IV by 0.073 (Holm p = 0.028). Over the first five seeds, FiLM seemed better on eMST 4-6 (+0.088, in all 5 seeds); this hint was recorded before seeds 5-9 were run and did not replicate (−0.013, better in only one seed of five), so it was noise. The photo-only model is weakest on eMST 4-6 (0.457 ± 0.069, about 72 cases per seed) and on eFST V-VI (0.496 ± 0.140, about 23 cases), and acne remains the hardest category (F1 0.320 ± 0.064). One detail matters for the discussion: the gap between the questionnaire and the photo is smallest precisely on the darker groups (eFST V-VI −0.070, eMST 4-6 −0.050, both not significant, versus −0.12 to −0.20 on the other groups), which suggests that the photo loses part of its advantage on darker skin, but the fusion models do not manage to compensate with the questionnaire. Small groups (eMST 7-10 has 11 cases per seed, redness_rosacea 6) have very wide intervals and do not support conclusions.</w:t>
+      </w:r>
+    </w:p>
+    <w:p>
+      <w:pPr>
         <w:pStyle w:val="Heading1"/>
       </w:pPr>
       <w:r>
@@ -3959,6 +4474,26 @@
       </w:pPr>
       <w:r>
         <w:t>[29] C. Genest, J. V. Zidek, Combining Probability Distributions: A Critique and an Annotated Bibliography, Statistical Science 1(1), 1986. https://doi.org/10.1214/ss/1177013825</w:t>
+      </w:r>
+    </w:p>
+    <w:p>
+      <w:pPr>
+        <w:spacing w:after="120" w:line="276" w:lineRule="auto"/>
+        <w:ind w:left="567" w:hanging="567"/>
+        <w:jc w:val="left"/>
+      </w:pPr>
+      <w:r>
+        <w:t>[30] S. Holm, A Simple Sequentially Rejective Multiple Test Procedure, Scandinavian Journal of Statistics 6(2), 1979. https://www.jstor.org/stable/4615733</w:t>
+      </w:r>
+    </w:p>
+    <w:p>
+      <w:pPr>
+        <w:spacing w:after="120" w:line="276" w:lineRule="auto"/>
+        <w:ind w:left="567" w:hanging="567"/>
+        <w:jc w:val="left"/>
+      </w:pPr>
+      <w:r>
+        <w:t>[31] F. Wilcoxon, Individual Comparisons by Ranking Methods, Biometrics Bulletin 1(6), 1945. https://doi.org/10.2307/3001968</w:t>
       </w:r>
     </w:p>
     <w:sectPr>

</xml_diff>

<commit_message>
feat(ml): add diagnostics explaining why the questionnaire does not help
Add analysis/questionnaire_diagnostics.py, which uses the trained E1 models
without retraining to test three explanations over ten seeds: whether the
answers can be predicted from the photo model's features (AUROC 0.50-0.70,
so they are not redundant), whether the two single-input models fail on the
same cases (they do: errors are positively correlated), and which questions
carry the questionnaire model's signal (mostly body area, then duration,
symptoms and texture). Results go to results/e1/diagnostics/.

Document the analysis in thesis 8.5 and paper 4.5 and correct the earlier
redundancy hypothesis in thesis 8.3 and paper 4.3, which the test refutes.
</commit_message>
<xml_diff>
--- a/docs/Paper_Skin_Concern.docx
+++ b/docs/Paper_Skin_Concern.docx
@@ -3622,7 +3622,7 @@
         <w:jc w:val="both"/>
       </w:pPr>
       <w:r>
-        <w:t>The hidden-questionnaire test confirms the overall picture: with all answers hidden, macro-F1 stays practically the same for concatenation (0.506), gated (0.521) and FiLM fusion (0.518). Only FiLM loses something (0.544 → 0.518), so it is the only variant that uses the questionnaire a little. For the ensemble, the weight chosen on validation gave the questionnaire a role in three seeds, but the gain seen on validation did not carry over to the test set, showing that the validation advantage was noise. The conclusion for RQ1 in this configuration is that on SCIN, with the questionnaire encoded this way, the answers add no measurable information beyond the photo for the four categories, although on their own they carry clear signal (0.390 versus chance). A possible explanation is that part of the questionnaire's information (e.g. body area or lesion texture) is already visible in the photo. The result is limited by the size of the set (about 1,270 training and 270 test cases per seed) and by the five seeds, which can only detect differences of about 0.03-0.04 macro-F1.</w:t>
+        <w:t>The hidden-questionnaire test confirms the overall picture: with all answers hidden, macro-F1 stays practically the same for concatenation (0.506), gated (0.521) and FiLM fusion (0.518). Only FiLM loses something (0.544 → 0.518), so it is the only variant that uses the questionnaire a little. For the ensemble, the weight chosen on validation gave the questionnaire a role in three seeds, but the gain seen on validation did not carry over to the test set, showing that the validation advantage was noise. The conclusion for RQ1 in this configuration is that on SCIN, with the questionnaire encoded this way, the answers add no measurable information beyond the photo for the four categories, although on their own they carry clear signal (0.390 versus chance). A first hypothesis, that the questionnaire's information (e.g. body area or lesion texture) is already visible in the photo, was tested in Section 4.5 and not supported. The result is limited by the size of the set (about 1,270 training and 270 test cases per seed) and by the five seeds, which can only detect differences of about 0.03-0.04 macro-F1.</w:t>
       </w:r>
     </w:p>
     <w:p>
@@ -4142,6 +4142,74 @@
     </w:p>
     <w:p>
       <w:pPr>
+        <w:pStyle w:val="Heading2"/>
+      </w:pPr>
+      <w:r>
+        <w:t>4.5 Why does the questionnaire not help?</w:t>
+      </w:r>
+    </w:p>
+    <w:p>
+      <w:pPr>
+        <w:jc w:val="both"/>
+      </w:pPr>
+      <w:r>
+        <w:t xml:space="preserve">The result is surprising, because in SCIN the dermatologists saw both the photos and the questionnaire answers when they assigned labels, and their confidence increased with the number of available answers [32]. To understand why the models do not benefit from the questionnaire, </w:t>
+      </w:r>
+      <w:r>
+        <w:rPr>
+          <w:rFonts w:ascii="Courier New" w:hAnsi="Courier New" w:eastAsia="Courier New" w:cs="Courier New"/>
+          <w:sz w:val="19"/>
+        </w:rPr>
+        <w:t>ml/analysis/questionnaire_diagnostics.py</w:t>
+      </w:r>
+      <w:r>
+        <w:t xml:space="preserve"> runs three checks on the already trained models (ten seeds, no retraining); results are in </w:t>
+      </w:r>
+      <w:r>
+        <w:rPr>
+          <w:rFonts w:ascii="Courier New" w:hAnsi="Courier New" w:eastAsia="Courier New" w:cs="Courier New"/>
+          <w:sz w:val="19"/>
+        </w:rPr>
+        <w:t>ml/results/e1/diagnostics/</w:t>
+      </w:r>
+      <w:r>
+        <w:t>.</w:t>
+      </w:r>
+    </w:p>
+    <w:p>
+      <w:pPr>
+        <w:jc w:val="both"/>
+      </w:pPr>
+      <w:r>
+        <w:t>(1) Can the photo model 'see' the answers? A logistic regression on the internal features of the network trained on photos predicts each answer, and prediction quality is measured by the AUROC [33] (area under the ROC curve: 0.5 means random guessing, 1 means perfect prediction). Values range from 0.50 to 0.70: body area 0.57-0.69, symptoms 0.51-0.57, texture 0.50-0.55, duration 0.56. SCIN photos are mostly close-ups, so even the body area is hard to see. The questionnaire therefore holds information the photo model lacks; the redundancy hypothesis is not supported.</w:t>
+      </w:r>
+    </w:p>
+    <w:p>
+      <w:pPr>
+        <w:jc w:val="both"/>
+      </w:pPr>
+      <w:r>
+        <w:t>(2) Do the two models fail on the same cases? If errors were independent, the questionnaire-only model would be right on the photo's mistakes as often as overall (48.2%). In fact it is right on only 42.6% of them, versus 52.6% on the cases the photo gets right. Errors are therefore correlated: hard cases are hard for both models, which points to ambiguous images and noisy labels rather than missing information. There would still be room for gain: an 'oracle' that always picks the right model would reach an accuracy of 0.749 versus 0.564 for the photo, but nothing in the inputs tells when to trust the questionnaire; the ensemble, which tried exactly that with a weight chosen on validation, did not succeed.</w:t>
+      </w:r>
+    </w:p>
+    <w:p>
+      <w:pPr>
+        <w:jc w:val="both"/>
+      </w:pPr>
+      <w:r>
+        <w:t>(3) Which questions matter? Hiding one question at a time from the questionnaire-only model, the largest loss comes from body area (macro-F1 drops by 0.125), followed by duration (0.057), symptoms (0.053) and texture (0.043); the self-reported skin type and age hardly matter (0.012 each). Overall the questionnaire's signal is weak (macro-F1 0.381 versus 0.519 for the photo) and concentrated in a single question.</w:t>
+      </w:r>
+    </w:p>
+    <w:p>
+      <w:pPr>
+        <w:jc w:val="both"/>
+      </w:pPr>
+      <w:r>
+        <w:t>The resulting explanation is: the questionnaire carries information that differs from the photo but is weak, and its useful part largely overlaps with the cases the photo already solves. The truly complementary part is small and noisy, and about 1,270 training cases, mostly labelled by a single dermatologist, are not enough for a model to learn reliably when to rely on it. This suggests concrete directions for an app: the body-area and duration questions are the ones worth keeping, and a larger dataset or more reliable labels would be needed to obtain a measurable gain.</w:t>
+      </w:r>
+    </w:p>
+    <w:p>
+      <w:pPr>
         <w:pStyle w:val="Heading1"/>
       </w:pPr>
       <w:r>
@@ -4494,6 +4562,26 @@
       </w:pPr>
       <w:r>
         <w:t>[31] F. Wilcoxon, Individual Comparisons by Ranking Methods, Biometrics Bulletin 1(6), 1945. https://doi.org/10.2307/3001968</w:t>
+      </w:r>
+    </w:p>
+    <w:p>
+      <w:pPr>
+        <w:spacing w:after="120" w:line="276" w:lineRule="auto"/>
+        <w:ind w:left="567" w:hanging="567"/>
+        <w:jc w:val="left"/>
+      </w:pPr>
+      <w:r>
+        <w:t>[32] A. Ward, J. Li, J. Wang et al., Crowdsourcing Dermatology Images with Google Search Ads: Creating a Real-World Skin Condition Dataset, JAMA Network Open 2024. https://arxiv.org/abs/2402.18545</w:t>
+      </w:r>
+    </w:p>
+    <w:p>
+      <w:pPr>
+        <w:spacing w:after="120" w:line="276" w:lineRule="auto"/>
+        <w:ind w:left="567" w:hanging="567"/>
+        <w:jc w:val="left"/>
+      </w:pPr>
+      <w:r>
+        <w:t>[33] T. Fawcett, An introduction to ROC analysis, Pattern Recognition Letters 27(8), 2006. https://doi.org/10.1016/j.patrec.2005.10.010</w:t>
       </w:r>
     </w:p>
     <w:sectPr>

</xml_diff>

<commit_message>
feat(ml): questionnaire-only and fusion models with the E1 comparison (Tasks 3.1-3.3)
Questionnaire-only MLP, late fusion with gated and FiLM variants, E1 runner with paired
bootstrap, ten split seeds with skin-tone and category analysis, diagnostics of why the
questionnaire does not help.
</commit_message>
<xml_diff>
--- a/docs/Paper_Skin_Concern.docx
+++ b/docs/Paper_Skin_Concern.docx
@@ -99,7 +99,7 @@
         <w:rPr>
           <w:highlight w:val="yellow"/>
         </w:rPr>
-        <w:t>[To be written once results are available: background and objective, data and methods, main results, conclusion.]</w:t>
+        <w:t>[Remaining results (photo-only, fusion, E2-E6) to be added as experiments complete.]</w:t>
       </w:r>
     </w:p>
     <w:p>
@@ -2236,7 +2236,27 @@
         <w:jc w:val="both"/>
       </w:pPr>
       <w:r>
-        <w:t>The model combines two branches by late fusion: the branches are processed separately and their information is joined only before the final decision. The image branch is EfficientNet-B0 [6] from the timm library [7] with weights pretrained on ImageNet (transfer learning: the network starts from what it already learned on a large image set and is retrained on SCIN). The questionnaire branch is a small network with one layer of 64 units that receives the 40-feature vector together with the 6-value mask (46 numbers). When the questionnaire is missing entirely, the model receives zero features and an all-ones mask, the same representation as in training, so an absent questionnaire is not confused with one answered with zeros. The outputs of both branches are concatenated and passed to a final layer that scores each of the four categories. A photo-only model, without the questionnaire branch, is trained as a baseline.</w:t>
+        <w:t>The model combines two branches by late fusion: the branches are processed separately and their information is joined only before the final decision (</w:t>
+      </w:r>
+      <w:r>
+        <w:rPr>
+          <w:rFonts w:ascii="Courier New" w:hAnsi="Courier New" w:eastAsia="Courier New" w:cs="Courier New"/>
+          <w:sz w:val="19"/>
+        </w:rPr>
+        <w:t>ml/models/fusion_model.py</w:t>
+      </w:r>
+      <w:r>
+        <w:t xml:space="preserve">, class </w:t>
+      </w:r>
+      <w:r>
+        <w:rPr>
+          <w:rFonts w:ascii="Courier New" w:hAnsi="Courier New" w:eastAsia="Courier New" w:cs="Courier New"/>
+          <w:sz w:val="19"/>
+        </w:rPr>
+        <w:t>LateFusionNet</w:t>
+      </w:r>
+      <w:r>
+        <w:t>). The image branch is the same network as in the photo-only model, EfficientNet-B0 [6] or MobileNetV3-Large, from the timm library [7] with weights pretrained on ImageNet (transfer learning: the network starts from what it already learned on a large image set and is retrained on SCIN), without its classification layer; its output is the feature vector obtained by averaging the activation maps (1,280 values). The questionnaire branch is a network with two layers of 64 units that receives the 40-feature vector together with the 6-value mask (46 numbers). When the questionnaire is missing entirely, the model receives zero features and an all-ones mask, the same representation as in training, so an absent questionnaire is not confused with one answered with zeros. In the basic variant (concat), the two outputs are concatenated and passed to a final layer that scores each of the four categories.</w:t>
       </w:r>
     </w:p>
     <w:p>
@@ -2244,7 +2264,7 @@
         <w:jc w:val="both"/>
       </w:pPr>
       <w:r>
-        <w:t>For robustness to missing answers we use modality dropout: during training, the whole questionnaire is hidden for a sample with probability 0.3, and each field is hidden independently with probability 0.15. A hidden field gets features 0 and mask 1, exactly like a real missing answer, so the model learns to work without the questionnaire. Because the categories are imbalanced (e.g. 44 redness_rosacea cases versus 1,068 eczema_dermatitis), the loss (the error measure that training minimises) is cross-entropy weighted inversely to class frequency. The optimiser is AdamW [8] with learning rate 3e-4 and cosine decay [9], for 15 epochs, with mixed precision on GPU. The checkpoint with the best validation macro-F1 is kept.</w:t>
+        <w:t>For robustness to missing answers we use modality dropout: during training, the whole questionnaire is hidden for a sample with probability 0.3, and each field is hidden independently with probability 0.15. A hidden field gets features 0 and mask 1, exactly like a real missing answer, so the model learns to work without the questionnaire. Because the categories are imbalanced, the loss (the error measure that training minimises) is cross-entropy weighted inversely to class frequency. The fusion model is trained with exactly the same three stages as the photo-only model (described below), with the AdamW optimiser [8], cosine learning-rate decay [9] and mixed precision on GPU, so the questionnaire is the only difference between the two models. The questionnaire branch and the fusion layers are new, so they train in every stage at the classification-layer rate. The checkpoint with the best validation macro-F1 is kept.</w:t>
       </w:r>
     </w:p>
     <w:p>
@@ -2337,6 +2357,72 @@
     </w:p>
     <w:p>
       <w:pPr>
+        <w:jc w:val="both"/>
+      </w:pPr>
+      <w:r>
+        <w:t>The second arm of experiment E1 is the questionnaire-only model (</w:t>
+      </w:r>
+      <w:r>
+        <w:rPr>
+          <w:rFonts w:ascii="Courier New" w:hAnsi="Courier New" w:eastAsia="Courier New" w:cs="Courier New"/>
+          <w:sz w:val="19"/>
+        </w:rPr>
+        <w:t>ml/models/q_model.py</w:t>
+      </w:r>
+      <w:r>
+        <w:t xml:space="preserve">, run by </w:t>
+      </w:r>
+      <w:r>
+        <w:rPr>
+          <w:rFonts w:ascii="Courier New" w:hAnsi="Courier New" w:eastAsia="Courier New" w:cs="Courier New"/>
+          <w:sz w:val="19"/>
+        </w:rPr>
+        <w:t>ml/run_q_only.py</w:t>
+      </w:r>
+      <w:r>
+        <w:t>), which shows how much signal the questionnaire carries on its own, without the photo. It is a multilayer perceptron (MLP) [24]: a network of successive linear layers, each followed by a ReLU activation (which keeps positive values and replaces negative ones with 0) and dropout 0.2 (during training, 20% of the neurons are ignored at random so the network does not memorise the examples). The input is the vector of encoded answers (40 values) next to the missingness mask (6 values, one per question), so the network can tell an answer 'no' from a question that was not answered; it is followed by two hidden layers of 64 neurons and an output layer with four values. The model uses exactly the same cases, splits, seeds, class-weighted loss, early stopping on validation macro-F1 and evaluation protocol as the photo model. The test set is also scored with a share r of the answers hidden (r = 0, 0.25, 0.5, 0.75, 1), and the hidden answers are exactly the same as in the fusion model's evaluation, so the curves can be compared directly.</w:t>
+      </w:r>
+    </w:p>
+    <w:p>
+      <w:pPr>
+        <w:jc w:val="both"/>
+      </w:pPr>
+      <w:r>
+        <w:t>Besides concatenation, two stronger fusion variants are implemented, which let the questionnaire influence how the image is used. (1) Gated fusion (gated multimodal unit) [25]: both branches are projected to the same size (256), and a gate, a vector of values between 0 and 1 computed from both branches, decides for every dimension how much comes from the image and how much from the questionnaire. When the mask shows that answers are missing, the gate can learn to rely on the photo; the mean gate value can be inspected for each case. (2) FiLM-style conditioning (Feature-wise Linear Modulation) [26]: the questionnaire produces two vectors, γ and β, that scale and shift every image feature (f' = f·(1 + γ) + β). γ and β start at 0, so at the start of training the model behaves exactly like the photo-only model. The variant is chosen in the configuration (</w:t>
+      </w:r>
+      <w:r>
+        <w:rPr>
+          <w:rFonts w:ascii="Courier New" w:hAnsi="Courier New" w:eastAsia="Courier New" w:cs="Courier New"/>
+          <w:sz w:val="19"/>
+        </w:rPr>
+        <w:t>fusion.variant</w:t>
+      </w:r>
+      <w:r>
+        <w:t xml:space="preserve">), and the trained models are saved as </w:t>
+      </w:r>
+      <w:r>
+        <w:rPr>
+          <w:rFonts w:ascii="Courier New" w:hAnsi="Courier New" w:eastAsia="Courier New" w:cs="Courier New"/>
+          <w:sz w:val="19"/>
+        </w:rPr>
+        <w:t>fusion_late_&lt;variant&gt;_seed&lt;k&gt;.pt</w:t>
+      </w:r>
+      <w:r>
+        <w:t xml:space="preserve"> by </w:t>
+      </w:r>
+      <w:r>
+        <w:rPr>
+          <w:rFonts w:ascii="Courier New" w:hAnsi="Courier New" w:eastAsia="Courier New" w:cs="Courier New"/>
+          <w:sz w:val="19"/>
+        </w:rPr>
+        <w:t>ml/run_fusion.py</w:t>
+      </w:r>
+      <w:r>
+        <w:t>.</w:t>
+      </w:r>
+    </w:p>
+    <w:p>
+      <w:pPr>
         <w:pStyle w:val="Heading2"/>
       </w:pPr>
       <w:r>
@@ -2407,6 +2493,14 @@
     </w:p>
     <w:p>
       <w:pPr>
+        <w:jc w:val="both"/>
+      </w:pPr>
+      <w:r>
+        <w:t>The ECE confidence interval needs a correction. When cases are resampled with replacement, each confidence bin holds fewer distinct cases, the gap between accuracy and confidence becomes noisier and, being an absolute value, cannot be negative; the ECE of bootstrap samples is therefore larger on average than the ECE of the test set (a bias) [28]. The usual percentile interval is thus shifted upward and, after averaging over five seeds, may not even contain the estimate. For ECE we therefore use the percentile interval shifted by the bootstrap bias (mean of the samples minus the estimate); the other metrics keep the percentile interval.</w:t>
+      </w:r>
+    </w:p>
+    <w:p>
+      <w:pPr>
         <w:pStyle w:val="Heading2"/>
       </w:pPr>
       <w:r>
@@ -2496,6 +2590,1626 @@
     </w:p>
     <w:p>
       <w:pPr>
+        <w:pStyle w:val="Heading2"/>
+      </w:pPr>
+      <w:r>
+        <w:t>4.1 Questionnaire-only baseline (E1, arm 2)</w:t>
+      </w:r>
+    </w:p>
+    <w:p>
+      <w:pPr>
+        <w:jc w:val="both"/>
+      </w:pPr>
+      <w:r>
+        <w:t>Over the five seeds, the questionnaire-only model reaches a test macro-F1 of 0.390 ± 0.038 (mean ± standard deviation), balanced accuracy 0.443 ± 0.043 and ECE 0.083 ± 0.020 (Table 1). Training takes 6-11 seconds per seed, and early stopping selects epochs between 16 and 51. Per category, F1 is 0.569 for eczema_dermatitis, 0.429 for normal_other, 0.343 for redness_rosacea and 0.218 for acne. The redness_rosacea test set has only 6 cases on average, so that value is very uncertain (standard deviation 0.112). The questionnaire thus carries clear signal above chance, but not enough to separate acne, which looks like the other concerns from the answers alone.</w:t>
+      </w:r>
+    </w:p>
+    <w:p>
+      <w:pPr>
+        <w:jc w:val="both"/>
+      </w:pPr>
+      <w:r>
+        <w:t>Table 1. Questionnaire-only model on the test set (5 seeds, mean ± standard deviation) by share of hidden answers.</w:t>
+      </w:r>
+    </w:p>
+    <w:tbl>
+      <w:tblPr>
+        <w:tblStyle w:val="TableGrid"/>
+        <w:tblW w:type="auto" w:w="0"/>
+        <w:tblLook w:firstColumn="1" w:firstRow="1" w:lastColumn="0" w:lastRow="0" w:noHBand="0" w:noVBand="1" w:val="04A0"/>
+      </w:tblPr>
+      <w:tblGrid>
+        <w:gridCol w:w="3024"/>
+        <w:gridCol w:w="3024"/>
+        <w:gridCol w:w="3024"/>
+      </w:tblGrid>
+      <w:tr>
+        <w:tc>
+          <w:tcPr>
+            <w:tcW w:type="dxa" w:w="3024"/>
+          </w:tcPr>
+          <w:p>
+            <w:r>
+              <w:rPr>
+                <w:b/>
+              </w:rPr>
+              <w:t>% answers hidden</w:t>
+            </w:r>
+          </w:p>
+        </w:tc>
+        <w:tc>
+          <w:tcPr>
+            <w:tcW w:type="dxa" w:w="3024"/>
+          </w:tcPr>
+          <w:p>
+            <w:r>
+              <w:rPr>
+                <w:b/>
+              </w:rPr>
+              <w:t>Macro-F1</w:t>
+            </w:r>
+          </w:p>
+        </w:tc>
+        <w:tc>
+          <w:tcPr>
+            <w:tcW w:type="dxa" w:w="3024"/>
+          </w:tcPr>
+          <w:p>
+            <w:r>
+              <w:rPr>
+                <w:b/>
+              </w:rPr>
+              <w:t>Balanced accuracy</w:t>
+            </w:r>
+          </w:p>
+        </w:tc>
+      </w:tr>
+      <w:tr>
+        <w:tc>
+          <w:tcPr>
+            <w:tcW w:type="dxa" w:w="3024"/>
+          </w:tcPr>
+          <w:p>
+            <w:r>
+              <w:t>0 (natural)</w:t>
+            </w:r>
+          </w:p>
+        </w:tc>
+        <w:tc>
+          <w:tcPr>
+            <w:tcW w:type="dxa" w:w="3024"/>
+          </w:tcPr>
+          <w:p>
+            <w:r>
+              <w:t>0.390 ± 0.038</w:t>
+            </w:r>
+          </w:p>
+        </w:tc>
+        <w:tc>
+          <w:tcPr>
+            <w:tcW w:type="dxa" w:w="3024"/>
+          </w:tcPr>
+          <w:p>
+            <w:r>
+              <w:t>0.443 ± 0.043</w:t>
+            </w:r>
+          </w:p>
+        </w:tc>
+      </w:tr>
+      <w:tr>
+        <w:tc>
+          <w:tcPr>
+            <w:tcW w:type="dxa" w:w="3024"/>
+          </w:tcPr>
+          <w:p>
+            <w:r>
+              <w:t>25</w:t>
+            </w:r>
+          </w:p>
+        </w:tc>
+        <w:tc>
+          <w:tcPr>
+            <w:tcW w:type="dxa" w:w="3024"/>
+          </w:tcPr>
+          <w:p>
+            <w:r>
+              <w:t>0.325 ± 0.038</w:t>
+            </w:r>
+          </w:p>
+        </w:tc>
+        <w:tc>
+          <w:tcPr>
+            <w:tcW w:type="dxa" w:w="3024"/>
+          </w:tcPr>
+          <w:p>
+            <w:r>
+              <w:t>-</w:t>
+            </w:r>
+          </w:p>
+        </w:tc>
+      </w:tr>
+      <w:tr>
+        <w:tc>
+          <w:tcPr>
+            <w:tcW w:type="dxa" w:w="3024"/>
+          </w:tcPr>
+          <w:p>
+            <w:r>
+              <w:t>50</w:t>
+            </w:r>
+          </w:p>
+        </w:tc>
+        <w:tc>
+          <w:tcPr>
+            <w:tcW w:type="dxa" w:w="3024"/>
+          </w:tcPr>
+          <w:p>
+            <w:r>
+              <w:t>0.264 ± 0.047</w:t>
+            </w:r>
+          </w:p>
+        </w:tc>
+        <w:tc>
+          <w:tcPr>
+            <w:tcW w:type="dxa" w:w="3024"/>
+          </w:tcPr>
+          <w:p>
+            <w:r>
+              <w:t>-</w:t>
+            </w:r>
+          </w:p>
+        </w:tc>
+      </w:tr>
+      <w:tr>
+        <w:tc>
+          <w:tcPr>
+            <w:tcW w:type="dxa" w:w="3024"/>
+          </w:tcPr>
+          <w:p>
+            <w:r>
+              <w:t>75</w:t>
+            </w:r>
+          </w:p>
+        </w:tc>
+        <w:tc>
+          <w:tcPr>
+            <w:tcW w:type="dxa" w:w="3024"/>
+          </w:tcPr>
+          <w:p>
+            <w:r>
+              <w:t>0.221 ± 0.037</w:t>
+            </w:r>
+          </w:p>
+        </w:tc>
+        <w:tc>
+          <w:tcPr>
+            <w:tcW w:type="dxa" w:w="3024"/>
+          </w:tcPr>
+          <w:p>
+            <w:r>
+              <w:t>-</w:t>
+            </w:r>
+          </w:p>
+        </w:tc>
+      </w:tr>
+      <w:tr>
+        <w:tc>
+          <w:tcPr>
+            <w:tcW w:type="dxa" w:w="3024"/>
+          </w:tcPr>
+          <w:p>
+            <w:r>
+              <w:t>100</w:t>
+            </w:r>
+          </w:p>
+        </w:tc>
+        <w:tc>
+          <w:tcPr>
+            <w:tcW w:type="dxa" w:w="3024"/>
+          </w:tcPr>
+          <w:p>
+            <w:r>
+              <w:t>0.145 ± 0.037</w:t>
+            </w:r>
+          </w:p>
+        </w:tc>
+        <w:tc>
+          <w:tcPr>
+            <w:tcW w:type="dxa" w:w="3024"/>
+          </w:tcPr>
+          <w:p>
+            <w:r>
+              <w:t>0.250 ± 0.000</w:t>
+            </w:r>
+          </w:p>
+        </w:tc>
+      </w:tr>
+    </w:tbl>
+    <w:p>
+      <w:pPr>
+        <w:jc w:val="both"/>
+      </w:pPr>
+      <w:r>
+        <w:t>When answers are hidden, performance falls steadily: macro-F1 0.390 with the natural answers, 0.325 with 25% hidden, 0.264 with 50%, 0.221 with 75% and 0.145 with all hidden. With no answers at all, the model gives every case the same category (normal_other for seed 0) and balanced accuracy is exactly 0.250, the chance level for four categories. This confirms that the missingness mask works as designed: an empty questionnaire adds no false information.</w:t>
+      </w:r>
+    </w:p>
+    <w:p>
+      <w:pPr>
+        <w:jc w:val="both"/>
+      </w:pPr>
+      <w:r>
+        <w:t>By skin tone (eFST), macro-F1 is 0.401 ± 0.045 for I-II (117 cases on average), 0.342 ± 0.100 for III-IV (120 cases) and 0.475 ± 0.131 for V-VI (23 cases). The worst group is III-IV in three seeds and I-II in two, with a mean macro-F1 of 0.319 ± 0.067. The higher value for V-VI should not be read as an advantage: the group has just over 20 cases, and the spread across seeds (0.131) is larger than the differences between groups. These values are the lower reference against which the photo-only and fusion models will be compared (RQ1).</w:t>
+      </w:r>
+    </w:p>
+    <w:p>
+      <w:pPr>
+        <w:pStyle w:val="Heading2"/>
+      </w:pPr>
+      <w:r>
+        <w:t>4.2 Photo, fusion and questionnaire: first comparison (E1)</w:t>
+      </w:r>
+    </w:p>
+    <w:p>
+      <w:pPr>
+        <w:jc w:val="both"/>
+      </w:pPr>
+      <w:r>
+        <w:t>The first complete E1 comparison uses EfficientNet-B0, the class-weighted loss and the same five seeds for all three arms (Table 2). The photo-only model reaches a macro-F1 of 0.537 ± 0.038, the concatenation fusion model 0.516 ± 0.057 and the questionnaire-only model 0.390 ± 0.038. To compare two models on the same seeds we use a paired test: for each seed the difference between the two models is computed, and the test checks whether the mean difference differs from 0. The fusion minus photo difference is −0.021 ± 0.031, and the paired t-test [27] gives p = 0.20 (the Wilcoxon signed-rank test, which does not assume a normal distribution, gives p = 0.31). The p-value is the probability of a difference at least this large if the models were in fact equally good; a value above 0.05 means the difference is not statistically significant. With only five seeds the test has little power, so the result shows that in this configuration the questionnaire does not improve classification, not that it harms it.</w:t>
+      </w:r>
+    </w:p>
+    <w:p>
+      <w:pPr>
+        <w:jc w:val="both"/>
+      </w:pPr>
+      <w:r>
+        <w:t>Table 2. Test results of the three E1 arms (mean ± standard deviation over 5 seeds, all answers available).</w:t>
+      </w:r>
+    </w:p>
+    <w:tbl>
+      <w:tblPr>
+        <w:tblStyle w:val="TableGrid"/>
+        <w:tblW w:type="auto" w:w="0"/>
+        <w:tblLook w:firstColumn="1" w:firstRow="1" w:lastColumn="0" w:lastRow="0" w:noHBand="0" w:noVBand="1" w:val="04A0"/>
+      </w:tblPr>
+      <w:tblGrid>
+        <w:gridCol w:w="1814"/>
+        <w:gridCol w:w="1814"/>
+        <w:gridCol w:w="1814"/>
+        <w:gridCol w:w="1814"/>
+        <w:gridCol w:w="1814"/>
+      </w:tblGrid>
+      <w:tr>
+        <w:tc>
+          <w:tcPr>
+            <w:tcW w:type="dxa" w:w="1814"/>
+          </w:tcPr>
+          <w:p>
+            <w:r>
+              <w:rPr>
+                <w:b/>
+              </w:rPr>
+              <w:t>Model (EfficientNet-B0, 5 seeds)</w:t>
+            </w:r>
+          </w:p>
+        </w:tc>
+        <w:tc>
+          <w:tcPr>
+            <w:tcW w:type="dxa" w:w="1814"/>
+          </w:tcPr>
+          <w:p>
+            <w:r>
+              <w:rPr>
+                <w:b/>
+              </w:rPr>
+              <w:t>Macro-F1</w:t>
+            </w:r>
+          </w:p>
+        </w:tc>
+        <w:tc>
+          <w:tcPr>
+            <w:tcW w:type="dxa" w:w="1814"/>
+          </w:tcPr>
+          <w:p>
+            <w:r>
+              <w:rPr>
+                <w:b/>
+              </w:rPr>
+              <w:t>Balanced accuracy</w:t>
+            </w:r>
+          </w:p>
+        </w:tc>
+        <w:tc>
+          <w:tcPr>
+            <w:tcW w:type="dxa" w:w="1814"/>
+          </w:tcPr>
+          <w:p>
+            <w:r>
+              <w:rPr>
+                <w:b/>
+              </w:rPr>
+              <w:t>ECE</w:t>
+            </w:r>
+          </w:p>
+        </w:tc>
+        <w:tc>
+          <w:tcPr>
+            <w:tcW w:type="dxa" w:w="1814"/>
+          </w:tcPr>
+          <w:p>
+            <w:r>
+              <w:rPr>
+                <w:b/>
+              </w:rPr>
+              <w:t>eFST V-VI macro-F1</w:t>
+            </w:r>
+          </w:p>
+        </w:tc>
+      </w:tr>
+      <w:tr>
+        <w:tc>
+          <w:tcPr>
+            <w:tcW w:type="dxa" w:w="1814"/>
+          </w:tcPr>
+          <w:p>
+            <w:r>
+              <w:t>Photo only</w:t>
+            </w:r>
+          </w:p>
+        </w:tc>
+        <w:tc>
+          <w:tcPr>
+            <w:tcW w:type="dxa" w:w="1814"/>
+          </w:tcPr>
+          <w:p>
+            <w:r>
+              <w:t>0.537 ± 0.038</w:t>
+            </w:r>
+          </w:p>
+        </w:tc>
+        <w:tc>
+          <w:tcPr>
+            <w:tcW w:type="dxa" w:w="1814"/>
+          </w:tcPr>
+          <w:p>
+            <w:r>
+              <w:t>0.624 ± 0.044</w:t>
+            </w:r>
+          </w:p>
+        </w:tc>
+        <w:tc>
+          <w:tcPr>
+            <w:tcW w:type="dxa" w:w="1814"/>
+          </w:tcPr>
+          <w:p>
+            <w:r>
+              <w:t>0.070 ± 0.012</w:t>
+            </w:r>
+          </w:p>
+        </w:tc>
+        <w:tc>
+          <w:tcPr>
+            <w:tcW w:type="dxa" w:w="1814"/>
+          </w:tcPr>
+          <w:p>
+            <w:r>
+              <w:t>0.490 ± 0.175</w:t>
+            </w:r>
+          </w:p>
+        </w:tc>
+      </w:tr>
+      <w:tr>
+        <w:tc>
+          <w:tcPr>
+            <w:tcW w:type="dxa" w:w="1814"/>
+          </w:tcPr>
+          <w:p>
+            <w:r>
+              <w:t>Fusion (concat)</w:t>
+            </w:r>
+          </w:p>
+        </w:tc>
+        <w:tc>
+          <w:tcPr>
+            <w:tcW w:type="dxa" w:w="1814"/>
+          </w:tcPr>
+          <w:p>
+            <w:r>
+              <w:t>0.516 ± 0.057</w:t>
+            </w:r>
+          </w:p>
+        </w:tc>
+        <w:tc>
+          <w:tcPr>
+            <w:tcW w:type="dxa" w:w="1814"/>
+          </w:tcPr>
+          <w:p>
+            <w:r>
+              <w:t>0.595 ± 0.038</w:t>
+            </w:r>
+          </w:p>
+        </w:tc>
+        <w:tc>
+          <w:tcPr>
+            <w:tcW w:type="dxa" w:w="1814"/>
+          </w:tcPr>
+          <w:p>
+            <w:r>
+              <w:t>0.088 ± 0.056</w:t>
+            </w:r>
+          </w:p>
+        </w:tc>
+        <w:tc>
+          <w:tcPr>
+            <w:tcW w:type="dxa" w:w="1814"/>
+          </w:tcPr>
+          <w:p>
+            <w:r>
+              <w:t>0.445 ± 0.085</w:t>
+            </w:r>
+          </w:p>
+        </w:tc>
+      </w:tr>
+      <w:tr>
+        <w:tc>
+          <w:tcPr>
+            <w:tcW w:type="dxa" w:w="1814"/>
+          </w:tcPr>
+          <w:p>
+            <w:r>
+              <w:t>Questionnaire only</w:t>
+            </w:r>
+          </w:p>
+        </w:tc>
+        <w:tc>
+          <w:tcPr>
+            <w:tcW w:type="dxa" w:w="1814"/>
+          </w:tcPr>
+          <w:p>
+            <w:r>
+              <w:t>0.390 ± 0.038</w:t>
+            </w:r>
+          </w:p>
+        </w:tc>
+        <w:tc>
+          <w:tcPr>
+            <w:tcW w:type="dxa" w:w="1814"/>
+          </w:tcPr>
+          <w:p>
+            <w:r>
+              <w:t>0.443 ± 0.043</w:t>
+            </w:r>
+          </w:p>
+        </w:tc>
+        <w:tc>
+          <w:tcPr>
+            <w:tcW w:type="dxa" w:w="1814"/>
+          </w:tcPr>
+          <w:p>
+            <w:r>
+              <w:t>0.083 ± 0.020</w:t>
+            </w:r>
+          </w:p>
+        </w:tc>
+        <w:tc>
+          <w:tcPr>
+            <w:tcW w:type="dxa" w:w="1814"/>
+          </w:tcPr>
+          <w:p>
+            <w:r>
+              <w:t>0.475 ± 0.131</w:t>
+            </w:r>
+          </w:p>
+        </w:tc>
+      </w:tr>
+    </w:tbl>
+    <w:p>
+      <w:pPr>
+        <w:jc w:val="both"/>
+      </w:pPr>
+      <w:r>
+        <w:t>Two observations may explain the result (hypotheses not yet tested). First, the fusion model hardly uses the questionnaire: macro-F1 stays between 0.506 and 0.518 whether 0%, 25%, 50%, 75% or 100% of the answers are hidden, although the questionnaire alone carries signal (0.390). The image branch (1,280 features) dominates the questionnaire branch (64 features) in the concatenation layer, and hiding the questionnaire in 30% of training samples reduces its contribution further. Second, for three of the five seeds the selected fusion checkpoint comes from stage 1, within the first three epochs, so the network did not benefit from fine-tuning the upper layers; validation macro-F1, computed on about 270 cases, varies a lot from epoch to epoch, so selection on validation is noisy. By skin tone, both models are weakest on eFST V-VI (photo 0.490 ± 0.175, fusion 0.445 ± 0.085, about 23 cases), with V-VI the worst group in three seeds for the photo model. The next steps are the gated and FiLM fusion variants, which can give the questionnaire more influence, and training without modality dropout (E2), to separate the effect of the architecture from that of hiding answers.</w:t>
+      </w:r>
+    </w:p>
+    <w:p>
+      <w:pPr>
+        <w:pStyle w:val="Heading2"/>
+      </w:pPr>
+      <w:r>
+        <w:t>4.3 Fusion variants and ensemble: does the questionnaire add information?</w:t>
+      </w:r>
+    </w:p>
+    <w:p>
+      <w:pPr>
+        <w:jc w:val="both"/>
+      </w:pPr>
+      <w:r>
+        <w:t xml:space="preserve">To find out whether the previous result depends on the fusion architecture, </w:t>
+      </w:r>
+      <w:r>
+        <w:rPr>
+          <w:rFonts w:ascii="Courier New" w:hAnsi="Courier New" w:eastAsia="Courier New" w:cs="Courier New"/>
+          <w:sz w:val="19"/>
+        </w:rPr>
+        <w:t>ml/run_e1.py</w:t>
+      </w:r>
+      <w:r>
+        <w:t xml:space="preserve"> trains three more variants on the same five seeds: gated fusion, FiLM fusion and concatenation fusion without modality dropout. We also add an ensemble of the two separately trained models: the probabilities of the photo-only and the questionnaire-only model are combined by a weighted geometric mean (log-linear pooling) [29], p ∝ p_photo^w · p_questionnaire^(1−w), with the weight w chosen on the validation set from 0, 0.1, ..., 1, without retraining. If the ensemble beat the photo-only model, the questionnaire would hold information the photo lacks but the jointly trained models fail to use. All models are tested on exactly the same cases, and differences are computed pairwise on those cases with seed-stratified bootstrap confidence intervals (cases are resampled within each seed's test set and the difference is averaged over seeds). Results are in Table 3 and in </w:t>
+      </w:r>
+      <w:r>
+        <w:rPr>
+          <w:rFonts w:ascii="Courier New" w:hAnsi="Courier New" w:eastAsia="Courier New" w:cs="Courier New"/>
+          <w:sz w:val="19"/>
+        </w:rPr>
+        <w:t>ml/results/e1/e1_summary.csv</w:t>
+      </w:r>
+      <w:r>
+        <w:t xml:space="preserve"> and </w:t>
+      </w:r>
+      <w:r>
+        <w:rPr>
+          <w:rFonts w:ascii="Courier New" w:hAnsi="Courier New" w:eastAsia="Courier New" w:cs="Courier New"/>
+          <w:sz w:val="19"/>
+        </w:rPr>
+        <w:t>e1_table.md</w:t>
+      </w:r>
+      <w:r>
+        <w:t>.</w:t>
+      </w:r>
+    </w:p>
+    <w:p>
+      <w:pPr>
+        <w:jc w:val="both"/>
+      </w:pPr>
+      <w:r>
+        <w:t>Table 3. All E1 arms on the test set (EfficientNet-B0, weighted loss, 5 seeds; mean ± standard deviation, seed-stratified bootstrap confidence interval; paired differences on the same cases).</w:t>
+      </w:r>
+    </w:p>
+    <w:tbl>
+      <w:tblPr>
+        <w:tblStyle w:val="TableGrid"/>
+        <w:tblW w:type="auto" w:w="0"/>
+        <w:tblLook w:firstColumn="1" w:firstRow="1" w:lastColumn="0" w:lastRow="0" w:noHBand="0" w:noVBand="1" w:val="04A0"/>
+      </w:tblPr>
+      <w:tblGrid>
+        <w:gridCol w:w="1814"/>
+        <w:gridCol w:w="1814"/>
+        <w:gridCol w:w="1814"/>
+        <w:gridCol w:w="1814"/>
+        <w:gridCol w:w="1814"/>
+      </w:tblGrid>
+      <w:tr>
+        <w:tc>
+          <w:tcPr>
+            <w:tcW w:type="dxa" w:w="1814"/>
+          </w:tcPr>
+          <w:p>
+            <w:r>
+              <w:rPr>
+                <w:b/>
+              </w:rPr>
+              <w:t>Model</w:t>
+            </w:r>
+          </w:p>
+        </w:tc>
+        <w:tc>
+          <w:tcPr>
+            <w:tcW w:type="dxa" w:w="1814"/>
+          </w:tcPr>
+          <w:p>
+            <w:r>
+              <w:rPr>
+                <w:b/>
+              </w:rPr>
+              <w:t>Macro-F1</w:t>
+            </w:r>
+          </w:p>
+        </w:tc>
+        <w:tc>
+          <w:tcPr>
+            <w:tcW w:type="dxa" w:w="1814"/>
+          </w:tcPr>
+          <w:p>
+            <w:r>
+              <w:rPr>
+                <w:b/>
+              </w:rPr>
+              <w:t>95% CI</w:t>
+            </w:r>
+          </w:p>
+        </w:tc>
+        <w:tc>
+          <w:tcPr>
+            <w:tcW w:type="dxa" w:w="1814"/>
+          </w:tcPr>
+          <w:p>
+            <w:r>
+              <w:rPr>
+                <w:b/>
+              </w:rPr>
+              <w:t>Difference vs photo [95% CI]</w:t>
+            </w:r>
+          </w:p>
+        </w:tc>
+        <w:tc>
+          <w:tcPr>
+            <w:tcW w:type="dxa" w:w="1814"/>
+          </w:tcPr>
+          <w:p>
+            <w:r>
+              <w:rPr>
+                <w:b/>
+              </w:rPr>
+              <w:t>Macro-F1, answers hidden</w:t>
+            </w:r>
+          </w:p>
+        </w:tc>
+      </w:tr>
+      <w:tr>
+        <w:tc>
+          <w:tcPr>
+            <w:tcW w:type="dxa" w:w="1814"/>
+          </w:tcPr>
+          <w:p>
+            <w:r>
+              <w:t>Photo only</w:t>
+            </w:r>
+          </w:p>
+        </w:tc>
+        <w:tc>
+          <w:tcPr>
+            <w:tcW w:type="dxa" w:w="1814"/>
+          </w:tcPr>
+          <w:p>
+            <w:r>
+              <w:t>0.537 ± 0.038</w:t>
+            </w:r>
+          </w:p>
+        </w:tc>
+        <w:tc>
+          <w:tcPr>
+            <w:tcW w:type="dxa" w:w="1814"/>
+          </w:tcPr>
+          <w:p>
+            <w:r>
+              <w:t>[0.493, 0.572]</w:t>
+            </w:r>
+          </w:p>
+        </w:tc>
+        <w:tc>
+          <w:tcPr>
+            <w:tcW w:type="dxa" w:w="1814"/>
+          </w:tcPr>
+          <w:p>
+            <w:r>
+              <w:t>-</w:t>
+            </w:r>
+          </w:p>
+        </w:tc>
+        <w:tc>
+          <w:tcPr>
+            <w:tcW w:type="dxa" w:w="1814"/>
+          </w:tcPr>
+          <w:p>
+            <w:r>
+              <w:t>-</w:t>
+            </w:r>
+          </w:p>
+        </w:tc>
+      </w:tr>
+      <w:tr>
+        <w:tc>
+          <w:tcPr>
+            <w:tcW w:type="dxa" w:w="1814"/>
+          </w:tcPr>
+          <w:p>
+            <w:r>
+              <w:t>Questionnaire only</w:t>
+            </w:r>
+          </w:p>
+        </w:tc>
+        <w:tc>
+          <w:tcPr>
+            <w:tcW w:type="dxa" w:w="1814"/>
+          </w:tcPr>
+          <w:p>
+            <w:r>
+              <w:t>0.390 ± 0.038</w:t>
+            </w:r>
+          </w:p>
+        </w:tc>
+        <w:tc>
+          <w:tcPr>
+            <w:tcW w:type="dxa" w:w="1814"/>
+          </w:tcPr>
+          <w:p>
+            <w:r>
+              <w:t>[0.344, 0.428]</w:t>
+            </w:r>
+          </w:p>
+        </w:tc>
+        <w:tc>
+          <w:tcPr>
+            <w:tcW w:type="dxa" w:w="1814"/>
+          </w:tcPr>
+          <w:p>
+            <w:r>
+              <w:t>-0.147 [-0.199, -0.096]</w:t>
+            </w:r>
+          </w:p>
+        </w:tc>
+        <w:tc>
+          <w:tcPr>
+            <w:tcW w:type="dxa" w:w="1814"/>
+          </w:tcPr>
+          <w:p>
+            <w:r>
+              <w:t>0.145</w:t>
+            </w:r>
+          </w:p>
+        </w:tc>
+      </w:tr>
+      <w:tr>
+        <w:tc>
+          <w:tcPr>
+            <w:tcW w:type="dxa" w:w="1814"/>
+          </w:tcPr>
+          <w:p>
+            <w:r>
+              <w:t>Fusion concat</w:t>
+            </w:r>
+          </w:p>
+        </w:tc>
+        <w:tc>
+          <w:tcPr>
+            <w:tcW w:type="dxa" w:w="1814"/>
+          </w:tcPr>
+          <w:p>
+            <w:r>
+              <w:t>0.516 ± 0.057</w:t>
+            </w:r>
+          </w:p>
+        </w:tc>
+        <w:tc>
+          <w:tcPr>
+            <w:tcW w:type="dxa" w:w="1814"/>
+          </w:tcPr>
+          <w:p>
+            <w:r>
+              <w:t>[0.468, 0.551]</w:t>
+            </w:r>
+          </w:p>
+        </w:tc>
+        <w:tc>
+          <w:tcPr>
+            <w:tcW w:type="dxa" w:w="1814"/>
+          </w:tcPr>
+          <w:p>
+            <w:r>
+              <w:t>-0.021 [-0.051, +0.007]</w:t>
+            </w:r>
+          </w:p>
+        </w:tc>
+        <w:tc>
+          <w:tcPr>
+            <w:tcW w:type="dxa" w:w="1814"/>
+          </w:tcPr>
+          <w:p>
+            <w:r>
+              <w:t>0.506</w:t>
+            </w:r>
+          </w:p>
+        </w:tc>
+      </w:tr>
+      <w:tr>
+        <w:tc>
+          <w:tcPr>
+            <w:tcW w:type="dxa" w:w="1814"/>
+          </w:tcPr>
+          <w:p>
+            <w:r>
+              <w:t>Fusion gated</w:t>
+            </w:r>
+          </w:p>
+        </w:tc>
+        <w:tc>
+          <w:tcPr>
+            <w:tcW w:type="dxa" w:w="1814"/>
+          </w:tcPr>
+          <w:p>
+            <w:r>
+              <w:t>0.514 ± 0.040</w:t>
+            </w:r>
+          </w:p>
+        </w:tc>
+        <w:tc>
+          <w:tcPr>
+            <w:tcW w:type="dxa" w:w="1814"/>
+          </w:tcPr>
+          <w:p>
+            <w:r>
+              <w:t>[0.464, 0.550]</w:t>
+            </w:r>
+          </w:p>
+        </w:tc>
+        <w:tc>
+          <w:tcPr>
+            <w:tcW w:type="dxa" w:w="1814"/>
+          </w:tcPr>
+          <w:p>
+            <w:r>
+              <w:t>-0.023 [-0.060, +0.011]</w:t>
+            </w:r>
+          </w:p>
+        </w:tc>
+        <w:tc>
+          <w:tcPr>
+            <w:tcW w:type="dxa" w:w="1814"/>
+          </w:tcPr>
+          <w:p>
+            <w:r>
+              <w:t>0.521</w:t>
+            </w:r>
+          </w:p>
+        </w:tc>
+      </w:tr>
+      <w:tr>
+        <w:tc>
+          <w:tcPr>
+            <w:tcW w:type="dxa" w:w="1814"/>
+          </w:tcPr>
+          <w:p>
+            <w:r>
+              <w:t>Fusion FiLM</w:t>
+            </w:r>
+          </w:p>
+        </w:tc>
+        <w:tc>
+          <w:tcPr>
+            <w:tcW w:type="dxa" w:w="1814"/>
+          </w:tcPr>
+          <w:p>
+            <w:r>
+              <w:t>0.544 ± 0.043</w:t>
+            </w:r>
+          </w:p>
+        </w:tc>
+        <w:tc>
+          <w:tcPr>
+            <w:tcW w:type="dxa" w:w="1814"/>
+          </w:tcPr>
+          <w:p>
+            <w:r>
+              <w:t>[0.497, 0.579]</w:t>
+            </w:r>
+          </w:p>
+        </w:tc>
+        <w:tc>
+          <w:tcPr>
+            <w:tcW w:type="dxa" w:w="1814"/>
+          </w:tcPr>
+          <w:p>
+            <w:r>
+              <w:t>+0.008 [-0.023, +0.038]</w:t>
+            </w:r>
+          </w:p>
+        </w:tc>
+        <w:tc>
+          <w:tcPr>
+            <w:tcW w:type="dxa" w:w="1814"/>
+          </w:tcPr>
+          <w:p>
+            <w:r>
+              <w:t>0.518</w:t>
+            </w:r>
+          </w:p>
+        </w:tc>
+      </w:tr>
+      <w:tr>
+        <w:tc>
+          <w:tcPr>
+            <w:tcW w:type="dxa" w:w="1814"/>
+          </w:tcPr>
+          <w:p>
+            <w:r>
+              <w:t>Concat, no dropout</w:t>
+            </w:r>
+          </w:p>
+        </w:tc>
+        <w:tc>
+          <w:tcPr>
+            <w:tcW w:type="dxa" w:w="1814"/>
+          </w:tcPr>
+          <w:p>
+            <w:r>
+              <w:t>0.503 ± 0.046</w:t>
+            </w:r>
+          </w:p>
+        </w:tc>
+        <w:tc>
+          <w:tcPr>
+            <w:tcW w:type="dxa" w:w="1814"/>
+          </w:tcPr>
+          <w:p>
+            <w:r>
+              <w:t>[0.456, 0.538]</w:t>
+            </w:r>
+          </w:p>
+        </w:tc>
+        <w:tc>
+          <w:tcPr>
+            <w:tcW w:type="dxa" w:w="1814"/>
+          </w:tcPr>
+          <w:p>
+            <w:r>
+              <w:t>-0.033 [-0.067, -0.002]</w:t>
+            </w:r>
+          </w:p>
+        </w:tc>
+        <w:tc>
+          <w:tcPr>
+            <w:tcW w:type="dxa" w:w="1814"/>
+          </w:tcPr>
+          <w:p>
+            <w:r>
+              <w:t>0.495</w:t>
+            </w:r>
+          </w:p>
+        </w:tc>
+      </w:tr>
+      <w:tr>
+        <w:tc>
+          <w:tcPr>
+            <w:tcW w:type="dxa" w:w="1814"/>
+          </w:tcPr>
+          <w:p>
+            <w:r>
+              <w:t>Ensemble photo × questionnaire</w:t>
+            </w:r>
+          </w:p>
+        </w:tc>
+        <w:tc>
+          <w:tcPr>
+            <w:tcW w:type="dxa" w:w="1814"/>
+          </w:tcPr>
+          <w:p>
+            <w:r>
+              <w:t>0.521 ± 0.035</w:t>
+            </w:r>
+          </w:p>
+        </w:tc>
+        <w:tc>
+          <w:tcPr>
+            <w:tcW w:type="dxa" w:w="1814"/>
+          </w:tcPr>
+          <w:p>
+            <w:r>
+              <w:t>[0.470, 0.556]</w:t>
+            </w:r>
+          </w:p>
+        </w:tc>
+        <w:tc>
+          <w:tcPr>
+            <w:tcW w:type="dxa" w:w="1814"/>
+          </w:tcPr>
+          <w:p>
+            <w:r>
+              <w:t>-0.016 [-0.053, +0.018]</w:t>
+            </w:r>
+          </w:p>
+        </w:tc>
+        <w:tc>
+          <w:tcPr>
+            <w:tcW w:type="dxa" w:w="1814"/>
+          </w:tcPr>
+          <w:p>
+            <w:r>
+              <w:t>0.549</w:t>
+            </w:r>
+          </w:p>
+        </w:tc>
+      </w:tr>
+    </w:tbl>
+    <w:p>
+      <w:pPr>
+        <w:jc w:val="both"/>
+      </w:pPr>
+      <w:r>
+        <w:t>None of the variants is significantly better than the photo-only model (macro-F1 0.537 ± 0.038). FiLM fusion scores best, 0.544 ± 0.043, but its difference from the photo model is +0.008 (95% CI −0.023 to +0.038; better in 3 of 5 seeds). Gated fusion reaches 0.514 ± 0.040 (−0.023 [−0.060, +0.011]) and the ensemble 0.521 ± 0.035 (−0.016 [−0.053, +0.018]). Concatenation fusion without modality dropout is the only variant significantly worse than the photo: 0.503 ± 0.046, difference −0.033 [−0.067, −0.002], worse in all 5 seeds. The hypothesis that hiding answers during training prevented the use of the questionnaire is therefore not supported: without it the result is even worse.</w:t>
+      </w:r>
+    </w:p>
+    <w:p>
+      <w:pPr>
+        <w:jc w:val="both"/>
+      </w:pPr>
+      <w:r>
+        <w:t>The hidden-questionnaire test confirms the overall picture: with all answers hidden, macro-F1 stays practically the same for concatenation (0.506), gated (0.521) and FiLM fusion (0.518). Only FiLM loses something (0.544 → 0.518), so it is the only variant that uses the questionnaire a little. For the ensemble, the weight chosen on validation gave the questionnaire a role in three seeds, but the gain seen on validation did not carry over to the test set, showing that the validation advantage was noise. The conclusion for RQ1 in this configuration is that on SCIN, with the questionnaire encoded this way, the answers add no measurable information beyond the photo for the four categories, although on their own they carry clear signal (0.390 versus chance). A first hypothesis, that the questionnaire's information (e.g. body area or lesion texture) is already visible in the photo, was tested in Section 4.5 and not supported. The result is limited by the size of the set (about 1,270 training and 270 test cases per seed) and by the five seeds, which can only detect differences of about 0.03-0.04 macro-F1.</w:t>
+      </w:r>
+    </w:p>
+    <w:p>
+      <w:pPr>
+        <w:pStyle w:val="Heading2"/>
+      </w:pPr>
+      <w:r>
+        <w:t>4.4 Final results over ten seeds, by skin tone and by category</w:t>
+      </w:r>
+    </w:p>
+    <w:p>
+      <w:pPr>
+        <w:jc w:val="both"/>
+      </w:pPr>
+      <w:r>
+        <w:t xml:space="preserve">The results in Sections 4.2 and 4.3 use the first five seeds and are preliminary. To narrow the confidence intervals, five more split variants were created (seeds 5-9; splits 0-4 stayed identical) and every arm was retrained on them. The analysis plan was fixed before the new results were seen: the same arms and metrics, paired differences against the photo-only model, and Holm-corrected p-values [30] for tone groups and categories. The Holm correction is needed because many tests are run at once (6 tone groups and 4 categories per model): with 10 tests, at least one 'significant' result can appear by chance, and the correction raises the threshold so that the probability of any such false alarm in the whole family stays below 5%. The Wilcoxon signed-rank test [31] compares the per-seed differences without assuming a normal distribution. Full results are in </w:t>
+      </w:r>
+      <w:r>
+        <w:rPr>
+          <w:rFonts w:ascii="Courier New" w:hAnsi="Courier New" w:eastAsia="Courier New" w:cs="Courier New"/>
+          <w:sz w:val="19"/>
+        </w:rPr>
+        <w:t>ml/results/e1/</w:t>
+      </w:r>
+      <w:r>
+        <w:t xml:space="preserve"> (all ten seeds), and the halves </w:t>
+      </w:r>
+      <w:r>
+        <w:rPr>
+          <w:rFonts w:ascii="Courier New" w:hAnsi="Courier New" w:eastAsia="Courier New" w:cs="Courier New"/>
+          <w:sz w:val="19"/>
+        </w:rPr>
+        <w:t>seeds0-4</w:t>
+      </w:r>
+      <w:r>
+        <w:t xml:space="preserve"> and </w:t>
+      </w:r>
+      <w:r>
+        <w:rPr>
+          <w:rFonts w:ascii="Courier New" w:hAnsi="Courier New" w:eastAsia="Courier New" w:cs="Courier New"/>
+          <w:sz w:val="19"/>
+        </w:rPr>
+        <w:t>seeds5-9</w:t>
+      </w:r>
+      <w:r>
+        <w:t xml:space="preserve"> are reported separately as a replication check.</w:t>
+      </w:r>
+    </w:p>
+    <w:p>
+      <w:pPr>
+        <w:jc w:val="both"/>
+      </w:pPr>
+      <w:r>
+        <w:t>Over ten seeds (Table 4), the photo-only model reaches a macro-F1 of 0.519 ± 0.040, and none of the variants that use the questionnaire beats it: concatenation −0.005 [95% CI −0.024, +0.014], better in 6 of 10 seeds; FiLM +0.000 [−0.023, +0.023], 5/10; concatenation without dropout −0.014 [−0.035, +0.006]; ensemble −0.021 [−0.047, +0.003]. Gated fusion is even worse: −0.030 [−0.053, −0.007], better in only 2 of 10 seeds (Wilcoxon p = 0.037). The small lead of FiLM over the first five seeds (+0.008) disappeared, which shows why five seeds are not enough. The narrower intervals allow a firmer conclusion: with 95% confidence, any gain from the questionnaire in this configuration is smaller than about 0.02 macro-F1 (the upper end of the interval is +0.023 for FiLM and +0.014 for concatenation).</w:t>
+      </w:r>
+    </w:p>
+    <w:p>
+      <w:pPr>
+        <w:jc w:val="both"/>
+      </w:pPr>
+      <w:r>
+        <w:t>Table 4. All E1 arms over ten seeds (EfficientNet-B0, weighted loss; mean ± standard deviation; paired differences on the same cases, seed-stratified bootstrap interval).</w:t>
+      </w:r>
+    </w:p>
+    <w:tbl>
+      <w:tblPr>
+        <w:tblStyle w:val="TableGrid"/>
+        <w:tblW w:type="auto" w:w="0"/>
+        <w:tblLook w:firstColumn="1" w:firstRow="1" w:lastColumn="0" w:lastRow="0" w:noHBand="0" w:noVBand="1" w:val="04A0"/>
+      </w:tblPr>
+      <w:tblGrid>
+        <w:gridCol w:w="1814"/>
+        <w:gridCol w:w="1814"/>
+        <w:gridCol w:w="1814"/>
+        <w:gridCol w:w="1814"/>
+        <w:gridCol w:w="1814"/>
+      </w:tblGrid>
+      <w:tr>
+        <w:tc>
+          <w:tcPr>
+            <w:tcW w:type="dxa" w:w="1814"/>
+          </w:tcPr>
+          <w:p>
+            <w:r>
+              <w:rPr>
+                <w:b/>
+              </w:rPr>
+              <w:t>Model</w:t>
+            </w:r>
+          </w:p>
+        </w:tc>
+        <w:tc>
+          <w:tcPr>
+            <w:tcW w:type="dxa" w:w="1814"/>
+          </w:tcPr>
+          <w:p>
+            <w:r>
+              <w:rPr>
+                <w:b/>
+              </w:rPr>
+              <w:t>Macro-F1 (10 seeds)</w:t>
+            </w:r>
+          </w:p>
+        </w:tc>
+        <w:tc>
+          <w:tcPr>
+            <w:tcW w:type="dxa" w:w="1814"/>
+          </w:tcPr>
+          <w:p>
+            <w:r>
+              <w:rPr>
+                <w:b/>
+              </w:rPr>
+              <w:t>Difference vs photo [95% CI]</w:t>
+            </w:r>
+          </w:p>
+        </w:tc>
+        <w:tc>
+          <w:tcPr>
+            <w:tcW w:type="dxa" w:w="1814"/>
+          </w:tcPr>
+          <w:p>
+            <w:r>
+              <w:rPr>
+                <w:b/>
+              </w:rPr>
+              <w:t>Seeds better</w:t>
+            </w:r>
+          </w:p>
+        </w:tc>
+        <w:tc>
+          <w:tcPr>
+            <w:tcW w:type="dxa" w:w="1814"/>
+          </w:tcPr>
+          <w:p>
+            <w:r>
+              <w:rPr>
+                <w:b/>
+              </w:rPr>
+              <w:t>Macro-F1, answers hidden</w:t>
+            </w:r>
+          </w:p>
+        </w:tc>
+      </w:tr>
+      <w:tr>
+        <w:tc>
+          <w:tcPr>
+            <w:tcW w:type="dxa" w:w="1814"/>
+          </w:tcPr>
+          <w:p>
+            <w:r>
+              <w:t>Photo only</w:t>
+            </w:r>
+          </w:p>
+        </w:tc>
+        <w:tc>
+          <w:tcPr>
+            <w:tcW w:type="dxa" w:w="1814"/>
+          </w:tcPr>
+          <w:p>
+            <w:r>
+              <w:t>0.519 ± 0.040</w:t>
+            </w:r>
+          </w:p>
+        </w:tc>
+        <w:tc>
+          <w:tcPr>
+            <w:tcW w:type="dxa" w:w="1814"/>
+          </w:tcPr>
+          <w:p>
+            <w:r>
+              <w:t>-</w:t>
+            </w:r>
+          </w:p>
+        </w:tc>
+        <w:tc>
+          <w:tcPr>
+            <w:tcW w:type="dxa" w:w="1814"/>
+          </w:tcPr>
+          <w:p>
+            <w:r>
+              <w:t>-</w:t>
+            </w:r>
+          </w:p>
+        </w:tc>
+        <w:tc>
+          <w:tcPr>
+            <w:tcW w:type="dxa" w:w="1814"/>
+          </w:tcPr>
+          <w:p>
+            <w:r>
+              <w:t>-</w:t>
+            </w:r>
+          </w:p>
+        </w:tc>
+      </w:tr>
+      <w:tr>
+        <w:tc>
+          <w:tcPr>
+            <w:tcW w:type="dxa" w:w="1814"/>
+          </w:tcPr>
+          <w:p>
+            <w:r>
+              <w:t>Questionnaire only</w:t>
+            </w:r>
+          </w:p>
+        </w:tc>
+        <w:tc>
+          <w:tcPr>
+            <w:tcW w:type="dxa" w:w="1814"/>
+          </w:tcPr>
+          <w:p>
+            <w:r>
+              <w:t>0.381 ± 0.050</w:t>
+            </w:r>
+          </w:p>
+        </w:tc>
+        <w:tc>
+          <w:tcPr>
+            <w:tcW w:type="dxa" w:w="1814"/>
+          </w:tcPr>
+          <w:p>
+            <w:r>
+              <w:t>-0.138 [-0.173, -0.102]</w:t>
+            </w:r>
+          </w:p>
+        </w:tc>
+        <w:tc>
+          <w:tcPr>
+            <w:tcW w:type="dxa" w:w="1814"/>
+          </w:tcPr>
+          <w:p>
+            <w:r>
+              <w:t>0/10</w:t>
+            </w:r>
+          </w:p>
+        </w:tc>
+        <w:tc>
+          <w:tcPr>
+            <w:tcW w:type="dxa" w:w="1814"/>
+          </w:tcPr>
+          <w:p>
+            <w:r>
+              <w:t>0.138</w:t>
+            </w:r>
+          </w:p>
+        </w:tc>
+      </w:tr>
+      <w:tr>
+        <w:tc>
+          <w:tcPr>
+            <w:tcW w:type="dxa" w:w="1814"/>
+          </w:tcPr>
+          <w:p>
+            <w:r>
+              <w:t>Fusion concat</w:t>
+            </w:r>
+          </w:p>
+        </w:tc>
+        <w:tc>
+          <w:tcPr>
+            <w:tcW w:type="dxa" w:w="1814"/>
+          </w:tcPr>
+          <w:p>
+            <w:r>
+              <w:t>0.514 ± 0.040</w:t>
+            </w:r>
+          </w:p>
+        </w:tc>
+        <w:tc>
+          <w:tcPr>
+            <w:tcW w:type="dxa" w:w="1814"/>
+          </w:tcPr>
+          <w:p>
+            <w:r>
+              <w:t>-0.005 [-0.024, +0.014]</w:t>
+            </w:r>
+          </w:p>
+        </w:tc>
+        <w:tc>
+          <w:tcPr>
+            <w:tcW w:type="dxa" w:w="1814"/>
+          </w:tcPr>
+          <w:p>
+            <w:r>
+              <w:t>6/10</w:t>
+            </w:r>
+          </w:p>
+        </w:tc>
+        <w:tc>
+          <w:tcPr>
+            <w:tcW w:type="dxa" w:w="1814"/>
+          </w:tcPr>
+          <w:p>
+            <w:r>
+              <w:t>0.505</w:t>
+            </w:r>
+          </w:p>
+        </w:tc>
+      </w:tr>
+      <w:tr>
+        <w:tc>
+          <w:tcPr>
+            <w:tcW w:type="dxa" w:w="1814"/>
+          </w:tcPr>
+          <w:p>
+            <w:r>
+              <w:t>Fusion gated</w:t>
+            </w:r>
+          </w:p>
+        </w:tc>
+        <w:tc>
+          <w:tcPr>
+            <w:tcW w:type="dxa" w:w="1814"/>
+          </w:tcPr>
+          <w:p>
+            <w:r>
+              <w:t>0.490 ± 0.041</w:t>
+            </w:r>
+          </w:p>
+        </w:tc>
+        <w:tc>
+          <w:tcPr>
+            <w:tcW w:type="dxa" w:w="1814"/>
+          </w:tcPr>
+          <w:p>
+            <w:r>
+              <w:t>-0.030 [-0.053, -0.007]</w:t>
+            </w:r>
+          </w:p>
+        </w:tc>
+        <w:tc>
+          <w:tcPr>
+            <w:tcW w:type="dxa" w:w="1814"/>
+          </w:tcPr>
+          <w:p>
+            <w:r>
+              <w:t>2/10</w:t>
+            </w:r>
+          </w:p>
+        </w:tc>
+        <w:tc>
+          <w:tcPr>
+            <w:tcW w:type="dxa" w:w="1814"/>
+          </w:tcPr>
+          <w:p>
+            <w:r>
+              <w:t>0.491</w:t>
+            </w:r>
+          </w:p>
+        </w:tc>
+      </w:tr>
+      <w:tr>
+        <w:tc>
+          <w:tcPr>
+            <w:tcW w:type="dxa" w:w="1814"/>
+          </w:tcPr>
+          <w:p>
+            <w:r>
+              <w:t>Fusion FiLM</w:t>
+            </w:r>
+          </w:p>
+        </w:tc>
+        <w:tc>
+          <w:tcPr>
+            <w:tcW w:type="dxa" w:w="1814"/>
+          </w:tcPr>
+          <w:p>
+            <w:r>
+              <w:t>0.519 ± 0.044</w:t>
+            </w:r>
+          </w:p>
+        </w:tc>
+        <w:tc>
+          <w:tcPr>
+            <w:tcW w:type="dxa" w:w="1814"/>
+          </w:tcPr>
+          <w:p>
+            <w:r>
+              <w:t>+0.000 [-0.023, +0.023]</w:t>
+            </w:r>
+          </w:p>
+        </w:tc>
+        <w:tc>
+          <w:tcPr>
+            <w:tcW w:type="dxa" w:w="1814"/>
+          </w:tcPr>
+          <w:p>
+            <w:r>
+              <w:t>5/10</w:t>
+            </w:r>
+          </w:p>
+        </w:tc>
+        <w:tc>
+          <w:tcPr>
+            <w:tcW w:type="dxa" w:w="1814"/>
+          </w:tcPr>
+          <w:p>
+            <w:r>
+              <w:t>0.513</w:t>
+            </w:r>
+          </w:p>
+        </w:tc>
+      </w:tr>
+      <w:tr>
+        <w:tc>
+          <w:tcPr>
+            <w:tcW w:type="dxa" w:w="1814"/>
+          </w:tcPr>
+          <w:p>
+            <w:r>
+              <w:t>Concat, no dropout</w:t>
+            </w:r>
+          </w:p>
+        </w:tc>
+        <w:tc>
+          <w:tcPr>
+            <w:tcW w:type="dxa" w:w="1814"/>
+          </w:tcPr>
+          <w:p>
+            <w:r>
+              <w:t>0.505 ± 0.036</w:t>
+            </w:r>
+          </w:p>
+        </w:tc>
+        <w:tc>
+          <w:tcPr>
+            <w:tcW w:type="dxa" w:w="1814"/>
+          </w:tcPr>
+          <w:p>
+            <w:r>
+              <w:t>-0.014 [-0.035, +0.006]</w:t>
+            </w:r>
+          </w:p>
+        </w:tc>
+        <w:tc>
+          <w:tcPr>
+            <w:tcW w:type="dxa" w:w="1814"/>
+          </w:tcPr>
+          <w:p>
+            <w:r>
+              <w:t>3/10</w:t>
+            </w:r>
+          </w:p>
+        </w:tc>
+        <w:tc>
+          <w:tcPr>
+            <w:tcW w:type="dxa" w:w="1814"/>
+          </w:tcPr>
+          <w:p>
+            <w:r>
+              <w:t>0.504</w:t>
+            </w:r>
+          </w:p>
+        </w:tc>
+      </w:tr>
+      <w:tr>
+        <w:tc>
+          <w:tcPr>
+            <w:tcW w:type="dxa" w:w="1814"/>
+          </w:tcPr>
+          <w:p>
+            <w:r>
+              <w:t>Ensemble photo × questionnaire</w:t>
+            </w:r>
+          </w:p>
+        </w:tc>
+        <w:tc>
+          <w:tcPr>
+            <w:tcW w:type="dxa" w:w="1814"/>
+          </w:tcPr>
+          <w:p>
+            <w:r>
+              <w:t>0.498 ± 0.052</w:t>
+            </w:r>
+          </w:p>
+        </w:tc>
+        <w:tc>
+          <w:tcPr>
+            <w:tcW w:type="dxa" w:w="1814"/>
+          </w:tcPr>
+          <w:p>
+            <w:r>
+              <w:t>-0.021 [-0.047, +0.003]</w:t>
+            </w:r>
+          </w:p>
+        </w:tc>
+        <w:tc>
+          <w:tcPr>
+            <w:tcW w:type="dxa" w:w="1814"/>
+          </w:tcPr>
+          <w:p>
+            <w:r>
+              <w:t>3/10</w:t>
+            </w:r>
+          </w:p>
+        </w:tc>
+        <w:tc>
+          <w:tcPr>
+            <w:tcW w:type="dxa" w:w="1814"/>
+          </w:tcPr>
+          <w:p>
+            <w:r>
+              <w:t>0.496</w:t>
+            </w:r>
+          </w:p>
+        </w:tc>
+      </w:tr>
+    </w:tbl>
+    <w:p>
+      <w:pPr>
+        <w:jc w:val="both"/>
+      </w:pPr>
+      <w:r>
+        <w:t>The group analysis gives the same answer to the question 'for whom?'. No fusion variant significantly improves any tone group (eFST I-II, III-IV, V-VI; eMST 1-3, 4-6, 7-10) or any category after the Holm correction; the only significant effect of fusion is negative: the gated variant lowers macro-F1 on eFST III-IV by 0.073 (Holm p = 0.028). Over the first five seeds, FiLM seemed better on eMST 4-6 (+0.088, in all 5 seeds); this hint was recorded before seeds 5-9 were run and did not replicate (−0.013, better in only one seed of five), so it was noise. The photo-only model is weakest on eMST 4-6 (0.457 ± 0.069, about 72 cases per seed) and on eFST V-VI (0.496 ± 0.140, about 23 cases), and acne remains the hardest category (F1 0.320 ± 0.064). One detail matters for the discussion: the gap between the questionnaire and the photo is smallest precisely on the darker groups (eFST V-VI −0.070, eMST 4-6 −0.050, both not significant, versus −0.12 to −0.20 on the other groups), which suggests that the photo loses part of its advantage on darker skin, but the fusion models do not manage to compensate with the questionnaire. Small groups (eMST 7-10 has 11 cases per seed, redness_rosacea 6) have very wide intervals and do not support conclusions.</w:t>
+      </w:r>
+    </w:p>
+    <w:p>
+      <w:pPr>
+        <w:pStyle w:val="Heading2"/>
+      </w:pPr>
+      <w:r>
+        <w:t>4.5 Why does the questionnaire not help?</w:t>
+      </w:r>
+    </w:p>
+    <w:p>
+      <w:pPr>
+        <w:jc w:val="both"/>
+      </w:pPr>
+      <w:r>
+        <w:t xml:space="preserve">The result is surprising, because in SCIN the dermatologists saw both the photos and the questionnaire answers when they assigned labels, and their confidence increased with the number of available answers [32]. To understand why the models do not benefit from the questionnaire, </w:t>
+      </w:r>
+      <w:r>
+        <w:rPr>
+          <w:rFonts w:ascii="Courier New" w:hAnsi="Courier New" w:eastAsia="Courier New" w:cs="Courier New"/>
+          <w:sz w:val="19"/>
+        </w:rPr>
+        <w:t>ml/analysis/questionnaire_diagnostics.py</w:t>
+      </w:r>
+      <w:r>
+        <w:t xml:space="preserve"> runs three checks on the already trained models (ten seeds, no retraining); results are in </w:t>
+      </w:r>
+      <w:r>
+        <w:rPr>
+          <w:rFonts w:ascii="Courier New" w:hAnsi="Courier New" w:eastAsia="Courier New" w:cs="Courier New"/>
+          <w:sz w:val="19"/>
+        </w:rPr>
+        <w:t>ml/results/e1/diagnostics/</w:t>
+      </w:r>
+      <w:r>
+        <w:t>.</w:t>
+      </w:r>
+    </w:p>
+    <w:p>
+      <w:pPr>
+        <w:jc w:val="both"/>
+      </w:pPr>
+      <w:r>
+        <w:t>(1) Can the photo model 'see' the answers? A logistic regression on the internal features of the network trained on photos predicts each answer, and prediction quality is measured by the AUROC [33] (area under the ROC curve: 0.5 means random guessing, 1 means perfect prediction). Values range from 0.50 to 0.70: body area 0.57-0.69, symptoms 0.51-0.57, texture 0.50-0.55, duration 0.56. SCIN photos are mostly close-ups, so even the body area is hard to see. The questionnaire therefore holds information the photo model lacks; the redundancy hypothesis is not supported.</w:t>
+      </w:r>
+    </w:p>
+    <w:p>
+      <w:pPr>
+        <w:jc w:val="both"/>
+      </w:pPr>
+      <w:r>
+        <w:t>(2) Do the two models fail on the same cases? If errors were independent, the questionnaire-only model would be right on the photo's mistakes as often as overall (48.2%). In fact it is right on only 42.6% of them, versus 52.6% on the cases the photo gets right. Errors are therefore correlated: hard cases are hard for both models, which points to ambiguous images and noisy labels rather than missing information. There would still be room for gain: an 'oracle' that always picks the right model would reach an accuracy of 0.749 versus 0.564 for the photo, but nothing in the inputs tells when to trust the questionnaire; the ensemble, which tried exactly that with a weight chosen on validation, did not succeed.</w:t>
+      </w:r>
+    </w:p>
+    <w:p>
+      <w:pPr>
+        <w:jc w:val="both"/>
+      </w:pPr>
+      <w:r>
+        <w:t>(3) Which questions matter? Hiding one question at a time from the questionnaire-only model, the largest loss comes from body area (macro-F1 drops by 0.125), followed by duration (0.057), symptoms (0.053) and texture (0.043); the self-reported skin type and age hardly matter (0.012 each). Overall the questionnaire's signal is weak (macro-F1 0.381 versus 0.519 for the photo) and concentrated in a single question.</w:t>
+      </w:r>
+    </w:p>
+    <w:p>
+      <w:pPr>
+        <w:jc w:val="both"/>
+      </w:pPr>
+      <w:r>
+        <w:t>The resulting explanation is: the questionnaire carries information that differs from the photo but is weak, and its useful part largely overlaps with the cases the photo already solves. The truly complementary part is small and noisy, and about 1,270 training cases, mostly labelled by a single dermatologist, are not enough for a model to learn reliably when to rely on it. This suggests concrete directions for an app: the body-area and duration questions are the ones worth keeping, and a larger dataset or more reliable labels would be needed to obtain a measurable gain.</w:t>
+      </w:r>
+    </w:p>
+    <w:p>
+      <w:pPr>
         <w:pStyle w:val="Heading1"/>
       </w:pPr>
       <w:r>
@@ -2768,6 +4482,106 @@
       </w:pPr>
       <w:r>
         <w:t>[23] S. Yan et al., Derm1M: A Million-scale Vision-Language Dataset Aligned with Clinical Ontology Knowledge for Dermatology (DermLIP), ICCV 2025. https://arxiv.org/abs/2503.14911</w:t>
+      </w:r>
+    </w:p>
+    <w:p>
+      <w:pPr>
+        <w:spacing w:after="120" w:line="276" w:lineRule="auto"/>
+        <w:ind w:left="567" w:hanging="567"/>
+        <w:jc w:val="left"/>
+      </w:pPr>
+      <w:r>
+        <w:t>[24] I. Goodfellow, Y. Bengio, A. Courville, Deep Learning, MIT Press 2016, chapter 6 (deep feedforward networks). https://www.deeplearningbook.org/</w:t>
+      </w:r>
+    </w:p>
+    <w:p>
+      <w:pPr>
+        <w:spacing w:after="120" w:line="276" w:lineRule="auto"/>
+        <w:ind w:left="567" w:hanging="567"/>
+        <w:jc w:val="left"/>
+      </w:pPr>
+      <w:r>
+        <w:t>[25] J. Arevalo, T. Solorio, M. Montes-y-Gómez, F. A. González, Gated Multimodal Units for Information Fusion, ICLR Workshop 2017. https://arxiv.org/abs/1702.01992</w:t>
+      </w:r>
+    </w:p>
+    <w:p>
+      <w:pPr>
+        <w:spacing w:after="120" w:line="276" w:lineRule="auto"/>
+        <w:ind w:left="567" w:hanging="567"/>
+        <w:jc w:val="left"/>
+      </w:pPr>
+      <w:r>
+        <w:t>[26] E. Perez, F. Strub, H. de Vries, V. Dumoulin, A. Courville, FiLM: Visual Reasoning with a General Conditioning Layer, AAAI 2018. https://arxiv.org/abs/1709.07871</w:t>
+      </w:r>
+    </w:p>
+    <w:p>
+      <w:pPr>
+        <w:spacing w:after="120" w:line="276" w:lineRule="auto"/>
+        <w:ind w:left="567" w:hanging="567"/>
+        <w:jc w:val="left"/>
+      </w:pPr>
+      <w:r>
+        <w:t>[27] Student (W. S. Gosset), The Probable Error of a Mean, Biometrika 6(1), 1908. https://doi.org/10.1093/biomet/6.1.1</w:t>
+      </w:r>
+    </w:p>
+    <w:p>
+      <w:pPr>
+        <w:spacing w:after="120" w:line="276" w:lineRule="auto"/>
+        <w:ind w:left="567" w:hanging="567"/>
+        <w:jc w:val="left"/>
+      </w:pPr>
+      <w:r>
+        <w:t>[28] R. Roelofs, N. Cain, J. Shlens, M. C. Mozer, Mitigating Bias in Calibration Error Estimation, AISTATS 2022. https://arxiv.org/abs/2012.08668</w:t>
+      </w:r>
+    </w:p>
+    <w:p>
+      <w:pPr>
+        <w:spacing w:after="120" w:line="276" w:lineRule="auto"/>
+        <w:ind w:left="567" w:hanging="567"/>
+        <w:jc w:val="left"/>
+      </w:pPr>
+      <w:r>
+        <w:t>[29] C. Genest, J. V. Zidek, Combining Probability Distributions: A Critique and an Annotated Bibliography, Statistical Science 1(1), 1986. https://doi.org/10.1214/ss/1177013825</w:t>
+      </w:r>
+    </w:p>
+    <w:p>
+      <w:pPr>
+        <w:spacing w:after="120" w:line="276" w:lineRule="auto"/>
+        <w:ind w:left="567" w:hanging="567"/>
+        <w:jc w:val="left"/>
+      </w:pPr>
+      <w:r>
+        <w:t>[30] S. Holm, A Simple Sequentially Rejective Multiple Test Procedure, Scandinavian Journal of Statistics 6(2), 1979. https://www.jstor.org/stable/4615733</w:t>
+      </w:r>
+    </w:p>
+    <w:p>
+      <w:pPr>
+        <w:spacing w:after="120" w:line="276" w:lineRule="auto"/>
+        <w:ind w:left="567" w:hanging="567"/>
+        <w:jc w:val="left"/>
+      </w:pPr>
+      <w:r>
+        <w:t>[31] F. Wilcoxon, Individual Comparisons by Ranking Methods, Biometrics Bulletin 1(6), 1945. https://doi.org/10.2307/3001968</w:t>
+      </w:r>
+    </w:p>
+    <w:p>
+      <w:pPr>
+        <w:spacing w:after="120" w:line="276" w:lineRule="auto"/>
+        <w:ind w:left="567" w:hanging="567"/>
+        <w:jc w:val="left"/>
+      </w:pPr>
+      <w:r>
+        <w:t>[32] A. Ward, J. Li, J. Wang et al., Crowdsourcing Dermatology Images with Google Search Ads: Creating a Real-World Skin Condition Dataset, JAMA Network Open 2024. https://arxiv.org/abs/2402.18545</w:t>
+      </w:r>
+    </w:p>
+    <w:p>
+      <w:pPr>
+        <w:spacing w:after="120" w:line="276" w:lineRule="auto"/>
+        <w:ind w:left="567" w:hanging="567"/>
+        <w:jc w:val="left"/>
+      </w:pPr>
+      <w:r>
+        <w:t>[33] T. Fawcett, An introduction to ROC analysis, Pattern Recognition Letters 27(8), 2006. https://doi.org/10.1016/j.patrec.2005.10.010</w:t>
       </w:r>
     </w:p>
     <w:sectPr>

</xml_diff>

<commit_message>
feat(ml): test on the full Fitzpatrick17k set and add pooled-training experiment E7
- read the full Fitzpatrick17k image set (and its 448 px cache) so all
  4,012 mapped images are usable; zero-shot macro-F1 0.393 with a clear
  skin-tone gradient (V-VI 0.312)
- group near-duplicates and same-patient photos (256-bit dHash + ImageNet
  embedding cosine) and build grouped, stratified test folds per seed
- run_fitz_pooling.py: data pooling and sequential transfer vs the E1
  photo-only model over ten seeds; pooling lowers SCIN macro-F1 by 0.035
  but raises in-domain Fitzpatrick17k macro-F1 by 0.216
- thesis 8.8 / paper 4.8, journal entry, data source note, tests
</commit_message>
<xml_diff>
--- a/docs/Paper_Skin_Concern.docx
+++ b/docs/Paper_Skin_Concern.docx
@@ -5182,6 +5182,337 @@
     </w:p>
     <w:p>
       <w:pPr>
+        <w:pStyle w:val="Heading2"/>
+      </w:pPr>
+      <w:r>
+        <w:t>4.8 Full Fitzpatrick17k set: external test and pooled training (E7)</w:t>
+      </w:r>
+    </w:p>
+    <w:p>
+      <w:pPr>
+        <w:jc w:val="both"/>
+      </w:pPr>
+      <w:r>
+        <w:t>The full Fitzpatrick17k image set [19] (16,577 files) was received from the authors under an obligation to delete it when the research ends. With it, all 4,012 images that map to the target categories can be used (before, only 619 could still be downloaded). The images are not redistributed and do not appear in the app, the code repository or the paper; only aggregate values are reported. Two things were done: the complete external test of the SCIN model and a new experiment, E7, that checks whether the extra images make the model more accurate.</w:t>
+      </w:r>
+    </w:p>
+    <w:p>
+      <w:pPr>
+        <w:jc w:val="both"/>
+      </w:pPr>
+      <w:r>
+        <w:t>Complete external test (zero-shot, i.e. without any retraining). The ten E1 photo-only models (one per seed) reach a macro-F1 of 0.393 ± 0.016 on the 4,012 images, against 0.519 on the SCIN test split. The drop reflects domain shift: clinical atlas photos differ from SCIN smartphone photos, and normal_other is dominated here by psoriasis. Performance falls with skin tone: macro-F1 0.412 for eFST I-II, 0.371 for III-IV and 0.312 for V-VI. Among the categories, redness_rosacea is the weakest (F1 0.237).</w:t>
+      </w:r>
+    </w:p>
+    <w:p>
+      <w:pPr>
+        <w:jc w:val="both"/>
+      </w:pPr>
+      <w:r>
+        <w:t>Duplicates and photos of the same patient. Fitzpatrick17k contains many near-duplicates [38]: the same photo re-uploaded, resized, mirrored or cropped, and several photos of the same patient. If one lands in training and another in the test set, the test score is too high (data leakage). Two checks link images (</w:t>
+      </w:r>
+      <w:r>
+        <w:rPr>
+          <w:rFonts w:ascii="Courier New" w:hAnsi="Courier New" w:eastAsia="Courier New" w:cs="Courier New"/>
+          <w:sz w:val="19"/>
+        </w:rPr>
+        <w:t>ml/splits/make_fitzpatrick_splits.py</w:t>
+      </w:r>
+      <w:r>
+        <w:t xml:space="preserve">). (a) A 256-bit difference hash (dHash): the image is turned to greyscale and shrunk to 17 x 16 pixels, and each bit says whether a pixel is brighter than its right neighbour. The Hamming distance (number of differing bits, 0-256) measures how different two hashes are; two images are linked at a distance of at most 20. (b) The cosine similarity (between -1 and 1; 1 means the same direction) of ImageNet features of an EfficientNet-B0 with no skin training; two images are linked at a similarity of at least 0.88. The threshold was chosen by visual inspection of sampled pairs: above 0.88 nearly every pair showed the same patient or lesion, below 0.87 unrelated photos became common. Linked images form groups (union-find, a structure that merges groups as links appear): 588 pairs, 903 images in groups of two or more. For each seed, </w:t>
+      </w:r>
+      <w:r>
+        <w:rPr>
+          <w:rFonts w:ascii="Courier New" w:hAnsi="Courier New" w:eastAsia="Courier New" w:cs="Courier New"/>
+          <w:sz w:val="19"/>
+        </w:rPr>
+        <w:t>StratifiedGroupKFold</w:t>
+      </w:r>
+      <w:r>
+        <w:t xml:space="preserve"> (a five-part split that keeps groups whole and the category mix balanced) puts about 20% of the groups in the Fitzpatrick17k test fold (803 images); the remaining 3,209 images may be used for training.</w:t>
+      </w:r>
+    </w:p>
+    <w:p>
+      <w:pPr>
+        <w:jc w:val="both"/>
+      </w:pPr>
+      <w:r>
+        <w:t>Experiment E7 (</w:t>
+      </w:r>
+      <w:r>
+        <w:rPr>
+          <w:rFonts w:ascii="Courier New" w:hAnsi="Courier New" w:eastAsia="Courier New" w:cs="Courier New"/>
+          <w:sz w:val="19"/>
+        </w:rPr>
+        <w:t>ml/run_fitz_pooling.py</w:t>
+      </w:r>
+      <w:r>
+        <w:t>) compares the E1 photo-only model with two ways of using the extra images, with the same network (EfficientNet-B0), the same staged training and the same ten seeds: (1) data pooling: training on SCIN and the Fitzpatrick17k training fold together, with class weights computed on the pooled set; (2) sequential transfer: training on Fitzpatrick17k first, then fine-tuning (continuing training at a low learning rate) on SCIN. Early stopping always uses SCIN validation, because the app's target is smartphone photos. Every model is tested on the SCIN test split (paired with E1 on the same cases) and on the seed's Fitzpatrick17k test fold, which it never saw. The experiment is research-only: the model shipped in the app stays SCIN-only.</w:t>
+      </w:r>
+    </w:p>
+    <w:p>
+      <w:pPr>
+        <w:jc w:val="both"/>
+      </w:pPr>
+      <w:r>
+        <w:t>Table 7. Experiment E7 (ten seeds; mean ± standard deviation; paired difference against the photo-only model with 95% bootstrap interval and number of seeds better).</w:t>
+      </w:r>
+    </w:p>
+    <w:tbl>
+      <w:tblPr>
+        <w:tblStyle w:val="TableGrid"/>
+        <w:tblW w:type="auto" w:w="0"/>
+        <w:tblLook w:firstColumn="1" w:firstRow="1" w:lastColumn="0" w:lastRow="0" w:noHBand="0" w:noVBand="1" w:val="04A0"/>
+      </w:tblPr>
+      <w:tblGrid>
+        <w:gridCol w:w="1814"/>
+        <w:gridCol w:w="1814"/>
+        <w:gridCol w:w="1814"/>
+        <w:gridCol w:w="1814"/>
+        <w:gridCol w:w="1814"/>
+      </w:tblGrid>
+      <w:tr>
+        <w:tc>
+          <w:tcPr>
+            <w:tcW w:type="dxa" w:w="1814"/>
+          </w:tcPr>
+          <w:p>
+            <w:r>
+              <w:rPr>
+                <w:b/>
+              </w:rPr>
+              <w:t>Model</w:t>
+            </w:r>
+          </w:p>
+        </w:tc>
+        <w:tc>
+          <w:tcPr>
+            <w:tcW w:type="dxa" w:w="1814"/>
+          </w:tcPr>
+          <w:p>
+            <w:r>
+              <w:rPr>
+                <w:b/>
+              </w:rPr>
+              <w:t>SCIN macro-F1</w:t>
+            </w:r>
+          </w:p>
+        </w:tc>
+        <w:tc>
+          <w:tcPr>
+            <w:tcW w:type="dxa" w:w="1814"/>
+          </w:tcPr>
+          <w:p>
+            <w:r>
+              <w:rPr>
+                <w:b/>
+              </w:rPr>
+              <w:t>SCIN difference</w:t>
+            </w:r>
+          </w:p>
+        </w:tc>
+        <w:tc>
+          <w:tcPr>
+            <w:tcW w:type="dxa" w:w="1814"/>
+          </w:tcPr>
+          <w:p>
+            <w:r>
+              <w:rPr>
+                <w:b/>
+              </w:rPr>
+              <w:t>Fitzpatrick17k macro-F1</w:t>
+            </w:r>
+          </w:p>
+        </w:tc>
+        <w:tc>
+          <w:tcPr>
+            <w:tcW w:type="dxa" w:w="1814"/>
+          </w:tcPr>
+          <w:p>
+            <w:r>
+              <w:rPr>
+                <w:b/>
+              </w:rPr>
+              <w:t>Fitzpatrick17k difference</w:t>
+            </w:r>
+          </w:p>
+        </w:tc>
+      </w:tr>
+      <w:tr>
+        <w:tc>
+          <w:tcPr>
+            <w:tcW w:type="dxa" w:w="1814"/>
+          </w:tcPr>
+          <w:p>
+            <w:r>
+              <w:t>Photo only, SCIN (E1; zero-shot on Fitzpatrick17k)</w:t>
+            </w:r>
+          </w:p>
+        </w:tc>
+        <w:tc>
+          <w:tcPr>
+            <w:tcW w:type="dxa" w:w="1814"/>
+          </w:tcPr>
+          <w:p>
+            <w:r>
+              <w:t>0.519 ± 0.040</w:t>
+            </w:r>
+          </w:p>
+        </w:tc>
+        <w:tc>
+          <w:tcPr>
+            <w:tcW w:type="dxa" w:w="1814"/>
+          </w:tcPr>
+          <w:p>
+            <w:r>
+              <w:t>reference</w:t>
+            </w:r>
+          </w:p>
+        </w:tc>
+        <w:tc>
+          <w:tcPr>
+            <w:tcW w:type="dxa" w:w="1814"/>
+          </w:tcPr>
+          <w:p>
+            <w:r>
+              <w:t>0.410 ± 0.022</w:t>
+            </w:r>
+          </w:p>
+        </w:tc>
+        <w:tc>
+          <w:tcPr>
+            <w:tcW w:type="dxa" w:w="1814"/>
+          </w:tcPr>
+          <w:p>
+            <w:r>
+              <w:t>reference</w:t>
+            </w:r>
+          </w:p>
+        </w:tc>
+      </w:tr>
+      <w:tr>
+        <w:tc>
+          <w:tcPr>
+            <w:tcW w:type="dxa" w:w="1814"/>
+          </w:tcPr>
+          <w:p>
+            <w:r>
+              <w:t>Data pooling (SCIN + Fitzpatrick17k)</w:t>
+            </w:r>
+          </w:p>
+        </w:tc>
+        <w:tc>
+          <w:tcPr>
+            <w:tcW w:type="dxa" w:w="1814"/>
+          </w:tcPr>
+          <w:p>
+            <w:r>
+              <w:t>0.484 ± 0.071</w:t>
+            </w:r>
+          </w:p>
+        </w:tc>
+        <w:tc>
+          <w:tcPr>
+            <w:tcW w:type="dxa" w:w="1814"/>
+          </w:tcPr>
+          <w:p>
+            <w:r>
+              <w:t>-0.035 [-0.071, -0.002], 2/10</w:t>
+            </w:r>
+          </w:p>
+        </w:tc>
+        <w:tc>
+          <w:tcPr>
+            <w:tcW w:type="dxa" w:w="1814"/>
+          </w:tcPr>
+          <w:p>
+            <w:r>
+              <w:t>0.626 ± 0.062</w:t>
+            </w:r>
+          </w:p>
+        </w:tc>
+        <w:tc>
+          <w:tcPr>
+            <w:tcW w:type="dxa" w:w="1814"/>
+          </w:tcPr>
+          <w:p>
+            <w:r>
+              <w:t>+0.216 [+0.202, +0.231], 10/10</w:t>
+            </w:r>
+          </w:p>
+        </w:tc>
+      </w:tr>
+      <w:tr>
+        <w:tc>
+          <w:tcPr>
+            <w:tcW w:type="dxa" w:w="1814"/>
+          </w:tcPr>
+          <w:p>
+            <w:r>
+              <w:t>Sequential transfer (Fitzpatrick17k, then SCIN)</w:t>
+            </w:r>
+          </w:p>
+        </w:tc>
+        <w:tc>
+          <w:tcPr>
+            <w:tcW w:type="dxa" w:w="1814"/>
+          </w:tcPr>
+          <w:p>
+            <w:r>
+              <w:t>0.496 ± 0.051</w:t>
+            </w:r>
+          </w:p>
+        </w:tc>
+        <w:tc>
+          <w:tcPr>
+            <w:tcW w:type="dxa" w:w="1814"/>
+          </w:tcPr>
+          <w:p>
+            <w:r>
+              <w:t>-0.024 [-0.049, +0.001], 3/10</w:t>
+            </w:r>
+          </w:p>
+        </w:tc>
+        <w:tc>
+          <w:tcPr>
+            <w:tcW w:type="dxa" w:w="1814"/>
+          </w:tcPr>
+          <w:p>
+            <w:r>
+              <w:t>0.464 ± 0.049</w:t>
+            </w:r>
+          </w:p>
+        </w:tc>
+        <w:tc>
+          <w:tcPr>
+            <w:tcW w:type="dxa" w:w="1814"/>
+          </w:tcPr>
+          <w:p>
+            <w:r>
+              <w:t>+0.053 [+0.042, +0.065], 9/10</w:t>
+            </w:r>
+          </w:p>
+        </w:tc>
+      </w:tr>
+    </w:tbl>
+    <w:p>
+      <w:pPr>
+        <w:jc w:val="both"/>
+      </w:pPr>
+      <w:r>
+        <w:t>The results (Table 7) answer no to the question whether the extra images help the app's target. On the SCIN test split, pooling lowers macro-F1 by 0.035 [-0.071, -0.002] (better in only 2 of 10 seeds; paired t-test p = 0.016), and balanced accuracy (mean per-category recall) falls from 0.610 to 0.499. Sequential transfer lowers macro-F1 by 0.024 [-0.049, +0.001] (3/10 seeds). By category, pooling raises eczema_dermatitis F1 (+0.042) but lowers redness_rosacea (-0.107) and acne (-0.057). On the Fitzpatrick17k fold, in contrast, pooling raises macro-F1 from 0.410 (zero-shot) to 0.626 (+0.216, 10/10 seeds), and the skin-tone gap almost disappears (I-II 0.633, III-IV 0.615, V-VI 0.606, against 0.429 / 0.380 / 0.353 zero-shot). Sequential transfer keeps only part of this gain (0.464).</w:t>
+      </w:r>
+    </w:p>
+    <w:p>
+      <w:pPr>
+        <w:jc w:val="both"/>
+      </w:pPr>
+      <w:r>
+        <w:t>The interpretation is that more images help only when they resemble the photos the model will be used on. Clinical atlas photos differ in framing, lighting and category composition (normal_other means mostly psoriasis), and the pooled model adapts its decisions to them at the expense of smartphone photos. The large gain on Fitzpatrick17k is an in-domain gain (training and test from the same source), not an improvement of the app model. Two conclusions follow for the paper: the SCIN-only model remains the chosen one, and the skin-tone gap seen zero-shot is largely a domain-shift effect, since it nearly vanishes once the model sees data from the same source.</w:t>
+      </w:r>
+    </w:p>
+    <w:p>
+      <w:pPr>
         <w:pStyle w:val="Heading1"/>
       </w:pPr>
       <w:r>
@@ -5594,6 +5925,16 @@
       </w:pPr>
       <w:r>
         <w:t>[37] D. H. Wolpert, Stacked generalization, Neural Networks 5(2), 1992. https://doi.org/10.1016/S0893-6080(05)80023-1</w:t>
+      </w:r>
+    </w:p>
+    <w:p>
+      <w:pPr>
+        <w:spacing w:after="120" w:line="276" w:lineRule="auto"/>
+        <w:ind w:left="567" w:hanging="567"/>
+        <w:jc w:val="left"/>
+      </w:pPr>
+      <w:r>
+        <w:t>[38] K. Abhishek, A. Jain, G. Hamarneh, Investigating the Quality of DermaMNIST and Fitzpatrick17k Dermatological Image Datasets, Scientific Data 12, 196, 2025. https://doi.org/10.1038/s41597-025-04382-5</w:t>
       </w:r>
     </w:p>
     <w:sectPr>

</xml_diff>

<commit_message>
feat(ml): close weeks 2-3, compare foundation models (E5) and test abstention by skin tone (E4)
- revised ML task plan against the real status (docs/ML_task_plan.md)
- E2 completed: field-wise answer removal, naturally missing questionnaires, curve
- E5: frozen encoders + linear probe; DINOv2 0.551, PanDerm-Large 0.566, DermLIP 0.603
  vs fine-tuned EfficientNet-B0 0.519; PanDerm loader checked against the authors' code
- E4: temperature scaling, abstention for 80% coverage, per-tone metrics; equal
  abstention rates on SCIN but lower accuracy on eMST 4-6; on Fitzpatrick17k and DDI
  the confidence rule misses most out-of-scope and malignant lesions
- app model chosen: DINOv2 + linear probe (Apache 2.0)
- Grad-CAM with model-randomization sanity check (Task 4.3)
- thesis chapter 8 and Annex A, paper sections 4.9-4.12, journal
</commit_message>
<xml_diff>
--- a/docs/Paper_Skin_Concern.docx
+++ b/docs/Paper_Skin_Concern.docx
@@ -2669,7 +2669,7 @@
         <w:jc w:val="both"/>
       </w:pPr>
       <w:r>
-        <w:t>Over the five seeds, the questionnaire-only model reaches a test macro-F1 of 0.390 ± 0.038 (mean ± standard deviation), balanced accuracy 0.443 ± 0.043 and ECE 0.083 ± 0.020 (Table 1). Training takes 6-11 seconds per seed, and early stopping selects epochs between 16 and 51. Per category, F1 is 0.569 for eczema_dermatitis, 0.429 for normal_other, 0.343 for redness_rosacea and 0.218 for acne. The redness_rosacea test set has only 6 cases on average, so that value is very uncertain (standard deviation 0.112). The questionnaire thus carries clear signal above chance, but not enough to separate acne, which looks like the other concerns from the answers alone.</w:t>
+        <w:t>Over the five seeds, the questionnaire-only model reaches a test macro-F1 of 0.390 ± 0.038 (mean ± standard deviation), balanced accuracy 0.443 ± 0.043 and ECE 0.083 ± 0.020 (Table 3). Training takes 6-11 seconds per seed, and early stopping selects epochs between 16 and 51. Per category, F1 is 0.569 for eczema_dermatitis, 0.429 for normal_other, 0.343 for redness_rosacea and 0.218 for acne. The redness_rosacea test set has only 6 cases on average, so that value is very uncertain (standard deviation 0.112). The questionnaire thus carries clear signal above chance, but not enough to separate acne, which looks like the other concerns from the answers alone.</w:t>
       </w:r>
     </w:p>
     <w:p>
@@ -2677,7 +2677,7 @@
         <w:jc w:val="both"/>
       </w:pPr>
       <w:r>
-        <w:t>Table 1. Questionnaire-only model on the test set (5 seeds, mean ± standard deviation) by share of hidden answers.</w:t>
+        <w:t>Table 3. Questionnaire-only model on the test set (5 seeds, mean ± standard deviation) by share of hidden answers.</w:t>
       </w:r>
     </w:p>
     <w:tbl>
@@ -2922,7 +2922,7 @@
         <w:jc w:val="both"/>
       </w:pPr>
       <w:r>
-        <w:t>The first complete E1 comparison uses EfficientNet-B0, the class-weighted loss and the same five seeds for all three arms (Table 2). The photo-only model reaches a macro-F1 of 0.537 ± 0.038, the concatenation fusion model 0.516 ± 0.057 and the questionnaire-only model 0.390 ± 0.038. To compare two models on the same seeds we use a paired test: for each seed the difference between the two models is computed, and the test checks whether the mean difference differs from 0. The fusion minus photo difference is −0.021 ± 0.031, and the paired t-test [27] gives p = 0.20 (the Wilcoxon signed-rank test, which does not assume a normal distribution, gives p = 0.31). The p-value is the probability of a difference at least this large if the models were in fact equally good; a value above 0.05 means the difference is not statistically significant. With only five seeds the test has little power, so the result shows that in this configuration the questionnaire does not improve classification, not that it harms it.</w:t>
+        <w:t>The first complete E1 comparison uses EfficientNet-B0, the class-weighted loss and the same five seeds for all three arms (Table 4). The photo-only model reaches a macro-F1 of 0.537 ± 0.038, the concatenation fusion model 0.516 ± 0.057 and the questionnaire-only model 0.390 ± 0.038. To compare two models on the same seeds we use a paired test: for each seed the difference between the two models is computed, and the test checks whether the mean difference differs from 0. The fusion minus photo difference is −0.021 ± 0.031, and the paired t-test [27] gives p = 0.20 (the Wilcoxon signed-rank test, which does not assume a normal distribution, gives p = 0.31). The p-value is the probability of a difference at least this large if the models were in fact equally good; a value above 0.05 means the difference is not statistically significant. With only five seeds the test has little power, so the result shows that in this configuration the questionnaire does not improve classification, not that it harms it.</w:t>
       </w:r>
     </w:p>
     <w:p>
@@ -2930,7 +2930,7 @@
         <w:jc w:val="both"/>
       </w:pPr>
       <w:r>
-        <w:t>Table 2. Test results of the three E1 arms (mean ± standard deviation over 5 seeds, all answers available).</w:t>
+        <w:t>Table 4. Test results of the three E1 arms (mean ± standard deviation over 5 seeds, all answers available).</w:t>
       </w:r>
     </w:p>
     <w:tbl>
@@ -3201,7 +3201,7 @@
         <w:t>ml/run_e1.py</w:t>
       </w:r>
       <w:r>
-        <w:t xml:space="preserve"> trains three more variants on the same five seeds: gated fusion, FiLM fusion and concatenation fusion without modality dropout. We also add an ensemble of the two separately trained models: the probabilities of the photo-only and the questionnaire-only model are combined by a weighted geometric mean (log-linear pooling) [29], p ∝ p_photo^w · p_questionnaire^(1−w), with the weight w chosen on the validation set from 0, 0.1, ..., 1, without retraining. If the ensemble beat the photo-only model, the questionnaire would hold information the photo lacks but the jointly trained models fail to use. All models are tested on exactly the same cases, and differences are computed pairwise on those cases with seed-stratified bootstrap confidence intervals (cases are resampled within each seed's test set and the difference is averaged over seeds). Results are in Table 3 and in </w:t>
+        <w:t xml:space="preserve"> trains three more variants on the same five seeds: gated fusion, FiLM fusion and concatenation fusion without modality dropout. We also add an ensemble of the two separately trained models: the probabilities of the photo-only and the questionnaire-only model are combined by a weighted geometric mean (log-linear pooling) [29], p ∝ p_photo^w · p_questionnaire^(1−w), with the weight w chosen on the validation set from 0, 0.1, ..., 1, without retraining. If the ensemble beat the photo-only model, the questionnaire would hold information the photo lacks but the jointly trained models fail to use. All models are tested on exactly the same cases, and differences are computed pairwise on those cases with seed-stratified bootstrap confidence intervals (cases are resampled within each seed's test set and the difference is averaged over seeds). Results are in Table 5 and in </w:t>
       </w:r>
       <w:r>
         <w:rPr>
@@ -3229,7 +3229,7 @@
         <w:jc w:val="both"/>
       </w:pPr>
       <w:r>
-        <w:t>Table 3. All E1 arms on the test set (EfficientNet-B0, weighted loss, 5 seeds; mean ± standard deviation, seed-stratified bootstrap confidence interval; paired differences on the same cases).</w:t>
+        <w:t>Table 5. All E1 arms on the test set (EfficientNet-B0, weighted loss, 5 seeds; mean ± standard deviation, seed-stratified bootstrap confidence interval; paired differences on the same cases).</w:t>
       </w:r>
     </w:p>
     <w:tbl>
@@ -3744,7 +3744,7 @@
         <w:jc w:val="both"/>
       </w:pPr>
       <w:r>
-        <w:t>Over ten seeds (Table 4), the photo-only model reaches a macro-F1 of 0.519 ± 0.040, and none of the variants that use the questionnaire beats it: concatenation −0.005 [95% CI −0.024, +0.014], better in 6 of 10 seeds; FiLM +0.000 [−0.023, +0.023], 5/10; concatenation without dropout −0.014 [−0.035, +0.006]; ensemble −0.021 [−0.047, +0.003]. Gated fusion is even worse: −0.030 [−0.053, −0.007], better in only 2 of 10 seeds (Wilcoxon p = 0.037). The small lead of FiLM over the first five seeds (+0.008) disappeared, which shows why five seeds are not enough. The narrower intervals allow a firmer conclusion: with 95% confidence, any gain from the questionnaire in this configuration is smaller than about 0.02 macro-F1 (the upper end of the interval is +0.023 for FiLM and +0.014 for concatenation).</w:t>
+        <w:t>Over ten seeds (Table 6), the photo-only model reaches a macro-F1 of 0.519 ± 0.040, and none of the variants that use the questionnaire beats it: concatenation −0.005 [95% CI −0.024, +0.014], better in 6 of 10 seeds; FiLM +0.000 [−0.023, +0.023], 5/10; concatenation without dropout −0.014 [−0.035, +0.006]; ensemble −0.021 [−0.047, +0.003]. Gated fusion is even worse: −0.030 [−0.053, −0.007], better in only 2 of 10 seeds (Wilcoxon p = 0.037). The small lead of FiLM over the first five seeds (+0.008) disappeared, which shows why five seeds are not enough. The narrower intervals allow a firmer conclusion: with 95% confidence, any gain from the questionnaire in this configuration is smaller than about 0.02 macro-F1 (the upper end of the interval is +0.023 for FiLM and +0.014 for concatenation).</w:t>
       </w:r>
     </w:p>
     <w:p>
@@ -3752,7 +3752,7 @@
         <w:jc w:val="both"/>
       </w:pPr>
       <w:r>
-        <w:t>Table 4. All E1 arms over ten seeds (EfficientNet-B0, weighted loss; mean ± standard deviation; paired differences on the same cases, seed-stratified bootstrap interval).</w:t>
+        <w:t>Table 6. All E1 arms over ten seeds (EfficientNet-B0, weighted loss; mean ± standard deviation; paired differences on the same cases, seed-stratified bootstrap interval).</w:t>
       </w:r>
     </w:p>
     <w:tbl>
@@ -4309,7 +4309,7 @@
         <w:t>ml/results/e2/</w:t>
       </w:r>
       <w:r>
-        <w:t>). Table 5 shows test macro-F1.</w:t>
+        <w:t>). Table 7 shows test macro-F1.</w:t>
       </w:r>
     </w:p>
     <w:p>
@@ -4325,7 +4325,7 @@
         <w:jc w:val="both"/>
       </w:pPr>
       <w:r>
-        <w:t>Table 5. Test macro-F1 by the share r of hidden questions over ten seeds (concatenation fusion, EfficientNet-B0; mean ± standard deviation; last column: paired difference with 95% bootstrap interval).</w:t>
+        <w:t>Table 7. Test macro-F1 by the share r of hidden questions over ten seeds (concatenation fusion, EfficientNet-B0; mean ± standard deviation; last column: paired difference with 95% bootstrap interval).</w:t>
       </w:r>
     </w:p>
     <w:tbl>
@@ -4782,7 +4782,7 @@
         <w:t>ml/run_stacking.py</w:t>
       </w:r>
       <w:r>
-        <w:t>; ten seeds). Four variants use exactly the same photo predictions, so their difference isolates the questionnaire's contribution: photo only, photo plus raw answers, photo plus the probabilities of a questionnaire MLP also trained out-of-fold, and questionnaire only. Unlike fusion, these models do use the questionnaire (hiding answers changes their output), but they do not gain from it (Table 6): photo plus answers -0.020 [-0.044, +0.006], photo plus MLP -0.005 [-0.020, +0.011] against the photo-only combiner. The photo-only combiner is slightly below the E1 photo-only model (-0.023) because each fold model sees only 80% of the training cases.</w:t>
+        <w:t>; ten seeds). Four variants use exactly the same photo predictions, so their difference isolates the questionnaire's contribution: photo only, photo plus raw answers, photo plus the probabilities of a questionnaire MLP also trained out-of-fold, and questionnaire only. Unlike fusion, these models do use the questionnaire (hiding answers changes their output), but they do not gain from it (Table 8): photo plus answers -0.020 [-0.044, +0.006], photo plus MLP -0.005 [-0.020, +0.011] against the photo-only combiner. The photo-only combiner is slightly below the E1 photo-only model (-0.023) because each fold model sees only 80% of the training cases.</w:t>
       </w:r>
     </w:p>
     <w:p>
@@ -4790,7 +4790,7 @@
         <w:jc w:val="both"/>
       </w:pPr>
       <w:r>
-        <w:t>Table 6. Method checks (test, macro-F1; stacking over ten seeds, paired differences against the photo-only combiner with 95% bootstrap interval, or ± standard deviation for the synthetic question).</w:t>
+        <w:t>Table 8. Method checks (test, macro-F1; stacking over ten seeds, paired differences against the photo-only combiner with 95% bootstrap interval, or ± standard deviation for the synthetic question).</w:t>
       </w:r>
     </w:p>
     <w:tbl>
@@ -5255,7 +5255,7 @@
         <w:jc w:val="both"/>
       </w:pPr>
       <w:r>
-        <w:t>Table 7. Experiment E7 (ten seeds; mean ± standard deviation; paired difference against the photo-only model with 95% bootstrap interval and number of seeds better).</w:t>
+        <w:t>Table 9. Experiment E7 (ten seeds; mean ± standard deviation; paired difference against the photo-only model with 95% bootstrap interval and number of seeds better).</w:t>
       </w:r>
     </w:p>
     <w:tbl>
@@ -5500,7 +5500,7 @@
         <w:jc w:val="both"/>
       </w:pPr>
       <w:r>
-        <w:t>The results (Table 7) answer no to the question whether the extra images help the app's target. On the SCIN test split, pooling lowers macro-F1 by 0.035 [-0.071, -0.002] (better in only 2 of 10 seeds; paired t-test p = 0.016), and balanced accuracy (mean per-category recall) falls from 0.610 to 0.499. Sequential transfer lowers macro-F1 by 0.024 [-0.049, +0.001] (3/10 seeds). By category, pooling raises eczema_dermatitis F1 (+0.042) but lowers redness_rosacea (-0.107) and acne (-0.057). On the Fitzpatrick17k fold, in contrast, pooling raises macro-F1 from 0.410 (zero-shot) to 0.626 (+0.216, 10/10 seeds), and the skin-tone gap almost disappears (I-II 0.633, III-IV 0.615, V-VI 0.606, against 0.429 / 0.380 / 0.353 zero-shot). Sequential transfer keeps only part of this gain (0.464).</w:t>
+        <w:t>The results (Table 9) answer no to the question whether the extra images help the app's target. On the SCIN test split, pooling lowers macro-F1 by 0.035 [-0.071, -0.002] (better in only 2 of 10 seeds; paired t-test p = 0.016), and balanced accuracy (mean per-category recall) falls from 0.610 to 0.499. Sequential transfer lowers macro-F1 by 0.024 [-0.049, +0.001] (3/10 seeds). By category, pooling raises eczema_dermatitis F1 (+0.042) but lowers redness_rosacea (-0.107) and acne (-0.057). On the Fitzpatrick17k fold, in contrast, pooling raises macro-F1 from 0.410 (zero-shot) to 0.626 (+0.216, 10/10 seeds), and the skin-tone gap almost disappears (I-II 0.633, III-IV 0.615, V-VI 0.606, against 0.429 / 0.380 / 0.353 zero-shot). Sequential transfer keeps only part of this gain (0.464).</w:t>
       </w:r>
     </w:p>
     <w:p>
@@ -5509,6 +5509,2272 @@
       </w:pPr>
       <w:r>
         <w:t>The interpretation is that more images help only when they resemble the photos the model will be used on. Clinical atlas photos differ in framing, lighting and category composition (normal_other means mostly psoriasis), and the pooled model adapts its decisions to them at the expense of smartphone photos. The large gain on Fitzpatrick17k is an in-domain gain (training and test from the same source), not an improvement of the app model. Two conclusions follow for the paper: the SCIN-only model remains the chosen one, and the skin-tone gap seen zero-shot is largely a domain-shift effect, since it nearly vanishes once the model sees data from the same source.</w:t>
+      </w:r>
+    </w:p>
+    <w:p>
+      <w:pPr>
+        <w:pStyle w:val="Heading2"/>
+      </w:pPr>
+      <w:r>
+        <w:t>4.9 Missing answers by field and natural missingness (E2, completed)</w:t>
+      </w:r>
+    </w:p>
+    <w:p>
+      <w:pPr>
+        <w:jc w:val="both"/>
+      </w:pPr>
+      <w:r>
+        <w:t>Section 4.6 hid a random share of the answers. Three checks complete experiment E2 (</w:t>
+      </w:r>
+      <w:r>
+        <w:rPr>
+          <w:rFonts w:ascii="Courier New" w:hAnsi="Courier New" w:eastAsia="Courier New" w:cs="Courier New"/>
+          <w:sz w:val="19"/>
+        </w:rPr>
+        <w:t>ml/eval_missingness.py</w:t>
+      </w:r>
+      <w:r>
+        <w:t>, ten seeds, the same test cases). (1) Field-wise removal: each question (age group, body area, symptoms, texture, duration, skin type) is hidden for every case, and separately only that question is kept while all others are hidden. A hidden field gets features 0 and mask 1, exactly like a skipped answer (no imputation, i.e. the missing value is never guessed). (2) Natural missingness: test cases are grouped by how many questions the SCIN contributor actually left blank: complete (none), partial (some) and empty (all). Age is left out of the count because 'age unknown' is encoded as an explicit answer, so that question is never missing. (3) The curve of macro-F1 against the share of hidden answers (Figure 1). Each difference is reported as the mean over seeds, the 95% confidence interval based on the t distribution (over the ten paired differences), the number of seeds where it is negative, and the Holm-adjusted p-value (a multiple-comparison correction: each test is judged at a stricter threshold so that the chance of any false positive across the family of tests stays at 5%).</w:t>
+      </w:r>
+    </w:p>
+    <w:p>
+      <w:pPr>
+        <w:jc w:val="both"/>
+      </w:pPr>
+      <w:r>
+        <w:t>No field matters. Hiding any single question changes macro-F1 by at most 0.008 in any of the four fusion models (concatenation without dropout, with fixed dropout, with random dropout, and FiLM), and no effect survives the Holm correction. Keeping only one question gives the same picture (drops of 0.000-0.010, all with intervals that include or touch 0). This confirms Sections 4.5-4.7: the fusion model uses the questionnaire very little, so there is no particular field whose absence hurts it.</w:t>
+      </w:r>
+    </w:p>
+    <w:p>
+      <w:pPr>
+        <w:jc w:val="both"/>
+      </w:pPr>
+      <w:r>
+        <w:t>On naturally missing questionnaires, a small difference between trainings appears. Per seed there are on average 139 complete, 95 partial and 37 empty test cases. On the empty cases, concatenation trained without hidden answers is 0.041 below the photo-only model (interval [-0.097, +0.014]), while the variants trained with hidden answers are level with it (+0.009 fixed dropout, +0.006 random dropout, +0.002 FiLM). The intervals include 0, so this is only a hint: a model that never saw an empty questionnaire in training may do worse when it meets one. For the app the practical conclusion is unchanged: the photo-only model is at least as good at every level of completion (Figure 1).</w:t>
+      </w:r>
+    </w:p>
+    <w:p>
+      <w:pPr>
+        <w:jc w:val="both"/>
+      </w:pPr>
+      <w:r>
+        <w:drawing>
+          <wp:inline xmlns:a="http://schemas.openxmlformats.org/drawingml/2006/main" xmlns:pic="http://schemas.openxmlformats.org/drawingml/2006/picture">
+            <wp:extent cx="5303520" cy="3480435"/>
+            <wp:docPr id="1" name="Picture 1"/>
+            <wp:cNvGraphicFramePr>
+              <a:graphicFrameLocks noChangeAspect="1"/>
+            </wp:cNvGraphicFramePr>
+            <a:graphic>
+              <a:graphicData uri="http://schemas.openxmlformats.org/drawingml/2006/picture">
+                <pic:pic>
+                  <pic:nvPicPr>
+                    <pic:cNvPr id="0" name="e2_curve.png"/>
+                    <pic:cNvPicPr/>
+                  </pic:nvPicPr>
+                  <pic:blipFill>
+                    <a:blip r:embed="rId10"/>
+                    <a:stretch>
+                      <a:fillRect/>
+                    </a:stretch>
+                  </pic:blipFill>
+                  <pic:spPr>
+                    <a:xfrm>
+                      <a:off x="0" y="0"/>
+                      <a:ext cx="5303520" cy="3480435"/>
+                    </a:xfrm>
+                    <a:prstGeom prst="rect"/>
+                  </pic:spPr>
+                </pic:pic>
+              </a:graphicData>
+            </a:graphic>
+          </wp:inline>
+        </w:drawing>
+      </w:r>
+    </w:p>
+    <w:p>
+      <w:pPr>
+        <w:jc w:val="both"/>
+      </w:pPr>
+      <w:r>
+        <w:t>Figure 1. SCIN test macro-F1 against the share of answers hidden at test time (mean and 95% confidence interval over ten seeds). Dashed line: the photo-only model, which does not read the questionnaire.</w:t>
+      </w:r>
+    </w:p>
+    <w:p>
+      <w:pPr>
+        <w:pStyle w:val="Heading2"/>
+      </w:pPr>
+      <w:r>
+        <w:t>4.10 Frozen pre-trained encoders and linear probe (E5)</w:t>
+      </w:r>
+    </w:p>
+    <w:p>
+      <w:pPr>
+        <w:jc w:val="both"/>
+      </w:pPr>
+      <w:r>
+        <w:t>Experiment E5 compares the fine-tuned EfficientNet-B0 (all layers trained on SCIN, Section 4.4) with frozen encoders followed by a linear probe. A frozen encoder is a pre-trained network whose weights are no longer changed: each image is turned once into a feature vector. The linear probe is a single linear layer trained on these features, with the same class weighting as the reference model and an L2 penalty (a term that shrinks the weights to avoid overfitting) chosen on validation. The probe measures how useful the features are for our categories as they are.</w:t>
+      </w:r>
+    </w:p>
+    <w:p>
+      <w:pPr>
+        <w:jc w:val="both"/>
+      </w:pPr>
+      <w:r>
+        <w:t>Six encoders from three families were compared. (1) Supervised on ImageNet: EfficientNet-B0 (the same network, but not fine-tuned) and a Vision Transformer ViT-B/16 [39] pre-trained on ImageNet-21k (14 million images, 21,000 classes). A Vision Transformer splits the image into small squares (patches) and processes them with attention, which weighs how much each patch matters to the others. (2) General self-supervised: DINOv2 ViT-B/14 [40], trained without labels on 142 million curated images by learning to give two different views of the same image similar features. (3) Dermatology foundation models. A foundation model is a large model pre-trained on very much and very varied data, meant to be reused for many tasks. PanDerm [22] is pre-trained self-supervised on over two million skin-disease images (clinical, dermoscopic and other modalities), in two sizes: Base (ViT-B/16, about 86 million parameters) and Large (ViT-L/16, about 303 million). DermLIP [23] is a CLIP-style image-text model [21] (contrastive training: an image and its description are pulled together in one feature space and mismatched pairs are pushed apart), trained on about one million dermatology image-text pairs; only its image encoder (ViT-B/16) is used. The PanDerm weights were loaded into the timm ViT implementation; the conversion was checked against the authors' code (maximum feature difference 2e-6, i.e. numerical rounding only).</w:t>
+      </w:r>
+    </w:p>
+    <w:p>
+      <w:pPr>
+        <w:jc w:val="both"/>
+      </w:pPr>
+      <w:r>
+        <w:t>Table 10. Experiment E5 on the SCIN test split (ten seeds; mean ± standard deviation; paired macro-F1 difference with 95% bootstrap interval and number of seeds better).</w:t>
+      </w:r>
+    </w:p>
+    <w:tbl>
+      <w:tblPr>
+        <w:tblStyle w:val="TableGrid"/>
+        <w:tblW w:type="auto" w:w="0"/>
+        <w:tblLook w:firstColumn="1" w:firstRow="1" w:lastColumn="0" w:lastRow="0" w:noHBand="0" w:noVBand="1" w:val="04A0"/>
+      </w:tblPr>
+      <w:tblGrid>
+        <w:gridCol w:w="1814"/>
+        <w:gridCol w:w="1814"/>
+        <w:gridCol w:w="1814"/>
+        <w:gridCol w:w="1814"/>
+        <w:gridCol w:w="1814"/>
+      </w:tblGrid>
+      <w:tr>
+        <w:tc>
+          <w:tcPr>
+            <w:tcW w:type="dxa" w:w="1814"/>
+          </w:tcPr>
+          <w:p>
+            <w:r>
+              <w:rPr>
+                <w:b/>
+              </w:rPr>
+              <w:t>Model</w:t>
+            </w:r>
+          </w:p>
+        </w:tc>
+        <w:tc>
+          <w:tcPr>
+            <w:tcW w:type="dxa" w:w="1814"/>
+          </w:tcPr>
+          <w:p>
+            <w:r>
+              <w:rPr>
+                <w:b/>
+              </w:rPr>
+              <w:t>Macro-F1</w:t>
+            </w:r>
+          </w:p>
+        </w:tc>
+        <w:tc>
+          <w:tcPr>
+            <w:tcW w:type="dxa" w:w="1814"/>
+          </w:tcPr>
+          <w:p>
+            <w:r>
+              <w:rPr>
+                <w:b/>
+              </w:rPr>
+              <w:t>Balanced accuracy</w:t>
+            </w:r>
+          </w:p>
+        </w:tc>
+        <w:tc>
+          <w:tcPr>
+            <w:tcW w:type="dxa" w:w="1814"/>
+          </w:tcPr>
+          <w:p>
+            <w:r>
+              <w:rPr>
+                <w:b/>
+              </w:rPr>
+              <w:t>ECE</w:t>
+            </w:r>
+          </w:p>
+        </w:tc>
+        <w:tc>
+          <w:tcPr>
+            <w:tcW w:type="dxa" w:w="1814"/>
+          </w:tcPr>
+          <w:p>
+            <w:r>
+              <w:rPr>
+                <w:b/>
+              </w:rPr>
+              <w:t>Difference vs fine-tuned model</w:t>
+            </w:r>
+          </w:p>
+        </w:tc>
+      </w:tr>
+      <w:tr>
+        <w:tc>
+          <w:tcPr>
+            <w:tcW w:type="dxa" w:w="1814"/>
+          </w:tcPr>
+          <w:p>
+            <w:r>
+              <w:t>EfficientNet-B0, fine-tuned (reference)</w:t>
+            </w:r>
+          </w:p>
+        </w:tc>
+        <w:tc>
+          <w:tcPr>
+            <w:tcW w:type="dxa" w:w="1814"/>
+          </w:tcPr>
+          <w:p>
+            <w:r>
+              <w:t>0.519 ± 0.040</w:t>
+            </w:r>
+          </w:p>
+        </w:tc>
+        <w:tc>
+          <w:tcPr>
+            <w:tcW w:type="dxa" w:w="1814"/>
+          </w:tcPr>
+          <w:p>
+            <w:r>
+              <w:t>0.610 ± 0.038</w:t>
+            </w:r>
+          </w:p>
+        </w:tc>
+        <w:tc>
+          <w:tcPr>
+            <w:tcW w:type="dxa" w:w="1814"/>
+          </w:tcPr>
+          <w:p>
+            <w:r>
+              <w:t>0.079 ± 0.017</w:t>
+            </w:r>
+          </w:p>
+        </w:tc>
+        <w:tc>
+          <w:tcPr>
+            <w:tcW w:type="dxa" w:w="1814"/>
+          </w:tcPr>
+          <w:p>
+            <w:r>
+              <w:t>reference</w:t>
+            </w:r>
+          </w:p>
+        </w:tc>
+      </w:tr>
+      <w:tr>
+        <w:tc>
+          <w:tcPr>
+            <w:tcW w:type="dxa" w:w="1814"/>
+          </w:tcPr>
+          <w:p>
+            <w:r>
+              <w:t>EfficientNet-B0 ImageNet, frozen + linear probe</w:t>
+            </w:r>
+          </w:p>
+        </w:tc>
+        <w:tc>
+          <w:tcPr>
+            <w:tcW w:type="dxa" w:w="1814"/>
+          </w:tcPr>
+          <w:p>
+            <w:r>
+              <w:t>0.447 ± 0.029</w:t>
+            </w:r>
+          </w:p>
+        </w:tc>
+        <w:tc>
+          <w:tcPr>
+            <w:tcW w:type="dxa" w:w="1814"/>
+          </w:tcPr>
+          <w:p>
+            <w:r>
+              <w:t>0.543 ± 0.065</w:t>
+            </w:r>
+          </w:p>
+        </w:tc>
+        <w:tc>
+          <w:tcPr>
+            <w:tcW w:type="dxa" w:w="1814"/>
+          </w:tcPr>
+          <w:p>
+            <w:r>
+              <w:t>0.139 ± 0.090</w:t>
+            </w:r>
+          </w:p>
+        </w:tc>
+        <w:tc>
+          <w:tcPr>
+            <w:tcW w:type="dxa" w:w="1814"/>
+          </w:tcPr>
+          <w:p>
+            <w:r>
+              <w:t>-0.072 [-0.099, -0.044], 0/10</w:t>
+            </w:r>
+          </w:p>
+        </w:tc>
+      </w:tr>
+      <w:tr>
+        <w:tc>
+          <w:tcPr>
+            <w:tcW w:type="dxa" w:w="1814"/>
+          </w:tcPr>
+          <w:p>
+            <w:r>
+              <w:t>ViT-B/16 ImageNet-21k, frozen + linear probe</w:t>
+            </w:r>
+          </w:p>
+        </w:tc>
+        <w:tc>
+          <w:tcPr>
+            <w:tcW w:type="dxa" w:w="1814"/>
+          </w:tcPr>
+          <w:p>
+            <w:r>
+              <w:t>0.450 ± 0.043</w:t>
+            </w:r>
+          </w:p>
+        </w:tc>
+        <w:tc>
+          <w:tcPr>
+            <w:tcW w:type="dxa" w:w="1814"/>
+          </w:tcPr>
+          <w:p>
+            <w:r>
+              <w:t>0.542 ± 0.069</w:t>
+            </w:r>
+          </w:p>
+        </w:tc>
+        <w:tc>
+          <w:tcPr>
+            <w:tcW w:type="dxa" w:w="1814"/>
+          </w:tcPr>
+          <w:p>
+            <w:r>
+              <w:t>0.095 ± 0.028</w:t>
+            </w:r>
+          </w:p>
+        </w:tc>
+        <w:tc>
+          <w:tcPr>
+            <w:tcW w:type="dxa" w:w="1814"/>
+          </w:tcPr>
+          <w:p>
+            <w:r>
+              <w:t>-0.069 [-0.097, -0.039], 0/10</w:t>
+            </w:r>
+          </w:p>
+        </w:tc>
+      </w:tr>
+      <w:tr>
+        <w:tc>
+          <w:tcPr>
+            <w:tcW w:type="dxa" w:w="1814"/>
+          </w:tcPr>
+          <w:p>
+            <w:r>
+              <w:t>ViT-B/14 DINOv2, frozen + linear probe</w:t>
+            </w:r>
+          </w:p>
+        </w:tc>
+        <w:tc>
+          <w:tcPr>
+            <w:tcW w:type="dxa" w:w="1814"/>
+          </w:tcPr>
+          <w:p>
+            <w:r>
+              <w:t>0.551 ± 0.064</w:t>
+            </w:r>
+          </w:p>
+        </w:tc>
+        <w:tc>
+          <w:tcPr>
+            <w:tcW w:type="dxa" w:w="1814"/>
+          </w:tcPr>
+          <w:p>
+            <w:r>
+              <w:t>0.635 ± 0.059</w:t>
+            </w:r>
+          </w:p>
+        </w:tc>
+        <w:tc>
+          <w:tcPr>
+            <w:tcW w:type="dxa" w:w="1814"/>
+          </w:tcPr>
+          <w:p>
+            <w:r>
+              <w:t>0.083 ± 0.027</w:t>
+            </w:r>
+          </w:p>
+        </w:tc>
+        <w:tc>
+          <w:tcPr>
+            <w:tcW w:type="dxa" w:w="1814"/>
+          </w:tcPr>
+          <w:p>
+            <w:r>
+              <w:t>+0.032 [+0.005, +0.061], 7/10</w:t>
+            </w:r>
+          </w:p>
+        </w:tc>
+      </w:tr>
+      <w:tr>
+        <w:tc>
+          <w:tcPr>
+            <w:tcW w:type="dxa" w:w="1814"/>
+          </w:tcPr>
+          <w:p>
+            <w:r>
+              <w:t>PanDerm-Base ViT-B/16, frozen + linear probe</w:t>
+            </w:r>
+          </w:p>
+        </w:tc>
+        <w:tc>
+          <w:tcPr>
+            <w:tcW w:type="dxa" w:w="1814"/>
+          </w:tcPr>
+          <w:p>
+            <w:r>
+              <w:t>0.553 ± 0.049</w:t>
+            </w:r>
+          </w:p>
+        </w:tc>
+        <w:tc>
+          <w:tcPr>
+            <w:tcW w:type="dxa" w:w="1814"/>
+          </w:tcPr>
+          <w:p>
+            <w:r>
+              <w:t>0.642 ± 0.071</w:t>
+            </w:r>
+          </w:p>
+        </w:tc>
+        <w:tc>
+          <w:tcPr>
+            <w:tcW w:type="dxa" w:w="1814"/>
+          </w:tcPr>
+          <w:p>
+            <w:r>
+              <w:t>0.128 ± 0.071</w:t>
+            </w:r>
+          </w:p>
+        </w:tc>
+        <w:tc>
+          <w:tcPr>
+            <w:tcW w:type="dxa" w:w="1814"/>
+          </w:tcPr>
+          <w:p>
+            <w:r>
+              <w:t>+0.034 [+0.003, +0.066], 8/10</w:t>
+            </w:r>
+          </w:p>
+        </w:tc>
+      </w:tr>
+      <w:tr>
+        <w:tc>
+          <w:tcPr>
+            <w:tcW w:type="dxa" w:w="1814"/>
+          </w:tcPr>
+          <w:p>
+            <w:r>
+              <w:t>PanDerm-Large ViT-L/16, frozen + linear probe</w:t>
+            </w:r>
+          </w:p>
+        </w:tc>
+        <w:tc>
+          <w:tcPr>
+            <w:tcW w:type="dxa" w:w="1814"/>
+          </w:tcPr>
+          <w:p>
+            <w:r>
+              <w:t>0.566 ± 0.044</w:t>
+            </w:r>
+          </w:p>
+        </w:tc>
+        <w:tc>
+          <w:tcPr>
+            <w:tcW w:type="dxa" w:w="1814"/>
+          </w:tcPr>
+          <w:p>
+            <w:r>
+              <w:t>0.662 ± 0.065</w:t>
+            </w:r>
+          </w:p>
+        </w:tc>
+        <w:tc>
+          <w:tcPr>
+            <w:tcW w:type="dxa" w:w="1814"/>
+          </w:tcPr>
+          <w:p>
+            <w:r>
+              <w:t>0.113 ± 0.062</w:t>
+            </w:r>
+          </w:p>
+        </w:tc>
+        <w:tc>
+          <w:tcPr>
+            <w:tcW w:type="dxa" w:w="1814"/>
+          </w:tcPr>
+          <w:p>
+            <w:r>
+              <w:t>+0.047 [+0.017, +0.078], 7/10</w:t>
+            </w:r>
+          </w:p>
+        </w:tc>
+      </w:tr>
+      <w:tr>
+        <w:tc>
+          <w:tcPr>
+            <w:tcW w:type="dxa" w:w="1814"/>
+          </w:tcPr>
+          <w:p>
+            <w:r>
+              <w:t>DermLIP ViT-B/16, frozen + linear probe</w:t>
+            </w:r>
+          </w:p>
+        </w:tc>
+        <w:tc>
+          <w:tcPr>
+            <w:tcW w:type="dxa" w:w="1814"/>
+          </w:tcPr>
+          <w:p>
+            <w:r>
+              <w:t>0.603 ± 0.046</w:t>
+            </w:r>
+          </w:p>
+        </w:tc>
+        <w:tc>
+          <w:tcPr>
+            <w:tcW w:type="dxa" w:w="1814"/>
+          </w:tcPr>
+          <w:p>
+            <w:r>
+              <w:t>0.689 ± 0.056</w:t>
+            </w:r>
+          </w:p>
+        </w:tc>
+        <w:tc>
+          <w:tcPr>
+            <w:tcW w:type="dxa" w:w="1814"/>
+          </w:tcPr>
+          <w:p>
+            <w:r>
+              <w:t>0.161 ± 0.115</w:t>
+            </w:r>
+          </w:p>
+        </w:tc>
+        <w:tc>
+          <w:tcPr>
+            <w:tcW w:type="dxa" w:w="1814"/>
+          </w:tcPr>
+          <w:p>
+            <w:r>
+              <w:t>+0.084 [+0.052, +0.114], 10/10</w:t>
+            </w:r>
+          </w:p>
+        </w:tc>
+      </w:tr>
+    </w:tbl>
+    <w:p>
+      <w:pPr>
+        <w:jc w:val="both"/>
+      </w:pPr>
+      <w:r>
+        <w:t>Table 10 gives the results. The probes on ImageNet features stay well below the fine-tuned model (-0.072 and -0.069 macro-F1, worse in all ten seeds): for networks trained on ImageNet labels, fine-tuning on skin is needed. The other four encoders exceed the fine-tuned model, in the order of how close their pre-training data are to dermatology: DINOv2 +0.032 [+0.005, +0.061] (7/10 seeds, paired t-test p = 0.185), PanDerm-Base +0.034 (8/10, p = 0.069), PanDerm-Large +0.047 [+0.017, +0.078] (7/10, p = 0.022) and DermLIP +0.084 [+0.052, +0.114], better in all ten seeds (p &lt; 0.001; Wilcoxon p = 0.002). DermLIP reaches macro-F1 0.603 and balanced accuracy 0.689. The gains are positive for every skin tone; for DermLIP they survive the Holm correction for eFST I-II, eMST 1-3 and eMST 4-6, and for acne (+0.163), eczema_dermatitis (+0.066) and normal_other (+0.156). For redness_rosacea every probe is weaker or level (DermLIP -0.050, interval including 0; PanDerm-Large -0.119), but this category has only 6 test cases per seed on average.</w:t>
+      </w:r>
+    </w:p>
+    <w:p>
+      <w:pPr>
+        <w:jc w:val="both"/>
+      </w:pPr>
+      <w:r>
+        <w:t>Two limits matter for the app. The first is calibration: the expected calibration error ECE (the mean gap between the confidence shown and the actual accuracy) is higher for the PanDerm and DermLIP probes (0.113-0.161) than for the fine-tuned model (0.079); correcting it is the subject of Section 4.11. The second is the licence: PanDerm and DermLIP are released under CC BY-NC-ND 4.0, which allows only non-commercial research and forbids distributing modified versions, whereas DINOv2 is Apache 2.0, which also allows commercial use.</w:t>
+      </w:r>
+    </w:p>
+    <w:p>
+      <w:pPr>
+        <w:pStyle w:val="Heading2"/>
+      </w:pPr>
+      <w:r>
+        <w:t>4.11 Calibration and abstention by skin tone (E4)</w:t>
+      </w:r>
+    </w:p>
+    <w:p>
+      <w:pPr>
+        <w:jc w:val="both"/>
+      </w:pPr>
+      <w:r>
+        <w:t>Experiment E4 answers RQ4: when the model says "not sure, please see a professional", does it do so equally often and equally correctly for every skin tone? Five models are compared on the same SCIN test cases and the same ten seeds: the fine-tuned EfficientNet-B0, FiLM fusion (the best fusion arm in E1) and the DINOv2, PanDerm-Large and DermLIP probes from E5 (</w:t>
+      </w:r>
+      <w:r>
+        <w:rPr>
+          <w:rFonts w:ascii="Courier New" w:hAnsi="Courier New" w:eastAsia="Courier New" w:cs="Courier New"/>
+          <w:sz w:val="19"/>
+        </w:rPr>
+        <w:t>ml/run_e4.py</w:t>
+      </w:r>
+      <w:r>
+        <w:t xml:space="preserve">, </w:t>
+      </w:r>
+      <w:r>
+        <w:rPr>
+          <w:rFonts w:ascii="Courier New" w:hAnsi="Courier New" w:eastAsia="Courier New" w:cs="Courier New"/>
+          <w:sz w:val="19"/>
+        </w:rPr>
+        <w:t>ml/calibrate.py</w:t>
+      </w:r>
+      <w:r>
+        <w:t xml:space="preserve">, </w:t>
+      </w:r>
+      <w:r>
+        <w:rPr>
+          <w:rFonts w:ascii="Courier New" w:hAnsi="Courier New" w:eastAsia="Courier New" w:cs="Courier New"/>
+          <w:sz w:val="19"/>
+        </w:rPr>
+        <w:t>ml/abstain.py</w:t>
+      </w:r>
+      <w:r>
+        <w:t>).</w:t>
+      </w:r>
+    </w:p>
+    <w:p>
+      <w:pPr>
+        <w:jc w:val="both"/>
+      </w:pPr>
+      <w:r>
+        <w:t>Calibration. A model is well calibrated if, among the cases where it shows 70% confidence, about 70% are correct. Temperature scaling [13] divides the model's raw outputs (logits) by one number T before the softmax: T &gt; 1 lowers confidences that are too high, T &lt; 1 raises those that are too low, and the predicted class does not change. T is chosen on validation, per seed, by minimising the negative log-likelihood (NLL, the mean of -log of the probability given to the true class; lower is better). For models that stored only probabilities, logits are taken as log-probabilities (the softmax does not change when the same constant is added to every logit); for EfficientNet-B0 and FiLM the full probabilities were recomputed from the checkpoints, and the predictions matched the stored ones 100%.</w:t>
+      </w:r>
+    </w:p>
+    <w:p>
+      <w:pPr>
+        <w:jc w:val="both"/>
+      </w:pPr>
+      <w:r>
+        <w:t>Abstention. The rule is: the model answers only if its calibrated confidence is at least tau; otherwise it shows the advice to see a professional. tau is chosen on validation so that 80% of cases get an answer (80% coverage) and is applied unchanged on test. Fixing the coverage rather than tau makes the models comparable: each may abstain on the same share of cases, so the question is only whether it abstains on the right cases, and equally often for every skin tone. Reported are the abstention rate, the selective accuracy (accuracy on the cases the model answers), the abstention precision (share of declined cases that would have been wrong) and the risk-coverage curve [14] (error rate on the answered cases when only the most confident x% are kept) with the area under it, AURC (lower is better; T does not change it because it keeps the order of the confidences). Group intervals come from a case bootstrap within each seed; group differences are paired and not corrected for multiple comparisons.</w:t>
+      </w:r>
+    </w:p>
+    <w:p>
+      <w:pPr>
+        <w:jc w:val="both"/>
+      </w:pPr>
+      <w:r>
+        <w:t>Overall results (Table 11, Figure 2). Temperature scaling brings every model to a similar calibration error (ECE 0.061-0.079): for the PanDerm-Large and DermLIP probes the error almost halves (0.113 → 0.067 and 0.161 → 0.077), while for the already calibrated EfficientNet-B0 T is close to 1. The probes separate right from wrong answers by confidence much better: AURC drops against EfficientNet-B0 by 0.089 (DINOv2), 0.119 (PanDerm-Large) and 0.116 (DermLIP), in all ten seeds; FiLM fusion gives a small gain (-0.023, 8/10). At 80% coverage the selective accuracy is 0.607 for EfficientNet-B0 and 0.720 for DermLIP.</w:t>
+      </w:r>
+    </w:p>
+    <w:p>
+      <w:pPr>
+        <w:jc w:val="both"/>
+      </w:pPr>
+      <w:r>
+        <w:t>Table 11. Calibration and selective prediction on the SCIN test split (means over ten seeds; target coverage 80%, tau chosen on validation).</w:t>
+      </w:r>
+    </w:p>
+    <w:tbl>
+      <w:tblPr>
+        <w:tblStyle w:val="TableGrid"/>
+        <w:tblW w:type="auto" w:w="0"/>
+        <w:tblLook w:firstColumn="1" w:firstRow="1" w:lastColumn="0" w:lastRow="0" w:noHBand="0" w:noVBand="1" w:val="04A0"/>
+      </w:tblPr>
+      <w:tblGrid>
+        <w:gridCol w:w="1512"/>
+        <w:gridCol w:w="1512"/>
+        <w:gridCol w:w="1512"/>
+        <w:gridCol w:w="1512"/>
+        <w:gridCol w:w="1512"/>
+        <w:gridCol w:w="1512"/>
+      </w:tblGrid>
+      <w:tr>
+        <w:tc>
+          <w:tcPr>
+            <w:tcW w:type="dxa" w:w="1512"/>
+          </w:tcPr>
+          <w:p>
+            <w:r>
+              <w:rPr>
+                <w:b/>
+              </w:rPr>
+              <w:t>Model</w:t>
+            </w:r>
+          </w:p>
+        </w:tc>
+        <w:tc>
+          <w:tcPr>
+            <w:tcW w:type="dxa" w:w="1512"/>
+          </w:tcPr>
+          <w:p>
+            <w:r>
+              <w:rPr>
+                <w:b/>
+              </w:rPr>
+              <w:t>T</w:t>
+            </w:r>
+          </w:p>
+        </w:tc>
+        <w:tc>
+          <w:tcPr>
+            <w:tcW w:type="dxa" w:w="1512"/>
+          </w:tcPr>
+          <w:p>
+            <w:r>
+              <w:rPr>
+                <w:b/>
+              </w:rPr>
+              <w:t>ECE before → after</w:t>
+            </w:r>
+          </w:p>
+        </w:tc>
+        <w:tc>
+          <w:tcPr>
+            <w:tcW w:type="dxa" w:w="1512"/>
+          </w:tcPr>
+          <w:p>
+            <w:r>
+              <w:rPr>
+                <w:b/>
+              </w:rPr>
+              <w:t>AURC</w:t>
+            </w:r>
+          </w:p>
+        </w:tc>
+        <w:tc>
+          <w:tcPr>
+            <w:tcW w:type="dxa" w:w="1512"/>
+          </w:tcPr>
+          <w:p>
+            <w:r>
+              <w:rPr>
+                <w:b/>
+              </w:rPr>
+              <w:t>Accuracy</w:t>
+            </w:r>
+          </w:p>
+        </w:tc>
+        <w:tc>
+          <w:tcPr>
+            <w:tcW w:type="dxa" w:w="1512"/>
+          </w:tcPr>
+          <w:p>
+            <w:r>
+              <w:rPr>
+                <w:b/>
+              </w:rPr>
+              <w:t>Selective accuracy (80%)</w:t>
+            </w:r>
+          </w:p>
+        </w:tc>
+      </w:tr>
+      <w:tr>
+        <w:tc>
+          <w:tcPr>
+            <w:tcW w:type="dxa" w:w="1512"/>
+          </w:tcPr>
+          <w:p>
+            <w:r>
+              <w:t>EfficientNet-B0, fine-tuned</w:t>
+            </w:r>
+          </w:p>
+        </w:tc>
+        <w:tc>
+          <w:tcPr>
+            <w:tcW w:type="dxa" w:w="1512"/>
+          </w:tcPr>
+          <w:p>
+            <w:r>
+              <w:t>0.93</w:t>
+            </w:r>
+          </w:p>
+        </w:tc>
+        <w:tc>
+          <w:tcPr>
+            <w:tcW w:type="dxa" w:w="1512"/>
+          </w:tcPr>
+          <w:p>
+            <w:r>
+              <w:t>0.079 → 0.074</w:t>
+            </w:r>
+          </w:p>
+        </w:tc>
+        <w:tc>
+          <w:tcPr>
+            <w:tcW w:type="dxa" w:w="1512"/>
+          </w:tcPr>
+          <w:p>
+            <w:r>
+              <w:t>0.345</w:t>
+            </w:r>
+          </w:p>
+        </w:tc>
+        <w:tc>
+          <w:tcPr>
+            <w:tcW w:type="dxa" w:w="1512"/>
+          </w:tcPr>
+          <w:p>
+            <w:r>
+              <w:t>0.564</w:t>
+            </w:r>
+          </w:p>
+        </w:tc>
+        <w:tc>
+          <w:tcPr>
+            <w:tcW w:type="dxa" w:w="1512"/>
+          </w:tcPr>
+          <w:p>
+            <w:r>
+              <w:t>0.607</w:t>
+            </w:r>
+          </w:p>
+        </w:tc>
+      </w:tr>
+      <w:tr>
+        <w:tc>
+          <w:tcPr>
+            <w:tcW w:type="dxa" w:w="1512"/>
+          </w:tcPr>
+          <w:p>
+            <w:r>
+              <w:t>FiLM fusion (photo + questionnaire)</w:t>
+            </w:r>
+          </w:p>
+        </w:tc>
+        <w:tc>
+          <w:tcPr>
+            <w:tcW w:type="dxa" w:w="1512"/>
+          </w:tcPr>
+          <w:p>
+            <w:r>
+              <w:t>1.01</w:t>
+            </w:r>
+          </w:p>
+        </w:tc>
+        <w:tc>
+          <w:tcPr>
+            <w:tcW w:type="dxa" w:w="1512"/>
+          </w:tcPr>
+          <w:p>
+            <w:r>
+              <w:t>0.076 → 0.079</w:t>
+            </w:r>
+          </w:p>
+        </w:tc>
+        <w:tc>
+          <w:tcPr>
+            <w:tcW w:type="dxa" w:w="1512"/>
+          </w:tcPr>
+          <w:p>
+            <w:r>
+              <w:t>0.322</w:t>
+            </w:r>
+          </w:p>
+        </w:tc>
+        <w:tc>
+          <w:tcPr>
+            <w:tcW w:type="dxa" w:w="1512"/>
+          </w:tcPr>
+          <w:p>
+            <w:r>
+              <w:t>0.584</w:t>
+            </w:r>
+          </w:p>
+        </w:tc>
+        <w:tc>
+          <w:tcPr>
+            <w:tcW w:type="dxa" w:w="1512"/>
+          </w:tcPr>
+          <w:p>
+            <w:r>
+              <w:t>0.616</w:t>
+            </w:r>
+          </w:p>
+        </w:tc>
+      </w:tr>
+      <w:tr>
+        <w:tc>
+          <w:tcPr>
+            <w:tcW w:type="dxa" w:w="1512"/>
+          </w:tcPr>
+          <w:p>
+            <w:r>
+              <w:t>DINOv2 + linear probe</w:t>
+            </w:r>
+          </w:p>
+        </w:tc>
+        <w:tc>
+          <w:tcPr>
+            <w:tcW w:type="dxa" w:w="1512"/>
+          </w:tcPr>
+          <w:p>
+            <w:r>
+              <w:t>1.06</w:t>
+            </w:r>
+          </w:p>
+        </w:tc>
+        <w:tc>
+          <w:tcPr>
+            <w:tcW w:type="dxa" w:w="1512"/>
+          </w:tcPr>
+          <w:p>
+            <w:r>
+              <w:t>0.083 → 0.061</w:t>
+            </w:r>
+          </w:p>
+        </w:tc>
+        <w:tc>
+          <w:tcPr>
+            <w:tcW w:type="dxa" w:w="1512"/>
+          </w:tcPr>
+          <w:p>
+            <w:r>
+              <w:t>0.256</w:t>
+            </w:r>
+          </w:p>
+        </w:tc>
+        <w:tc>
+          <w:tcPr>
+            <w:tcW w:type="dxa" w:w="1512"/>
+          </w:tcPr>
+          <w:p>
+            <w:r>
+              <w:t>0.626</w:t>
+            </w:r>
+          </w:p>
+        </w:tc>
+        <w:tc>
+          <w:tcPr>
+            <w:tcW w:type="dxa" w:w="1512"/>
+          </w:tcPr>
+          <w:p>
+            <w:r>
+              <w:t>0.676</w:t>
+            </w:r>
+          </w:p>
+        </w:tc>
+      </w:tr>
+      <w:tr>
+        <w:tc>
+          <w:tcPr>
+            <w:tcW w:type="dxa" w:w="1512"/>
+          </w:tcPr>
+          <w:p>
+            <w:r>
+              <w:t>PanDerm-Large + linear probe</w:t>
+            </w:r>
+          </w:p>
+        </w:tc>
+        <w:tc>
+          <w:tcPr>
+            <w:tcW w:type="dxa" w:w="1512"/>
+          </w:tcPr>
+          <w:p>
+            <w:r>
+              <w:t>1.44</w:t>
+            </w:r>
+          </w:p>
+        </w:tc>
+        <w:tc>
+          <w:tcPr>
+            <w:tcW w:type="dxa" w:w="1512"/>
+          </w:tcPr>
+          <w:p>
+            <w:r>
+              <w:t>0.113 → 0.067</w:t>
+            </w:r>
+          </w:p>
+        </w:tc>
+        <w:tc>
+          <w:tcPr>
+            <w:tcW w:type="dxa" w:w="1512"/>
+          </w:tcPr>
+          <w:p>
+            <w:r>
+              <w:t>0.226</w:t>
+            </w:r>
+          </w:p>
+        </w:tc>
+        <w:tc>
+          <w:tcPr>
+            <w:tcW w:type="dxa" w:w="1512"/>
+          </w:tcPr>
+          <w:p>
+            <w:r>
+              <w:t>0.641</w:t>
+            </w:r>
+          </w:p>
+        </w:tc>
+        <w:tc>
+          <w:tcPr>
+            <w:tcW w:type="dxa" w:w="1512"/>
+          </w:tcPr>
+          <w:p>
+            <w:r>
+              <w:t>0.699</w:t>
+            </w:r>
+          </w:p>
+        </w:tc>
+      </w:tr>
+      <w:tr>
+        <w:tc>
+          <w:tcPr>
+            <w:tcW w:type="dxa" w:w="1512"/>
+          </w:tcPr>
+          <w:p>
+            <w:r>
+              <w:t>DermLIP + linear probe</w:t>
+            </w:r>
+          </w:p>
+        </w:tc>
+        <w:tc>
+          <w:tcPr>
+            <w:tcW w:type="dxa" w:w="1512"/>
+          </w:tcPr>
+          <w:p>
+            <w:r>
+              <w:t>1.15</w:t>
+            </w:r>
+          </w:p>
+        </w:tc>
+        <w:tc>
+          <w:tcPr>
+            <w:tcW w:type="dxa" w:w="1512"/>
+          </w:tcPr>
+          <w:p>
+            <w:r>
+              <w:t>0.161 → 0.077</w:t>
+            </w:r>
+          </w:p>
+        </w:tc>
+        <w:tc>
+          <w:tcPr>
+            <w:tcW w:type="dxa" w:w="1512"/>
+          </w:tcPr>
+          <w:p>
+            <w:r>
+              <w:t>0.229</w:t>
+            </w:r>
+          </w:p>
+        </w:tc>
+        <w:tc>
+          <w:tcPr>
+            <w:tcW w:type="dxa" w:w="1512"/>
+          </w:tcPr>
+          <w:p>
+            <w:r>
+              <w:t>0.670</w:t>
+            </w:r>
+          </w:p>
+        </w:tc>
+        <w:tc>
+          <w:tcPr>
+            <w:tcW w:type="dxa" w:w="1512"/>
+          </w:tcPr>
+          <w:p>
+            <w:r>
+              <w:t>0.720</w:t>
+            </w:r>
+          </w:p>
+        </w:tc>
+      </w:tr>
+    </w:tbl>
+    <w:p>
+      <w:pPr>
+        <w:jc w:val="both"/>
+      </w:pPr>
+      <w:r>
+        <w:drawing>
+          <wp:inline xmlns:a="http://schemas.openxmlformats.org/drawingml/2006/main" xmlns:pic="http://schemas.openxmlformats.org/drawingml/2006/picture">
+            <wp:extent cx="5303520" cy="3480435"/>
+            <wp:docPr id="2" name="Picture 2"/>
+            <wp:cNvGraphicFramePr>
+              <a:graphicFrameLocks noChangeAspect="1"/>
+            </wp:cNvGraphicFramePr>
+            <a:graphic>
+              <a:graphicData uri="http://schemas.openxmlformats.org/drawingml/2006/picture">
+                <pic:pic>
+                  <pic:nvPicPr>
+                    <pic:cNvPr id="0" name="e4_risk_coverage.png"/>
+                    <pic:cNvPicPr/>
+                  </pic:nvPicPr>
+                  <pic:blipFill>
+                    <a:blip r:embed="rId11"/>
+                    <a:stretch>
+                      <a:fillRect/>
+                    </a:stretch>
+                  </pic:blipFill>
+                  <pic:spPr>
+                    <a:xfrm>
+                      <a:off x="0" y="0"/>
+                      <a:ext cx="5303520" cy="3480435"/>
+                    </a:xfrm>
+                    <a:prstGeom prst="rect"/>
+                  </pic:spPr>
+                </pic:pic>
+              </a:graphicData>
+            </a:graphic>
+          </wp:inline>
+        </w:drawing>
+      </w:r>
+    </w:p>
+    <w:p>
+      <w:pPr>
+        <w:jc w:val="both"/>
+      </w:pPr>
+      <w:r>
+        <w:t>Figure 2. Risk-coverage curve on the SCIN test split (mean over ten seeds): error rate on the answered cases when only the most confident x% are kept.</w:t>
+      </w:r>
+    </w:p>
+    <w:p>
+      <w:pPr>
+        <w:jc w:val="both"/>
+      </w:pPr>
+      <w:r>
+        <w:t>Results by skin tone (Table 12, Figure 3). On SCIN the abstention rate is almost the same for every eFST and eMST group (20-25%); the only difference whose interval excludes 0 is that FiLM fusion abstains less often on eFST V-VI (-6.0 percentage points). Correctness, however, is not equal: on eMST 4-6 cases the selective accuracy is lower than on eMST 1-3 for every model (-4.6 to -8.9 points, all intervals below 0). The abstention rule therefore does not remove the gap, because the model is not more uncertain where it is more often wrong. The foundation-model probes narrow the gap (from -8.9 to between -4.6 and -6.4 points) but do not close it. On Fitzpatrick17k (zero-shot, with the SCIN T and tau, intervals from an image-level bootstrap) EfficientNet-B0 abstains more often on dark skin (27.5% for eFST I-II, 38.8% for V-VI; +11.2 [8.0, 14.1] points) and, when it answers, is less accurate (-5.0 [-9.5, -0.4] points). On photos from an unfamiliar domain, the advice to see a professional would thus appear more often for people with dark skin.</w:t>
+      </w:r>
+    </w:p>
+    <w:p>
+      <w:pPr>
+        <w:jc w:val="both"/>
+      </w:pPr>
+      <w:r>
+        <w:t>Table 12. Abstention by skin tone (SCIN test cases of ten seeds; differences in percentage points with 95% bootstrap interval).</w:t>
+      </w:r>
+    </w:p>
+    <w:tbl>
+      <w:tblPr>
+        <w:tblStyle w:val="TableGrid"/>
+        <w:tblW w:type="auto" w:w="0"/>
+        <w:tblLook w:firstColumn="1" w:firstRow="1" w:lastColumn="0" w:lastRow="0" w:noHBand="0" w:noVBand="1" w:val="04A0"/>
+      </w:tblPr>
+      <w:tblGrid>
+        <w:gridCol w:w="1512"/>
+        <w:gridCol w:w="1512"/>
+        <w:gridCol w:w="1512"/>
+        <w:gridCol w:w="1512"/>
+        <w:gridCol w:w="1512"/>
+        <w:gridCol w:w="1512"/>
+      </w:tblGrid>
+      <w:tr>
+        <w:tc>
+          <w:tcPr>
+            <w:tcW w:type="dxa" w:w="1512"/>
+          </w:tcPr>
+          <w:p>
+            <w:r>
+              <w:rPr>
+                <w:b/>
+              </w:rPr>
+              <w:t>Model</w:t>
+            </w:r>
+          </w:p>
+        </w:tc>
+        <w:tc>
+          <w:tcPr>
+            <w:tcW w:type="dxa" w:w="1512"/>
+          </w:tcPr>
+          <w:p>
+            <w:r>
+              <w:rPr>
+                <w:b/>
+              </w:rPr>
+              <w:t>Abstention eFST I-II (%)</w:t>
+            </w:r>
+          </w:p>
+        </w:tc>
+        <w:tc>
+          <w:tcPr>
+            <w:tcW w:type="dxa" w:w="1512"/>
+          </w:tcPr>
+          <w:p>
+            <w:r>
+              <w:rPr>
+                <w:b/>
+              </w:rPr>
+              <w:t>III-IV (%)</w:t>
+            </w:r>
+          </w:p>
+        </w:tc>
+        <w:tc>
+          <w:tcPr>
+            <w:tcW w:type="dxa" w:w="1512"/>
+          </w:tcPr>
+          <w:p>
+            <w:r>
+              <w:rPr>
+                <w:b/>
+              </w:rPr>
+              <w:t>V-VI (%)</w:t>
+            </w:r>
+          </w:p>
+        </w:tc>
+        <w:tc>
+          <w:tcPr>
+            <w:tcW w:type="dxa" w:w="1512"/>
+          </w:tcPr>
+          <w:p>
+            <w:r>
+              <w:rPr>
+                <w:b/>
+              </w:rPr>
+              <w:t>V-VI minus I-II</w:t>
+            </w:r>
+          </w:p>
+        </w:tc>
+        <w:tc>
+          <w:tcPr>
+            <w:tcW w:type="dxa" w:w="1512"/>
+          </w:tcPr>
+          <w:p>
+            <w:r>
+              <w:rPr>
+                <w:b/>
+              </w:rPr>
+              <w:t>Selective accuracy eMST 4-6 minus 1-3</w:t>
+            </w:r>
+          </w:p>
+        </w:tc>
+      </w:tr>
+      <w:tr>
+        <w:tc>
+          <w:tcPr>
+            <w:tcW w:type="dxa" w:w="1512"/>
+          </w:tcPr>
+          <w:p>
+            <w:r>
+              <w:t>EfficientNet-B0, fine-tuned</w:t>
+            </w:r>
+          </w:p>
+        </w:tc>
+        <w:tc>
+          <w:tcPr>
+            <w:tcW w:type="dxa" w:w="1512"/>
+          </w:tcPr>
+          <w:p>
+            <w:r>
+              <w:t>22.0</w:t>
+            </w:r>
+          </w:p>
+        </w:tc>
+        <w:tc>
+          <w:tcPr>
+            <w:tcW w:type="dxa" w:w="1512"/>
+          </w:tcPr>
+          <w:p>
+            <w:r>
+              <w:t>21.5</w:t>
+            </w:r>
+          </w:p>
+        </w:tc>
+        <w:tc>
+          <w:tcPr>
+            <w:tcW w:type="dxa" w:w="1512"/>
+          </w:tcPr>
+          <w:p>
+            <w:r>
+              <w:t>21.2</w:t>
+            </w:r>
+          </w:p>
+        </w:tc>
+        <w:tc>
+          <w:tcPr>
+            <w:tcW w:type="dxa" w:w="1512"/>
+          </w:tcPr>
+          <w:p>
+            <w:r>
+              <w:t>-0.8 [-7.1, +5.3]</w:t>
+            </w:r>
+          </w:p>
+        </w:tc>
+        <w:tc>
+          <w:tcPr>
+            <w:tcW w:type="dxa" w:w="1512"/>
+          </w:tcPr>
+          <w:p>
+            <w:r>
+              <w:t>-8.9 [-13.9, -4.1]</w:t>
+            </w:r>
+          </w:p>
+        </w:tc>
+      </w:tr>
+      <w:tr>
+        <w:tc>
+          <w:tcPr>
+            <w:tcW w:type="dxa" w:w="1512"/>
+          </w:tcPr>
+          <w:p>
+            <w:r>
+              <w:t>FiLM fusion</w:t>
+            </w:r>
+          </w:p>
+        </w:tc>
+        <w:tc>
+          <w:tcPr>
+            <w:tcW w:type="dxa" w:w="1512"/>
+          </w:tcPr>
+          <w:p>
+            <w:r>
+              <w:t>20.2</w:t>
+            </w:r>
+          </w:p>
+        </w:tc>
+        <w:tc>
+          <w:tcPr>
+            <w:tcW w:type="dxa" w:w="1512"/>
+          </w:tcPr>
+          <w:p>
+            <w:r>
+              <w:t>20.4</w:t>
+            </w:r>
+          </w:p>
+        </w:tc>
+        <w:tc>
+          <w:tcPr>
+            <w:tcW w:type="dxa" w:w="1512"/>
+          </w:tcPr>
+          <w:p>
+            <w:r>
+              <w:t>14.2</w:t>
+            </w:r>
+          </w:p>
+        </w:tc>
+        <w:tc>
+          <w:tcPr>
+            <w:tcW w:type="dxa" w:w="1512"/>
+          </w:tcPr>
+          <w:p>
+            <w:r>
+              <w:t>-6.0 [-10.8, -0.5]</w:t>
+            </w:r>
+          </w:p>
+        </w:tc>
+        <w:tc>
+          <w:tcPr>
+            <w:tcW w:type="dxa" w:w="1512"/>
+          </w:tcPr>
+          <w:p>
+            <w:r>
+              <w:t>-8.1 [-12.6, -3.3]</w:t>
+            </w:r>
+          </w:p>
+        </w:tc>
+      </w:tr>
+      <w:tr>
+        <w:tc>
+          <w:tcPr>
+            <w:tcW w:type="dxa" w:w="1512"/>
+          </w:tcPr>
+          <w:p>
+            <w:r>
+              <w:t>DINOv2 + probe</w:t>
+            </w:r>
+          </w:p>
+        </w:tc>
+        <w:tc>
+          <w:tcPr>
+            <w:tcW w:type="dxa" w:w="1512"/>
+          </w:tcPr>
+          <w:p>
+            <w:r>
+              <w:t>22.5</w:t>
+            </w:r>
+          </w:p>
+        </w:tc>
+        <w:tc>
+          <w:tcPr>
+            <w:tcW w:type="dxa" w:w="1512"/>
+          </w:tcPr>
+          <w:p>
+            <w:r>
+              <w:t>19.2</w:t>
+            </w:r>
+          </w:p>
+        </w:tc>
+        <w:tc>
+          <w:tcPr>
+            <w:tcW w:type="dxa" w:w="1512"/>
+          </w:tcPr>
+          <w:p>
+            <w:r>
+              <w:t>19.0</w:t>
+            </w:r>
+          </w:p>
+        </w:tc>
+        <w:tc>
+          <w:tcPr>
+            <w:tcW w:type="dxa" w:w="1512"/>
+          </w:tcPr>
+          <w:p>
+            <w:r>
+              <w:t>-3.5 [-9.0, +1.8]</w:t>
+            </w:r>
+          </w:p>
+        </w:tc>
+        <w:tc>
+          <w:tcPr>
+            <w:tcW w:type="dxa" w:w="1512"/>
+          </w:tcPr>
+          <w:p>
+            <w:r>
+              <w:t>-4.9 [-9.3, -0.4]</w:t>
+            </w:r>
+          </w:p>
+        </w:tc>
+      </w:tr>
+      <w:tr>
+        <w:tc>
+          <w:tcPr>
+            <w:tcW w:type="dxa" w:w="1512"/>
+          </w:tcPr>
+          <w:p>
+            <w:r>
+              <w:t>PanDerm-Large + probe</w:t>
+            </w:r>
+          </w:p>
+        </w:tc>
+        <w:tc>
+          <w:tcPr>
+            <w:tcW w:type="dxa" w:w="1512"/>
+          </w:tcPr>
+          <w:p>
+            <w:r>
+              <w:t>21.2</w:t>
+            </w:r>
+          </w:p>
+        </w:tc>
+        <w:tc>
+          <w:tcPr>
+            <w:tcW w:type="dxa" w:w="1512"/>
+          </w:tcPr>
+          <w:p>
+            <w:r>
+              <w:t>20.1</w:t>
+            </w:r>
+          </w:p>
+        </w:tc>
+        <w:tc>
+          <w:tcPr>
+            <w:tcW w:type="dxa" w:w="1512"/>
+          </w:tcPr>
+          <w:p>
+            <w:r>
+              <w:t>25.2</w:t>
+            </w:r>
+          </w:p>
+        </w:tc>
+        <w:tc>
+          <w:tcPr>
+            <w:tcW w:type="dxa" w:w="1512"/>
+          </w:tcPr>
+          <w:p>
+            <w:r>
+              <w:t>+4.0 [-1.7, +10.1]</w:t>
+            </w:r>
+          </w:p>
+        </w:tc>
+        <w:tc>
+          <w:tcPr>
+            <w:tcW w:type="dxa" w:w="1512"/>
+          </w:tcPr>
+          <w:p>
+            <w:r>
+              <w:t>-4.6 [-9.2, -0.2]</w:t>
+            </w:r>
+          </w:p>
+        </w:tc>
+      </w:tr>
+      <w:tr>
+        <w:tc>
+          <w:tcPr>
+            <w:tcW w:type="dxa" w:w="1512"/>
+          </w:tcPr>
+          <w:p>
+            <w:r>
+              <w:t>DermLIP + probe</w:t>
+            </w:r>
+          </w:p>
+        </w:tc>
+        <w:tc>
+          <w:tcPr>
+            <w:tcW w:type="dxa" w:w="1512"/>
+          </w:tcPr>
+          <w:p>
+            <w:r>
+              <w:t>20.3</w:t>
+            </w:r>
+          </w:p>
+        </w:tc>
+        <w:tc>
+          <w:tcPr>
+            <w:tcW w:type="dxa" w:w="1512"/>
+          </w:tcPr>
+          <w:p>
+            <w:r>
+              <w:t>21.0</w:t>
+            </w:r>
+          </w:p>
+        </w:tc>
+        <w:tc>
+          <w:tcPr>
+            <w:tcW w:type="dxa" w:w="1512"/>
+          </w:tcPr>
+          <w:p>
+            <w:r>
+              <w:t>24.8</w:t>
+            </w:r>
+          </w:p>
+        </w:tc>
+        <w:tc>
+          <w:tcPr>
+            <w:tcW w:type="dxa" w:w="1512"/>
+          </w:tcPr>
+          <w:p>
+            <w:r>
+              <w:t>+4.5 [-1.7, +10.2]</w:t>
+            </w:r>
+          </w:p>
+        </w:tc>
+        <w:tc>
+          <w:tcPr>
+            <w:tcW w:type="dxa" w:w="1512"/>
+          </w:tcPr>
+          <w:p>
+            <w:r>
+              <w:t>-6.4 [-10.8, -1.7]</w:t>
+            </w:r>
+          </w:p>
+        </w:tc>
+      </w:tr>
+    </w:tbl>
+    <w:p>
+      <w:pPr>
+        <w:jc w:val="both"/>
+      </w:pPr>
+      <w:r>
+        <w:drawing>
+          <wp:inline xmlns:a="http://schemas.openxmlformats.org/drawingml/2006/main" xmlns:pic="http://schemas.openxmlformats.org/drawingml/2006/picture">
+            <wp:extent cx="5760720" cy="2280285"/>
+            <wp:docPr id="3" name="Picture 3"/>
+            <wp:cNvGraphicFramePr>
+              <a:graphicFrameLocks noChangeAspect="1"/>
+            </wp:cNvGraphicFramePr>
+            <a:graphic>
+              <a:graphicData uri="http://schemas.openxmlformats.org/drawingml/2006/picture">
+                <pic:pic>
+                  <pic:nvPicPr>
+                    <pic:cNvPr id="0" name="e4_abstention_by_tone.png"/>
+                    <pic:cNvPicPr/>
+                  </pic:nvPicPr>
+                  <pic:blipFill>
+                    <a:blip r:embed="rId12"/>
+                    <a:stretch>
+                      <a:fillRect/>
+                    </a:stretch>
+                  </pic:blipFill>
+                  <pic:spPr>
+                    <a:xfrm>
+                      <a:off x="0" y="0"/>
+                      <a:ext cx="5760720" cy="2280285"/>
+                    </a:xfrm>
+                    <a:prstGeom prst="rect"/>
+                  </pic:spPr>
+                </pic:pic>
+              </a:graphicData>
+            </a:graphic>
+          </wp:inline>
+        </w:drawing>
+      </w:r>
+    </w:p>
+    <w:p>
+      <w:pPr>
+        <w:jc w:val="both"/>
+      </w:pPr>
+      <w:r>
+        <w:t>Figure 3. Abstention rate by eFST and eMST group at 80% coverage (95% bootstrap interval).</w:t>
+      </w:r>
+    </w:p>
+    <w:p>
+      <w:pPr>
+        <w:jc w:val="both"/>
+      </w:pPr>
+      <w:r>
+        <w:t>Answer to RQ4: in the training domain the models are uncertain equally often for every tone, but not equally correctly: for eMST 4-6 the answers they do give are more often wrong. Outside the domain, abstention grows with skin tone. Three decisions follow for the app: the confidence shown is the calibrated one; tau is set for the desired coverage and checked per tone; the candidate model is a probe on a foundation model. DermLIP and PanDerm score best, but their licence allows only non-commercial research; DINOv2 (Apache 2.0) still beats EfficientNet-B0 by 0.069 selective accuracy and has the lowest calibration error after scaling (0.061), so it is the option for an app that can be distributed.</w:t>
+      </w:r>
+    </w:p>
+    <w:p>
+      <w:pPr>
+        <w:jc w:val="both"/>
+      </w:pPr>
+      <w:r>
+        <w:t>Extended external check. Both candidate models (EfficientNet-B0 and DINOv2 + probe) were applied, with their SCIN T and tau, to every image of Fitzpatrick17k (16,571) and DDI [18] (656 biopsy-confirmed images, balanced over tones: 208 FST I-II, 241 III-IV, 207 V-VI; all files were checked: complete, readable, no exact duplicates). The images are split into in scope (the diagnosis maps to one of our four categories) and out of scope (any other diagnosis, which the model never saw; here the right answer is to abstain). DDI has only 178 in-scope images, 172 of them normal_other (nevi and warts), so it gives no useful macro-F1, but it contains 171 malignant lesions (for example melanoma), all out of scope. Intervals come from a bootstrap over whole images, since the same images are scored by all ten models.</w:t>
+      </w:r>
+    </w:p>
+    <w:p>
+      <w:pPr>
+        <w:jc w:val="both"/>
+      </w:pPr>
+      <w:r>
+        <w:t>Table 13. Candidate models on the external sets, zero-shot, with the SCIN T and tau (means over ten models; out of scope and for malignant lesions, abstaining is the right answer).</w:t>
+      </w:r>
+    </w:p>
+    <w:tbl>
+      <w:tblPr>
+        <w:tblStyle w:val="TableGrid"/>
+        <w:tblW w:type="auto" w:w="0"/>
+        <w:tblLook w:firstColumn="1" w:firstRow="1" w:lastColumn="0" w:lastRow="0" w:noHBand="0" w:noVBand="1" w:val="04A0"/>
+      </w:tblPr>
+      <w:tblGrid>
+        <w:gridCol w:w="1512"/>
+        <w:gridCol w:w="1512"/>
+        <w:gridCol w:w="1512"/>
+        <w:gridCol w:w="1512"/>
+        <w:gridCol w:w="1512"/>
+        <w:gridCol w:w="1512"/>
+      </w:tblGrid>
+      <w:tr>
+        <w:tc>
+          <w:tcPr>
+            <w:tcW w:type="dxa" w:w="1512"/>
+          </w:tcPr>
+          <w:p>
+            <w:r>
+              <w:rPr>
+                <w:b/>
+              </w:rPr>
+              <w:t>Set</w:t>
+            </w:r>
+          </w:p>
+        </w:tc>
+        <w:tc>
+          <w:tcPr>
+            <w:tcW w:type="dxa" w:w="1512"/>
+          </w:tcPr>
+          <w:p>
+            <w:r>
+              <w:rPr>
+                <w:b/>
+              </w:rPr>
+              <w:t>Model</w:t>
+            </w:r>
+          </w:p>
+        </w:tc>
+        <w:tc>
+          <w:tcPr>
+            <w:tcW w:type="dxa" w:w="1512"/>
+          </w:tcPr>
+          <w:p>
+            <w:r>
+              <w:rPr>
+                <w:b/>
+              </w:rPr>
+              <w:t>In-scope accuracy (%)</w:t>
+            </w:r>
+          </w:p>
+        </w:tc>
+        <w:tc>
+          <w:tcPr>
+            <w:tcW w:type="dxa" w:w="1512"/>
+          </w:tcPr>
+          <w:p>
+            <w:r>
+              <w:rPr>
+                <w:b/>
+              </w:rPr>
+              <w:t>In-scope abstention FST I-II / V-VI (%)</w:t>
+            </w:r>
+          </w:p>
+        </w:tc>
+        <w:tc>
+          <w:tcPr>
+            <w:tcW w:type="dxa" w:w="1512"/>
+          </w:tcPr>
+          <w:p>
+            <w:r>
+              <w:rPr>
+                <w:b/>
+              </w:rPr>
+              <w:t>Out-of-scope abstention: all (I-II / V-VI) (%)</w:t>
+            </w:r>
+          </w:p>
+        </w:tc>
+        <w:tc>
+          <w:tcPr>
+            <w:tcW w:type="dxa" w:w="1512"/>
+          </w:tcPr>
+          <w:p>
+            <w:r>
+              <w:rPr>
+                <w:b/>
+              </w:rPr>
+              <w:t>Malignant lesions answered confidently (%)</w:t>
+            </w:r>
+          </w:p>
+        </w:tc>
+      </w:tr>
+      <w:tr>
+        <w:tc>
+          <w:tcPr>
+            <w:tcW w:type="dxa" w:w="1512"/>
+          </w:tcPr>
+          <w:p>
+            <w:r>
+              <w:t>Fitzpatrick17k</w:t>
+            </w:r>
+          </w:p>
+        </w:tc>
+        <w:tc>
+          <w:tcPr>
+            <w:tcW w:type="dxa" w:w="1512"/>
+          </w:tcPr>
+          <w:p>
+            <w:r>
+              <w:t>EfficientNet-B0</w:t>
+            </w:r>
+          </w:p>
+        </w:tc>
+        <w:tc>
+          <w:tcPr>
+            <w:tcW w:type="dxa" w:w="1512"/>
+          </w:tcPr>
+          <w:p>
+            <w:r>
+              <w:t>42.9</w:t>
+            </w:r>
+          </w:p>
+        </w:tc>
+        <w:tc>
+          <w:tcPr>
+            <w:tcW w:type="dxa" w:w="1512"/>
+          </w:tcPr>
+          <w:p>
+            <w:r>
+              <w:t>27.5 / 38.8</w:t>
+            </w:r>
+          </w:p>
+        </w:tc>
+        <w:tc>
+          <w:tcPr>
+            <w:tcW w:type="dxa" w:w="1512"/>
+          </w:tcPr>
+          <w:p>
+            <w:r>
+              <w:t>31.6 (29.9 / 36.0)</w:t>
+            </w:r>
+          </w:p>
+        </w:tc>
+        <w:tc>
+          <w:tcPr>
+            <w:tcW w:type="dxa" w:w="1512"/>
+          </w:tcPr>
+          <w:p>
+            <w:r>
+              <w:t>-</w:t>
+            </w:r>
+          </w:p>
+        </w:tc>
+      </w:tr>
+      <w:tr>
+        <w:tc>
+          <w:tcPr>
+            <w:tcW w:type="dxa" w:w="1512"/>
+          </w:tcPr>
+          <w:p>
+            <w:r>
+              <w:t>Fitzpatrick17k</w:t>
+            </w:r>
+          </w:p>
+        </w:tc>
+        <w:tc>
+          <w:tcPr>
+            <w:tcW w:type="dxa" w:w="1512"/>
+          </w:tcPr>
+          <w:p>
+            <w:r>
+              <w:t>DINOv2 + probe</w:t>
+            </w:r>
+          </w:p>
+        </w:tc>
+        <w:tc>
+          <w:tcPr>
+            <w:tcW w:type="dxa" w:w="1512"/>
+          </w:tcPr>
+          <w:p>
+            <w:r>
+              <w:t>53.8</w:t>
+            </w:r>
+          </w:p>
+        </w:tc>
+        <w:tc>
+          <w:tcPr>
+            <w:tcW w:type="dxa" w:w="1512"/>
+          </w:tcPr>
+          <w:p>
+            <w:r>
+              <w:t>16.6 / 14.0</w:t>
+            </w:r>
+          </w:p>
+        </w:tc>
+        <w:tc>
+          <w:tcPr>
+            <w:tcW w:type="dxa" w:w="1512"/>
+          </w:tcPr>
+          <w:p>
+            <w:r>
+              <w:t>18.6 (19.7 / 15.4)</w:t>
+            </w:r>
+          </w:p>
+        </w:tc>
+        <w:tc>
+          <w:tcPr>
+            <w:tcW w:type="dxa" w:w="1512"/>
+          </w:tcPr>
+          <w:p>
+            <w:r>
+              <w:t>-</w:t>
+            </w:r>
+          </w:p>
+        </w:tc>
+      </w:tr>
+      <w:tr>
+        <w:tc>
+          <w:tcPr>
+            <w:tcW w:type="dxa" w:w="1512"/>
+          </w:tcPr>
+          <w:p>
+            <w:r>
+              <w:t>DDI</w:t>
+            </w:r>
+          </w:p>
+        </w:tc>
+        <w:tc>
+          <w:tcPr>
+            <w:tcW w:type="dxa" w:w="1512"/>
+          </w:tcPr>
+          <w:p>
+            <w:r>
+              <w:t>EfficientNet-B0</w:t>
+            </w:r>
+          </w:p>
+        </w:tc>
+        <w:tc>
+          <w:tcPr>
+            <w:tcW w:type="dxa" w:w="1512"/>
+          </w:tcPr>
+          <w:p>
+            <w:r>
+              <w:t>45.6</w:t>
+            </w:r>
+          </w:p>
+        </w:tc>
+        <w:tc>
+          <w:tcPr>
+            <w:tcW w:type="dxa" w:w="1512"/>
+          </w:tcPr>
+          <w:p>
+            <w:r>
+              <w:t>45.9 / 46.2</w:t>
+            </w:r>
+          </w:p>
+        </w:tc>
+        <w:tc>
+          <w:tcPr>
+            <w:tcW w:type="dxa" w:w="1512"/>
+          </w:tcPr>
+          <w:p>
+            <w:r>
+              <w:t>45.5 (44.4 / 41.1)</w:t>
+            </w:r>
+          </w:p>
+        </w:tc>
+        <w:tc>
+          <w:tcPr>
+            <w:tcW w:type="dxa" w:w="1512"/>
+          </w:tcPr>
+          <w:p>
+            <w:r>
+              <w:t>55.0 (52.7 / 70.0)</w:t>
+            </w:r>
+          </w:p>
+        </w:tc>
+      </w:tr>
+      <w:tr>
+        <w:tc>
+          <w:tcPr>
+            <w:tcW w:type="dxa" w:w="1512"/>
+          </w:tcPr>
+          <w:p>
+            <w:r>
+              <w:t>DDI</w:t>
+            </w:r>
+          </w:p>
+        </w:tc>
+        <w:tc>
+          <w:tcPr>
+            <w:tcW w:type="dxa" w:w="1512"/>
+          </w:tcPr>
+          <w:p>
+            <w:r>
+              <w:t>DINOv2 + probe</w:t>
+            </w:r>
+          </w:p>
+        </w:tc>
+        <w:tc>
+          <w:tcPr>
+            <w:tcW w:type="dxa" w:w="1512"/>
+          </w:tcPr>
+          <w:p>
+            <w:r>
+              <w:t>25.6</w:t>
+            </w:r>
+          </w:p>
+        </w:tc>
+        <w:tc>
+          <w:tcPr>
+            <w:tcW w:type="dxa" w:w="1512"/>
+          </w:tcPr>
+          <w:p>
+            <w:r>
+              <w:t>28.8 / 10.4</w:t>
+            </w:r>
+          </w:p>
+        </w:tc>
+        <w:tc>
+          <w:tcPr>
+            <w:tcW w:type="dxa" w:w="1512"/>
+          </w:tcPr>
+          <w:p>
+            <w:r>
+              <w:t>21.4 (25.2 / 16.6)</w:t>
+            </w:r>
+          </w:p>
+        </w:tc>
+        <w:tc>
+          <w:tcPr>
+            <w:tcW w:type="dxa" w:w="1512"/>
+          </w:tcPr>
+          <w:p>
+            <w:r>
+              <w:t>79.5 (79.0 / 87.3)</w:t>
+            </w:r>
+          </w:p>
+        </w:tc>
+      </w:tr>
+    </w:tbl>
+    <w:p>
+      <w:pPr>
+        <w:jc w:val="both"/>
+      </w:pPr>
+      <w:r>
+        <w:t>The results (Table 13) show an important limit of the abstention rule. On the in-scope Fitzpatrick17k images DINOv2 is far more accurate than EfficientNet-B0 (53.8% against 42.9%), with no gap between tones. On out-of-scope images, however, confidence does not separate the unknown cases: DINOv2 abstains on only 18.6% of them in Fitzpatrick17k and 21.4% in DDI, about as often as on known ones, and less often on dark skin (DDI: 25.2% for FST I-II, 16.6% for V-VI). Most seriously, DINOv2 gives a confident answer with a benign category (mostly eczema_dermatitis) for 79.5% of the DDI malignant lesions (87.3% for FST V-VI); EfficientNet-B0 does so for 55.0% (70.0% for V-VI). Confidence-based abstention therefore works inside the training domain (sections above), but it cannot serve as a safety filter for serious conditions outside the four categories.</w:t>
+      </w:r>
+    </w:p>
+    <w:p>
+      <w:pPr>
+        <w:jc w:val="both"/>
+      </w:pPr>
+      <w:r>
+        <w:t>Decision for the app. The shipped model is DINOv2 ViT-B/14 with the linear probe, calibrated confidence and the threshold tau, chosen for its Apache 2.0 licence (publication and commercial use allowed), its selective accuracy of 0.676 and the lowest calibration error after scaling. The external result adds two requirements: the app always states that it does not assess suspicious lesions (changing moles, bleeding lesions) and sends them straight to a doctor, and before release a separate out-of-scope detector is added (for example the distance of the DINOv2 features to the training features), evaluated on the same external sets and by skin tone.</w:t>
+      </w:r>
+    </w:p>
+    <w:p>
+      <w:pPr>
+        <w:pStyle w:val="Heading2"/>
+      </w:pPr>
+      <w:r>
+        <w:t>4.12 Explainability: Grad-CAM and sanity check</w:t>
+      </w:r>
+    </w:p>
+    <w:p>
+      <w:pPr>
+        <w:jc w:val="both"/>
+      </w:pPr>
+      <w:r>
+        <w:t xml:space="preserve">Grad-CAM [41] explains a prediction with a heatmap: the activations of one layer are weighted by the gradient of the predicted class score, and the positive part shows the image regions that raised that score. EfficientNet-B0 uses its last convolutional layer; DINOv2 (a Vision Transformer) uses the input of its last block, with the patch tokens reshaped into their grid (37 x 37 at 518 pixels). The script </w:t>
+      </w:r>
+      <w:r>
+        <w:rPr>
+          <w:rFonts w:ascii="Courier New" w:hAnsi="Courier New" w:eastAsia="Courier New" w:cs="Courier New"/>
+          <w:sz w:val="19"/>
+        </w:rPr>
+        <w:t>ml/run_gradcam.py</w:t>
+      </w:r>
+      <w:r>
+        <w:t xml:space="preserve"> computes the map of the predicted class for every test case of the ten seeds (2,708 per model). Visual examples (correct, wrong and abstained cases per eFST group) stay local because they show SCIN photos, which are not redistributed; only numerical measures are reported.</w:t>
+      </w:r>
+    </w:p>
+    <w:p>
+      <w:pPr>
+        <w:jc w:val="both"/>
+      </w:pPr>
+      <w:r>
+        <w:t>The model-randomization sanity check [42]: a map that stays the same when the weights it should explain are destroyed explains nothing. The trained model's map is compared with the map after the classifier weights, and then also the last encoder blocks, are replaced by noise, using the Spearman correlation (rank correlation between -1 and 1; 0 = unrelated). Also measured are how focused the map is (share of its mass in the hottest 10% of pixels) and the padding ratio: map mass per pixel on the black letterbox padding relative to the image average (1 = no preference; well above 1 = the model looks at the padding, a shortcut).</w:t>
+      </w:r>
+    </w:p>
+    <w:p>
+      <w:pPr>
+        <w:jc w:val="both"/>
+      </w:pPr>
+      <w:r>
+        <w:t>Table 14. Grad-CAM on the SCIN test split (2,708 cases per model, ten seeds; rho = Spearman correlation with the trained model's map, mean ± standard deviation).</w:t>
+      </w:r>
+    </w:p>
+    <w:tbl>
+      <w:tblPr>
+        <w:tblStyle w:val="TableGrid"/>
+        <w:tblW w:type="auto" w:w="0"/>
+        <w:tblLook w:firstColumn="1" w:firstRow="1" w:lastColumn="0" w:lastRow="0" w:noHBand="0" w:noVBand="1" w:val="04A0"/>
+      </w:tblPr>
+      <w:tblGrid>
+        <w:gridCol w:w="1296"/>
+        <w:gridCol w:w="1296"/>
+        <w:gridCol w:w="1296"/>
+        <w:gridCol w:w="1296"/>
+        <w:gridCol w:w="1296"/>
+        <w:gridCol w:w="1296"/>
+        <w:gridCol w:w="1296"/>
+      </w:tblGrid>
+      <w:tr>
+        <w:tc>
+          <w:tcPr>
+            <w:tcW w:type="dxa" w:w="1296"/>
+          </w:tcPr>
+          <w:p>
+            <w:r>
+              <w:rPr>
+                <w:b/>
+              </w:rPr>
+              <w:t>Model</w:t>
+            </w:r>
+          </w:p>
+        </w:tc>
+        <w:tc>
+          <w:tcPr>
+            <w:tcW w:type="dxa" w:w="1296"/>
+          </w:tcPr>
+          <w:p>
+            <w:r>
+              <w:rPr>
+                <w:b/>
+              </w:rPr>
+              <w:t>rho, classifier randomised</w:t>
+            </w:r>
+          </w:p>
+        </w:tc>
+        <w:tc>
+          <w:tcPr>
+            <w:tcW w:type="dxa" w:w="1296"/>
+          </w:tcPr>
+          <w:p>
+            <w:r>
+              <w:rPr>
+                <w:b/>
+              </w:rPr>
+              <w:t>rho, classifier + top of encoder</w:t>
+            </w:r>
+          </w:p>
+        </w:tc>
+        <w:tc>
+          <w:tcPr>
+            <w:tcW w:type="dxa" w:w="1296"/>
+          </w:tcPr>
+          <w:p>
+            <w:r>
+              <w:rPr>
+                <w:b/>
+              </w:rPr>
+              <w:t>Cases with |rho| &lt; 0.3</w:t>
+            </w:r>
+          </w:p>
+        </w:tc>
+        <w:tc>
+          <w:tcPr>
+            <w:tcW w:type="dxa" w:w="1296"/>
+          </w:tcPr>
+          <w:p>
+            <w:r>
+              <w:rPr>
+                <w:b/>
+              </w:rPr>
+              <w:t>Mass in top 10% pixels</w:t>
+            </w:r>
+          </w:p>
+        </w:tc>
+        <w:tc>
+          <w:tcPr>
+            <w:tcW w:type="dxa" w:w="1296"/>
+          </w:tcPr>
+          <w:p>
+            <w:r>
+              <w:rPr>
+                <w:b/>
+              </w:rPr>
+              <w:t>Padding ratio (median)</w:t>
+            </w:r>
+          </w:p>
+        </w:tc>
+        <w:tc>
+          <w:tcPr>
+            <w:tcW w:type="dxa" w:w="1296"/>
+          </w:tcPr>
+          <w:p>
+            <w:r>
+              <w:rPr>
+                <w:b/>
+              </w:rPr>
+              <w:t>Cases with ratio &gt; 2</w:t>
+            </w:r>
+          </w:p>
+        </w:tc>
+      </w:tr>
+      <w:tr>
+        <w:tc>
+          <w:tcPr>
+            <w:tcW w:type="dxa" w:w="1296"/>
+          </w:tcPr>
+          <w:p>
+            <w:r>
+              <w:t>EfficientNet-B0, fine-tuned</w:t>
+            </w:r>
+          </w:p>
+        </w:tc>
+        <w:tc>
+          <w:tcPr>
+            <w:tcW w:type="dxa" w:w="1296"/>
+          </w:tcPr>
+          <w:p>
+            <w:r>
+              <w:t>0.10 ± 0.44</w:t>
+            </w:r>
+          </w:p>
+        </w:tc>
+        <w:tc>
+          <w:tcPr>
+            <w:tcW w:type="dxa" w:w="1296"/>
+          </w:tcPr>
+          <w:p>
+            <w:r>
+              <w:t>0.02 ± 0.39</w:t>
+            </w:r>
+          </w:p>
+        </w:tc>
+        <w:tc>
+          <w:tcPr>
+            <w:tcW w:type="dxa" w:w="1296"/>
+          </w:tcPr>
+          <w:p>
+            <w:r>
+              <w:t>41.7%</w:t>
+            </w:r>
+          </w:p>
+        </w:tc>
+        <w:tc>
+          <w:tcPr>
+            <w:tcW w:type="dxa" w:w="1296"/>
+          </w:tcPr>
+          <w:p>
+            <w:r>
+              <w:t>0.32</w:t>
+            </w:r>
+          </w:p>
+        </w:tc>
+        <w:tc>
+          <w:tcPr>
+            <w:tcW w:type="dxa" w:w="1296"/>
+          </w:tcPr>
+          <w:p>
+            <w:r>
+              <w:t>0.25</w:t>
+            </w:r>
+          </w:p>
+        </w:tc>
+        <w:tc>
+          <w:tcPr>
+            <w:tcW w:type="dxa" w:w="1296"/>
+          </w:tcPr>
+          <w:p>
+            <w:r>
+              <w:t>0.6%</w:t>
+            </w:r>
+          </w:p>
+        </w:tc>
+      </w:tr>
+      <w:tr>
+        <w:tc>
+          <w:tcPr>
+            <w:tcW w:type="dxa" w:w="1296"/>
+          </w:tcPr>
+          <w:p>
+            <w:r>
+              <w:t>DINOv2 + linear probe</w:t>
+            </w:r>
+          </w:p>
+        </w:tc>
+        <w:tc>
+          <w:tcPr>
+            <w:tcW w:type="dxa" w:w="1296"/>
+          </w:tcPr>
+          <w:p>
+            <w:r>
+              <w:t>0.02 ± 0.24</w:t>
+            </w:r>
+          </w:p>
+        </w:tc>
+        <w:tc>
+          <w:tcPr>
+            <w:tcW w:type="dxa" w:w="1296"/>
+          </w:tcPr>
+          <w:p>
+            <w:r>
+              <w:t>0.02 ± 0.21</w:t>
+            </w:r>
+          </w:p>
+        </w:tc>
+        <w:tc>
+          <w:tcPr>
+            <w:tcW w:type="dxa" w:w="1296"/>
+          </w:tcPr>
+          <w:p>
+            <w:r>
+              <w:t>77.5%</w:t>
+            </w:r>
+          </w:p>
+        </w:tc>
+        <w:tc>
+          <w:tcPr>
+            <w:tcW w:type="dxa" w:w="1296"/>
+          </w:tcPr>
+          <w:p>
+            <w:r>
+              <w:t>0.39</w:t>
+            </w:r>
+          </w:p>
+        </w:tc>
+        <w:tc>
+          <w:tcPr>
+            <w:tcW w:type="dxa" w:w="1296"/>
+          </w:tcPr>
+          <w:p>
+            <w:r>
+              <w:t>0.67</w:t>
+            </w:r>
+          </w:p>
+        </w:tc>
+        <w:tc>
+          <w:tcPr>
+            <w:tcW w:type="dxa" w:w="1296"/>
+          </w:tcPr>
+          <w:p>
+            <w:r>
+              <w:t>3.7%</w:t>
+            </w:r>
+          </w:p>
+        </w:tc>
+      </w:tr>
+    </w:tbl>
+    <w:p>
+      <w:pPr>
+        <w:jc w:val="both"/>
+      </w:pPr>
+      <w:r>
+        <w:t>The results (Table 14): both models pass the check on average (correlations 0.02-0.10 after randomization), but DINOv2 passes it more consistently: in 77.5% of cases the correlation after randomizing the classifier is below 0.3 in absolute value, against 41.7% for EfficientNet-B0, whose maps depend strongly on the generic activations of its last layer. DINOv2 maps are more focused (0.39 against 0.32) but give more weight to the padding (median 0.67 against 0.25; 3.7% of cases above twice the average, against 0.6%), especially for acne and normal_other predictions. This is a known effect of DINOv2-type Vision Transformers without register tokens, which store global information in content-free patches [43]. Map focus does not differ between skin tones (0.36-0.41 for every eFST group, for correct, wrong and abstained cases). In the app the DINOv2 map is shown only as a rough indication; reflection padding instead of black borders, or the DINOv2 variant with registers, is proposed as an improvement.</w:t>
       </w:r>
     </w:p>
     <w:p>
@@ -5935,6 +8201,56 @@
       </w:pPr>
       <w:r>
         <w:t>[38] K. Abhishek, A. Jain, G. Hamarneh, Investigating the Quality of DermaMNIST and Fitzpatrick17k Dermatological Image Datasets, Scientific Data 12, 196, 2025. https://doi.org/10.1038/s41597-025-04382-5</w:t>
+      </w:r>
+    </w:p>
+    <w:p>
+      <w:pPr>
+        <w:spacing w:after="120" w:line="276" w:lineRule="auto"/>
+        <w:ind w:left="567" w:hanging="567"/>
+        <w:jc w:val="left"/>
+      </w:pPr>
+      <w:r>
+        <w:t>[39] A. Dosovitskiy et al., An Image is Worth 16x16 Words: Transformers for Image Recognition at Scale, ICLR 2021. https://arxiv.org/abs/2010.11929</w:t>
+      </w:r>
+    </w:p>
+    <w:p>
+      <w:pPr>
+        <w:spacing w:after="120" w:line="276" w:lineRule="auto"/>
+        <w:ind w:left="567" w:hanging="567"/>
+        <w:jc w:val="left"/>
+      </w:pPr>
+      <w:r>
+        <w:t>[40] M. Oquab et al., DINOv2: Learning Robust Visual Features without Supervision, Transactions on Machine Learning Research, 2024. https://arxiv.org/abs/2304.07193</w:t>
+      </w:r>
+    </w:p>
+    <w:p>
+      <w:pPr>
+        <w:spacing w:after="120" w:line="276" w:lineRule="auto"/>
+        <w:ind w:left="567" w:hanging="567"/>
+        <w:jc w:val="left"/>
+      </w:pPr>
+      <w:r>
+        <w:t>[41] R. R. Selvaraju et al., Grad-CAM: Visual Explanations from Deep Networks via Gradient-based Localization, ICCV 2017. https://arxiv.org/abs/1610.02391</w:t>
+      </w:r>
+    </w:p>
+    <w:p>
+      <w:pPr>
+        <w:spacing w:after="120" w:line="276" w:lineRule="auto"/>
+        <w:ind w:left="567" w:hanging="567"/>
+        <w:jc w:val="left"/>
+      </w:pPr>
+      <w:r>
+        <w:t>[42] J. Adebayo et al., Sanity Checks for Saliency Maps, NeurIPS 2018. https://arxiv.org/abs/1810.03292</w:t>
+      </w:r>
+    </w:p>
+    <w:p>
+      <w:pPr>
+        <w:spacing w:after="120" w:line="276" w:lineRule="auto"/>
+        <w:ind w:left="567" w:hanging="567"/>
+        <w:jc w:val="left"/>
+      </w:pPr>
+      <w:r>
+        <w:t>[43] T. Darcet, M. Oquab, J. Mairal, P. Bojanowski, Vision Transformers Need Registers, ICLR 2024. https://arxiv.org/abs/2309.16588</w:t>
       </w:r>
     </w:p>
     <w:sectPr>

</xml_diff>